<commit_message>
Update database workflow and document templates [skip deploy]
</commit_message>
<xml_diff>
--- a/public/templates/DOC-11.docx
+++ b/public/templates/DOC-11.docx
@@ -1,10 +1,2198 @@
 
-<file path=word/document.xml><?xml version="1.0" encoding="UTF-8" standalone="yes"?>
-<w:document xmlns:cx="http://schemas.microsoft.com/office/drawing/2014/chartex" xmlns:cx1="http://schemas.microsoft.com/office/drawing/2015/9/8/chartex" xmlns:cx2="http://schemas.microsoft.com/office/drawing/2015/10/21/chartex" xmlns:cx3="http://schemas.microsoft.com/office/drawing/2016/5/9/chartex" xmlns:cx4="http://schemas.microsoft.com/office/drawing/2016/5/10/chartex" xmlns:cx5="http://schemas.microsoft.com/office/drawing/2016/5/11/chartex" xmlns:cx6="http://schemas.microsoft.com/office/drawing/2016/5/12/chartex" xmlns:cx7="http://schemas.microsoft.com/office/drawing/2016/5/13/chartex" xmlns:cx8="http://schemas.microsoft.com/office/drawing/2016/5/14/chartex" xmlns:mc="http://schemas.openxmlformats.org/markup-compatibility/2006" xmlns:aink="http://schemas.microsoft.com/office/drawing/2016/ink" xmlns:am3d="http://schemas.microsoft.com/office/drawing/2017/model3d" xmlns:o="urn:schemas-microsoft-com:office:office" xmlns:oel="http://schemas.microsoft.com/office/2019/extlst" xmlns:r="http://purl.oclc.org/ooxml/officeDocument/relationships" xmlns:m="http://purl.oclc.org/ooxml/officeDocument/math" xmlns:v="urn:schemas-microsoft-com:vml" xmlns:wp14="http://schemas.microsoft.com/office/word/2010/wordprocessingDrawing" xmlns:wp="http://purl.oclc.org/ooxml/drawingml/wordprocessingDrawing" xmlns:w10="urn:schemas-microsoft-com:office:word" xmlns:w="http://purl.oclc.org/ooxml/wordprocessingml/main" xmlns:w14="http://schemas.microsoft.com/office/word/2010/wordml" xmlns:w15="http://schemas.microsoft.com/office/word/2012/wordml" xmlns:w16cex="http://schemas.microsoft.com/office/word/2018/wordml/cex" xmlns:w16cid="http://schemas.microsoft.com/office/word/2016/wordml/cid" xmlns:w16="http://schemas.microsoft.com/office/word/2018/wordml" xmlns:w16sdtdh="http://schemas.microsoft.com/office/word/2020/wordml/sdtdatahash" xmlns:w16se="http://schemas.microsoft.com/office/word/2015/wordml/symex" xmlns:wpi="http://schemas.microsoft.com/office/word/2010/wordprocessingInk" xmlns:wne="http://schemas.microsoft.com/office/word/2006/wordml" mc:Ignorable="w14 w15 w16se w16cid w16 w16cex w16sdtdh wne wp14" w:conformance="strict"><w:body><w:p><w:pPr><w:autoSpaceDE w:val="0"/><w:autoSpaceDN w:val="0"/><w:adjustRightInd w:val="0"/><w:spacing w:line="0pt" w:lineRule="atLeast"/><w:jc w:val="center"/><w:rPr><w:rFonts w:ascii="標楷體" w:eastAsia="標楷體" w:hAnsi="標楷體" w:cs="DFKaiShu-SB-Estd-BF"/><w:b/><w:kern w:val="0"/><w:sz w:val="36"/><w:szCs w:val="36"/></w:rPr></w:pPr><w:r><w:rPr><w:rFonts w:ascii="標楷體" w:eastAsia="標楷體" w:hAnsi="標楷體" w:cs="DFKaiShu-SB-Estd-BF" w:hint="eastAsia"/><w:b/><w:kern w:val="0"/><w:sz w:val="36"/><w:szCs w:val="36"/></w:rPr><w:t>個人資料利用申請表</w:t></w:r></w:p><w:p><w:pPr><w:rPr><w:rFonts w:ascii="標楷體" w:eastAsia="標楷體" w:hAnsi="標楷體"/><w:sz w:val="22"/><w:szCs w:val="22"/></w:rPr></w:pPr><w:r><w:rPr><w:rFonts w:ascii="標楷體" w:eastAsia="標楷體" w:hAnsi="標楷體" w:hint="eastAsia"/><w:sz w:val="22"/><w:szCs w:val="22"/></w:rPr><w:t>表單編號：</w:t></w:r><w:r><w:rPr><w:rFonts w:ascii="標楷體" w:eastAsia="標楷體" w:hAnsi="標楷體" w:hint="eastAsia"/><w:sz w:val="22"/><w:szCs w:val="22"/><w:u w:val="single"/></w:rPr><w:t xml:space="preserve">      </w:t></w:r><w:r><w:rPr><w:rFonts w:ascii="標楷體" w:eastAsia="標楷體" w:hAnsi="標楷體"/><w:sz w:val="22"/><w:szCs w:val="22"/><w:u w:val="single"/></w:rPr><w:t xml:space="preserve">         </w:t></w:r><w:r><w:rPr><w:rFonts w:ascii="標楷體" w:eastAsia="標楷體" w:hAnsi="標楷體" w:hint="eastAsia"/><w:sz w:val="22"/><w:szCs w:val="22"/><w:u w:val="single"/></w:rPr><w:t xml:space="preserve">      </w:t></w:r><w:r><w:rPr><w:rFonts w:ascii="標楷體" w:eastAsia="標楷體" w:hAnsi="標楷體"/><w:sz w:val="22"/><w:szCs w:val="22"/></w:rPr><w:t xml:space="preserve">                                  </w:t></w:r></w:p><w:tbl><w:tblPr><w:tblW w:w="100.0%" w:type="pct"/><w:jc w:val="center"/><w:tblLayout w:type="fixed"/><w:tblCellMar><w:start w:w="0.50pt" w:type="dxa"/><w:end w:w="0.50pt" w:type="dxa"/></w:tblCellMar><w:tblLook w:firstRow="1" w:lastRow="0" w:firstColumn="1" w:lastColumn="0" w:noHBand="0" w:noVBand="1"/></w:tblPr><w:tblGrid><w:gridCol w:w="2106"/><w:gridCol w:w="3007"/><w:gridCol w:w="1705"/><w:gridCol w:w="220"/><w:gridCol w:w="2924"/></w:tblGrid><w:tr><w:trPr><w:trHeight w:val="745"/><w:jc w:val="center"/></w:trPr><w:tc><w:tcPr><w:tcW w:w="105.30pt" w:type="dxa"/><w:tcBorders><w:top w:val="single" w:sz="4" w:space="0" w:color="000000"/><w:start w:val="single" w:sz="4" w:space="0" w:color="000000"/><w:bottom w:val="single" w:sz="4" w:space="0" w:color="000000"/><w:end w:val="single" w:sz="4" w:space="0" w:color="000000"/></w:tcBorders><w:shd w:val="clear" w:color="auto" w:fill="auto"/><w:tcMar><w:top w:w="0pt" w:type="dxa"/><w:start w:w="5.40pt" w:type="dxa"/><w:bottom w:w="0pt" w:type="dxa"/><w:end w:w="5.40pt" w:type="dxa"/></w:tcMar><w:vAlign w:val="center"/></w:tcPr><w:p><w:pPr><w:suppressAutoHyphens/><w:autoSpaceDN w:val="0"/><w:snapToGrid w:val="0"/><w:textAlignment w:val="baseline"/><w:rPr><w:rFonts w:ascii="標楷體" w:eastAsia="標楷體" w:hAnsi="標楷體"/><w:kern w:val="0"/></w:rPr></w:pPr><w:r><w:rPr><w:rFonts w:ascii="標楷體" w:eastAsia="標楷體" w:hAnsi="標楷體" w:hint="eastAsia"/><w:kern w:val="0"/></w:rPr><w:t>申請單位</w:t></w:r></w:p></w:tc><w:tc><w:tcPr><w:tcW w:w="150.35pt" w:type="dxa"/><w:tcBorders><w:top w:val="single" w:sz="4" w:space="0" w:color="000000"/><w:start w:val="single" w:sz="4" w:space="0" w:color="000000"/><w:bottom w:val="single" w:sz="4" w:space="0" w:color="000000"/><w:end w:val="single" w:sz="4" w:space="0" w:color="000000"/></w:tcBorders><w:shd w:val="clear" w:color="auto" w:fill="auto"/><w:tcMar><w:top w:w="0pt" w:type="dxa"/><w:start w:w="5.40pt" w:type="dxa"/><w:bottom w:w="0pt" w:type="dxa"/><w:end w:w="5.40pt" w:type="dxa"/></w:tcMar><w:vAlign w:val="center"/></w:tcPr><w:p><w:pPr><w:suppressAutoHyphens/><w:autoSpaceDN w:val="0"/><w:snapToGrid w:val="0"/><w:textAlignment w:val="baseline"/><w:rPr><w:rFonts w:ascii="標楷體" w:eastAsia="標楷體" w:hAnsi="標楷體"/><w:kern w:val="0"/></w:rPr></w:pPr><w:r><w:rPr><w:rFonts w:ascii="標楷體" w:eastAsia="標楷體" w:hAnsi="標楷體" w:hint="eastAsia"/><w:kern w:val="0"/></w:rPr><w:t>{pi_unit}</w:t></w:r></w:p></w:tc><w:tc><w:tcPr><w:tcW w:w="96.25pt" w:type="dxa"/><w:gridSpan w:val="2"/><w:tcBorders><w:top w:val="single" w:sz="4" w:space="0" w:color="000000"/><w:start w:val="single" w:sz="4" w:space="0" w:color="000000"/><w:bottom w:val="single" w:sz="4" w:space="0" w:color="000000"/><w:end w:val="single" w:sz="4" w:space="0" w:color="000000"/></w:tcBorders><w:shd w:val="clear" w:color="auto" w:fill="auto"/><w:tcMar><w:top w:w="0pt" w:type="dxa"/><w:start w:w="5.40pt" w:type="dxa"/><w:bottom w:w="0pt" w:type="dxa"/><w:end w:w="5.40pt" w:type="dxa"/></w:tcMar><w:vAlign w:val="center"/></w:tcPr><w:p><w:pPr><w:suppressAutoHyphens/><w:autoSpaceDN w:val="0"/><w:snapToGrid w:val="0"/><w:textAlignment w:val="baseline"/><w:rPr><w:rFonts w:ascii="標楷體" w:eastAsia="標楷體" w:hAnsi="標楷體"/><w:kern w:val="0"/></w:rPr></w:pPr><w:r><w:rPr><w:rFonts w:ascii="標楷體" w:eastAsia="標楷體" w:hAnsi="標楷體" w:hint="eastAsia"/><w:kern w:val="0"/></w:rPr><w:t>申請人員</w:t></w:r></w:p></w:tc><w:tc><w:tcPr><w:tcW w:w="146.20pt" w:type="dxa"/><w:tcBorders><w:top w:val="single" w:sz="4" w:space="0" w:color="000000"/><w:start w:val="single" w:sz="4" w:space="0" w:color="000000"/><w:bottom w:val="single" w:sz="4" w:space="0" w:color="000000"/><w:end w:val="single" w:sz="4" w:space="0" w:color="000000"/></w:tcBorders><w:shd w:val="clear" w:color="auto" w:fill="auto"/><w:tcMar><w:top w:w="0pt" w:type="dxa"/><w:start w:w="5.40pt" w:type="dxa"/><w:bottom w:w="0pt" w:type="dxa"/><w:end w:w="5.40pt" w:type="dxa"/></w:tcMar><w:vAlign w:val="center"/></w:tcPr><w:p><w:pPr><w:suppressAutoHyphens/><w:autoSpaceDN w:val="0"/><w:snapToGrid w:val="0"/><w:jc w:val="both"/><w:textAlignment w:val="baseline"/><w:rPr><w:rFonts w:ascii="標楷體" w:eastAsia="標楷體" w:hAnsi="標楷體"/><w:kern w:val="0"/></w:rPr></w:pPr><w:r><w:rPr><w:rFonts w:ascii="標楷體" w:eastAsia="標楷體" w:hAnsi="標楷體" w:hint="eastAsia"/><w:kern w:val="0"/></w:rPr><w:t>{pi_name_zh}</w:t></w:r></w:p></w:tc></w:tr><w:tr><w:trPr><w:trHeight w:val="745"/><w:jc w:val="center"/></w:trPr><w:tc><w:tcPr><w:tcW w:w="105.30pt" w:type="dxa"/><w:tcBorders><w:top w:val="single" w:sz="4" w:space="0" w:color="000000"/><w:start w:val="single" w:sz="4" w:space="0" w:color="000000"/><w:bottom w:val="single" w:sz="4" w:space="0" w:color="000000"/><w:end w:val="single" w:sz="4" w:space="0" w:color="000000"/></w:tcBorders><w:shd w:val="clear" w:color="auto" w:fill="auto"/><w:tcMar><w:top w:w="0pt" w:type="dxa"/><w:start w:w="5.40pt" w:type="dxa"/><w:bottom w:w="0pt" w:type="dxa"/><w:end w:w="5.40pt" w:type="dxa"/></w:tcMar><w:vAlign w:val="center"/></w:tcPr><w:p><w:pPr><w:suppressAutoHyphens/><w:autoSpaceDN w:val="0"/><w:snapToGrid w:val="0"/><w:textAlignment w:val="baseline"/><w:rPr><w:rFonts w:ascii="標楷體" w:eastAsia="標楷體" w:hAnsi="標楷體"/><w:kern w:val="0"/></w:rPr></w:pPr><w:r><w:rPr><w:rFonts w:ascii="標楷體" w:eastAsia="標楷體" w:hAnsi="標楷體" w:hint="eastAsia"/><w:kern w:val="0"/></w:rPr><w:t>公務聯絡電話</w:t></w:r></w:p></w:tc><w:tc><w:tcPr><w:tcW w:w="150.35pt" w:type="dxa"/><w:tcBorders><w:top w:val="single" w:sz="4" w:space="0" w:color="000000"/><w:start w:val="single" w:sz="4" w:space="0" w:color="000000"/><w:bottom w:val="single" w:sz="4" w:space="0" w:color="000000"/><w:end w:val="single" w:sz="4" w:space="0" w:color="000000"/></w:tcBorders><w:shd w:val="clear" w:color="auto" w:fill="auto"/><w:tcMar><w:top w:w="0pt" w:type="dxa"/><w:start w:w="5.40pt" w:type="dxa"/><w:bottom w:w="0pt" w:type="dxa"/><w:end w:w="5.40pt" w:type="dxa"/></w:tcMar><w:vAlign w:val="center"/></w:tcPr><w:p><w:pPr><w:suppressAutoHyphens/><w:autoSpaceDN w:val="0"/><w:snapToGrid w:val="0"/><w:textAlignment w:val="baseline"/><w:rPr><w:rFonts w:ascii="標楷體" w:eastAsia="標楷體" w:hAnsi="標楷體"/><w:kern w:val="0"/></w:rPr></w:pPr><w:r><w:rPr><w:rFonts w:ascii="標楷體" w:eastAsia="標楷體" w:hAnsi="標楷體" w:hint="eastAsia"/><w:kern w:val="0"/></w:rPr><w:t>{pi_phone}</w:t></w:r></w:p></w:tc><w:tc><w:tcPr><w:tcW w:w="96.25pt" w:type="dxa"/><w:gridSpan w:val="2"/><w:tcBorders><w:top w:val="single" w:sz="4" w:space="0" w:color="000000"/><w:start w:val="single" w:sz="4" w:space="0" w:color="000000"/><w:bottom w:val="single" w:sz="4" w:space="0" w:color="000000"/><w:end w:val="single" w:sz="4" w:space="0" w:color="000000"/></w:tcBorders><w:shd w:val="clear" w:color="auto" w:fill="auto"/><w:tcMar><w:top w:w="0pt" w:type="dxa"/><w:start w:w="5.40pt" w:type="dxa"/><w:bottom w:w="0pt" w:type="dxa"/><w:end w:w="5.40pt" w:type="dxa"/></w:tcMar><w:vAlign w:val="center"/></w:tcPr><w:p><w:pPr><w:suppressAutoHyphens/><w:autoSpaceDN w:val="0"/><w:snapToGrid w:val="0"/><w:textAlignment w:val="baseline"/><w:rPr><w:rFonts w:ascii="標楷體" w:eastAsia="標楷體" w:hAnsi="標楷體"/><w:kern w:val="0"/></w:rPr></w:pPr><w:r><w:rPr><w:rFonts w:ascii="標楷體" w:eastAsia="標楷體" w:hAnsi="標楷體"/><w:kern w:val="0"/></w:rPr><w:t>申請日期</w:t></w:r></w:p></w:tc><w:tc><w:tcPr><w:tcW w:w="146.20pt" w:type="dxa"/><w:tcBorders><w:top w:val="single" w:sz="4" w:space="0" w:color="000000"/><w:start w:val="single" w:sz="4" w:space="0" w:color="000000"/><w:bottom w:val="single" w:sz="4" w:space="0" w:color="000000"/><w:end w:val="single" w:sz="4" w:space="0" w:color="000000"/></w:tcBorders><w:shd w:val="clear" w:color="auto" w:fill="auto"/><w:tcMar><w:top w:w="0pt" w:type="dxa"/><w:start w:w="5.40pt" w:type="dxa"/><w:bottom w:w="0pt" w:type="dxa"/><w:end w:w="5.40pt" w:type="dxa"/></w:tcMar><w:vAlign w:val="center"/></w:tcPr><w:p><w:pPr><w:suppressAutoHyphens/><w:autoSpaceDN w:val="0"/><w:snapToGrid w:val="0"/><w:jc w:val="both"/><w:textAlignment w:val="baseline"/><w:rPr><w:rFonts w:ascii="標楷體" w:eastAsia="標楷體" w:hAnsi="標楷體"/><w:kern w:val="0"/></w:rPr></w:pPr><w:r><w:rPr><w:rFonts w:ascii="標楷體" w:eastAsia="標楷體" w:hAnsi="標楷體" w:hint="eastAsia"/><w:kern w:val="0"/></w:rPr><w:t>{filing_year}</w:t></w:r><w:r><w:rPr><w:rFonts w:ascii="標楷體" w:eastAsia="標楷體" w:hAnsi="標楷體"/><w:kern w:val="0"/></w:rPr><w:t xml:space="preserve">　年</w:t></w:r><w:r><w:rPr><w:rFonts w:ascii="標楷體" w:eastAsia="標楷體" w:hAnsi="標楷體" w:hint="eastAsia"/><w:kern w:val="0"/></w:rPr><w:t xml:space="preserve" xml:space="preserve"> {filing_month} </w:t></w:r><w:r><w:rPr><w:rFonts w:ascii="標楷體" w:eastAsia="標楷體" w:hAnsi="標楷體"/><w:kern w:val="0"/></w:rPr><w:t xml:space="preserve">月　</w:t></w:r><w:r><w:rPr><w:rFonts w:ascii="標楷體" w:eastAsia="標楷體" w:hAnsi="標楷體" w:hint="eastAsia"/><w:kern w:val="0"/></w:rPr><w:t>{filing_day}</w:t></w:r><w:r><w:rPr><w:rFonts w:ascii="標楷體" w:eastAsia="標楷體" w:hAnsi="標楷體"/><w:kern w:val="0"/></w:rPr><w:t xml:space="preserve">　日</w:t></w:r></w:p></w:tc></w:tr><w:tr><w:trPr><w:trHeight w:val="1529"/><w:jc w:val="center"/></w:trPr><w:tc><w:tcPr><w:tcW w:w="105.30pt" w:type="dxa"/><w:tcBorders><w:top w:val="single" w:sz="4" w:space="0" w:color="000000"/><w:start w:val="single" w:sz="4" w:space="0" w:color="000000"/><w:bottom w:val="single" w:sz="4" w:space="0" w:color="000000"/><w:end w:val="single" w:sz="4" w:space="0" w:color="000000"/></w:tcBorders><w:shd w:val="clear" w:color="auto" w:fill="auto"/><w:tcMar><w:top w:w="0pt" w:type="dxa"/><w:start w:w="5.40pt" w:type="dxa"/><w:bottom w:w="0pt" w:type="dxa"/><w:end w:w="5.40pt" w:type="dxa"/></w:tcMar><w:vAlign w:val="center"/></w:tcPr><w:p><w:pPr><w:suppressAutoHyphens/><w:autoSpaceDN w:val="0"/><w:snapToGrid w:val="0"/><w:textAlignment w:val="baseline"/><w:rPr><w:rFonts w:ascii="標楷體" w:eastAsia="標楷體" w:hAnsi="標楷體"/><w:kern w:val="0"/></w:rPr></w:pPr><w:r><w:rPr><w:rFonts w:ascii="標楷體" w:eastAsia="標楷體" w:hAnsi="標楷體"/><w:kern w:val="0"/></w:rPr><w:t>申請</w:t></w:r><w:r><w:rPr><w:rFonts w:ascii="標楷體" w:eastAsia="標楷體" w:hAnsi="標楷體" w:hint="eastAsia"/><w:kern w:val="0"/></w:rPr><w:t>事由</w:t></w:r><w:r><w:rPr><w:rFonts w:ascii="標楷體" w:eastAsia="標楷體" w:hAnsi="標楷體"/><w:kern w:val="0"/></w:rPr><w:t>說明</w:t></w:r></w:p></w:tc><w:tc><w:tcPr><w:tcW w:w="392.80pt" w:type="dxa"/><w:gridSpan w:val="4"/><w:tcBorders><w:top w:val="single" w:sz="4" w:space="0" w:color="000000"/><w:start w:val="single" w:sz="4" w:space="0" w:color="000000"/><w:bottom w:val="single" w:sz="4" w:space="0" w:color="000000"/><w:end w:val="single" w:sz="4" w:space="0" w:color="000000"/></w:tcBorders><w:shd w:val="clear" w:color="auto" w:fill="auto"/><w:tcMar><w:top w:w="0pt" w:type="dxa"/><w:start w:w="5.40pt" w:type="dxa"/><w:bottom w:w="0pt" w:type="dxa"/><w:end w:w="5.40pt" w:type="dxa"/></w:tcMar><w:vAlign w:val="center"/></w:tcPr><w:p><w:pPr><w:suppressAutoHyphens/><w:autoSpaceDN w:val="0"/><w:snapToGrid w:val="0"/><w:jc w:val="both"/><w:textAlignment w:val="baseline"/><w:rPr><w:rFonts w:ascii="標楷體" w:eastAsia="標楷體" w:hAnsi="標楷體"/><w:kern w:val="0"/></w:rPr></w:pPr><w:r><w:rPr><w:rFonts w:ascii="標楷體" w:eastAsia="標楷體" w:hAnsi="標楷體" w:hint="eastAsia"/><w:kern w:val="0"/></w:rPr><w:t>員工自行研究計畫「</w:t></w:r><w:r><w:rPr><w:rFonts w:ascii="標楷體" w:eastAsia="標楷體" w:hAnsi="標楷體" w:hint="eastAsia"/><w:kern w:val="0"/></w:rPr><w:t>{project_title_zh}</w:t></w:r><w:r><w:rPr><w:rFonts w:ascii="標楷體" w:eastAsia="標楷體" w:hAnsi="標楷體" w:hint="eastAsia"/><w:kern w:val="0"/></w:rPr><w:t>」(計畫編號:{project_id})，已完成本署人體研究委員會免審通過，申請防疫資料庫去識別化個人資料。</w:t></w:r></w:p></w:tc></w:tr><w:tr><w:trPr><w:trHeight w:val="840"/><w:jc w:val="center"/></w:trPr><w:tc><w:tcPr><w:tcW w:w="105.30pt" w:type="dxa"/><w:tcBorders><w:top w:val="single" w:sz="4" w:space="0" w:color="000000"/><w:start w:val="single" w:sz="4" w:space="0" w:color="000000"/><w:bottom w:val="single" w:sz="4" w:space="0" w:color="000000"/><w:end w:val="single" w:sz="4" w:space="0" w:color="000000"/></w:tcBorders><w:shd w:val="clear" w:color="auto" w:fill="auto"/><w:tcMar><w:top w:w="0pt" w:type="dxa"/><w:start w:w="5.40pt" w:type="dxa"/><w:bottom w:w="0pt" w:type="dxa"/><w:end w:w="5.40pt" w:type="dxa"/></w:tcMar><w:vAlign w:val="center"/></w:tcPr><w:p><w:pPr><w:suppressAutoHyphens/><w:autoSpaceDN w:val="0"/><w:snapToGrid w:val="0"/><w:textAlignment w:val="baseline"/><w:rPr><w:rFonts w:ascii="標楷體" w:eastAsia="標楷體" w:hAnsi="標楷體"/><w:kern w:val="0"/></w:rPr></w:pPr><w:r><w:rPr><w:rFonts w:ascii="標楷體" w:eastAsia="標楷體" w:hAnsi="標楷體"/><w:kern w:val="0"/></w:rPr><w:t>申請</w:t></w:r><w:r><w:rPr><w:rFonts w:ascii="標楷體" w:eastAsia="標楷體" w:hAnsi="標楷體" w:hint="eastAsia"/><w:color w:val="0000FF"/><w:kern w:val="0"/></w:rPr><w:t>項目</w:t></w:r></w:p></w:tc><w:tc><w:tcPr><w:tcW w:w="392.80pt" w:type="dxa"/><w:gridSpan w:val="4"/><w:tcBorders><w:top w:val="single" w:sz="4" w:space="0" w:color="000000"/><w:start w:val="single" w:sz="4" w:space="0" w:color="000000"/><w:bottom w:val="single" w:sz="4" w:space="0" w:color="000000"/><w:end w:val="single" w:sz="4" w:space="0" w:color="000000"/></w:tcBorders><w:shd w:val="clear" w:color="auto" w:fill="auto"/><w:tcMar><w:top w:w="0pt" w:type="dxa"/><w:start w:w="5.40pt" w:type="dxa"/><w:bottom w:w="0pt" w:type="dxa"/><w:end w:w="5.40pt" w:type="dxa"/></w:tcMar><w:vAlign w:val="center"/></w:tcPr><w:p><w:pPr><w:suppressAutoHyphens/><w:autoSpaceDN w:val="0"/><w:snapToGrid w:val="0"/><w:jc w:val="both"/><w:textAlignment w:val="baseline"/><w:rPr><w:rFonts w:ascii="標楷體" w:eastAsia="標楷體" w:hAnsi="標楷體"/><w:kern w:val="0"/></w:rPr></w:pPr><w:r><w:rPr><w:rFonts w:ascii="標楷體" w:eastAsia="標楷體" w:hAnsi="標楷體" w:hint="eastAsia"/><w:kern w:val="0"/></w:rPr><w:t>□</w:t></w:r><w:r><w:rPr><w:rFonts w:ascii="標楷體" w:eastAsia="標楷體" w:hAnsi="標楷體"/><w:kern w:val="0"/></w:rPr><w:t xml:space="preserve">委外業務    </w:t></w:r><w:r><w:rPr><w:rFonts w:ascii="標楷體" w:eastAsia="標楷體" w:hAnsi="標楷體"/><w:kern w:val="0"/></w:rPr><w:t xml:space="preserve"> </w:t></w:r><w:r><w:rPr><w:rFonts w:ascii="標楷體" w:eastAsia="標楷體" w:hAnsi="標楷體" w:cs="Wingdings 2" w:hint="eastAsia"/><w:kern w:val="0"/></w:rPr><w:t>□</w:t></w:r><w:r><w:rPr><w:rFonts w:ascii="標楷體" w:eastAsia="標楷體" w:hAnsi="標楷體"/><w:kern w:val="0"/></w:rPr><w:t xml:space="preserve">第三方揭露    </w:t></w:r><w:r><w:rPr><w:rFonts w:ascii="標楷體" w:eastAsia="標楷體" w:hAnsi="標楷體"/><w:kern w:val="0"/></w:rPr><w:t xml:space="preserve"> </w:t></w:r><w:r><w:rPr><w:rFonts w:ascii="標楷體" w:eastAsia="標楷體" w:hAnsi="標楷體" w:cs="Wingdings 2" w:hint="eastAsia"/><w:kern w:val="0"/></w:rPr><w:t>□</w:t></w:r><w:r><w:rPr><w:rFonts w:ascii="標楷體" w:eastAsia="標楷體" w:hAnsi="標楷體"/><w:kern w:val="0"/></w:rPr><w:t xml:space="preserve">資料分享  </w:t></w:r><w:r><w:rPr><w:rFonts w:ascii="標楷體" w:eastAsia="標楷體" w:hAnsi="標楷體"/><w:kern w:val="0"/></w:rPr><w:t xml:space="preserve"> </w:t></w:r><w:r><w:rPr><w:rFonts w:ascii="標楷體" w:eastAsia="標楷體" w:hAnsi="標楷體" w:cs="Wingdings 2" w:hint="eastAsia"/><w:kern w:val="0"/></w:rPr><w:t>□</w:t></w:r><w:r><w:rPr><w:rFonts w:ascii="標楷體" w:eastAsia="標楷體" w:hAnsi="標楷體"/><w:kern w:val="0"/></w:rPr><w:t>特定目的外利用</w:t></w:r></w:p><w:p><w:pPr><w:suppressAutoHyphens/><w:autoSpaceDN w:val="0"/><w:snapToGrid w:val="0"/><w:jc w:val="both"/><w:textAlignment w:val="baseline"/><w:rPr><w:rFonts w:ascii="標楷體" w:eastAsia="標楷體" w:hAnsi="標楷體"/><w:kern w:val="0"/></w:rPr></w:pPr><w:r><w:rPr><w:rFonts w:ascii="標楷體" w:eastAsia="標楷體" w:hAnsi="標楷體" w:hint="eastAsia"/><w:kern w:val="0"/></w:rPr><w:t>■</w:t></w:r><w:r><w:rPr><w:rFonts w:ascii="標楷體" w:eastAsia="標楷體" w:hAnsi="標楷體"/><w:kern w:val="0"/></w:rPr><w:t>其他：</w:t></w:r><w:r><w:rPr><w:rFonts w:ascii="標楷體" w:eastAsia="標楷體" w:hAnsi="標楷體" w:hint="eastAsia"/><w:kern w:val="0"/></w:rPr><w:t>本署員工研究計畫使用</w:t></w:r></w:p></w:tc></w:tr><w:tr><w:trPr><w:trHeight w:val="697"/><w:jc w:val="center"/></w:trPr><w:tc><w:tcPr><w:tcW w:w="105.30pt" w:type="dxa"/><w:tcBorders><w:top w:val="single" w:sz="4" w:space="0" w:color="000000"/><w:start w:val="single" w:sz="4" w:space="0" w:color="000000"/><w:bottom w:val="single" w:sz="4" w:space="0" w:color="000000"/><w:end w:val="single" w:sz="4" w:space="0" w:color="000000"/></w:tcBorders><w:shd w:val="clear" w:color="auto" w:fill="auto"/><w:tcMar><w:top w:w="0pt" w:type="dxa"/><w:start w:w="5.40pt" w:type="dxa"/><w:bottom w:w="0pt" w:type="dxa"/><w:end w:w="5.40pt" w:type="dxa"/></w:tcMar><w:vAlign w:val="center"/></w:tcPr><w:p><w:pPr><w:suppressAutoHyphens/><w:autoSpaceDN w:val="0"/><w:snapToGrid w:val="0"/><w:textAlignment w:val="baseline"/><w:rPr><w:rFonts w:ascii="標楷體" w:eastAsia="標楷體" w:hAnsi="標楷體"/><w:kern w:val="0"/></w:rPr></w:pPr><w:r><w:rPr><w:rFonts w:ascii="標楷體" w:eastAsia="標楷體" w:hAnsi="標楷體" w:hint="eastAsia"/><w:kern w:val="0"/></w:rPr><w:t>申請利用依據</w:t></w:r></w:p></w:tc><w:tc><w:tcPr><w:tcW w:w="392.80pt" w:type="dxa"/><w:gridSpan w:val="4"/><w:tcBorders><w:top w:val="single" w:sz="4" w:space="0" w:color="000000"/><w:start w:val="single" w:sz="4" w:space="0" w:color="000000"/><w:bottom w:val="single" w:sz="4" w:space="0" w:color="000000"/><w:end w:val="single" w:sz="4" w:space="0" w:color="000000"/></w:tcBorders><w:shd w:val="clear" w:color="auto" w:fill="auto"/><w:tcMar><w:top w:w="0pt" w:type="dxa"/><w:start w:w="5.40pt" w:type="dxa"/><w:bottom w:w="0pt" w:type="dxa"/><w:end w:w="5.40pt" w:type="dxa"/></w:tcMar><w:vAlign w:val="center"/></w:tcPr><w:p><w:pPr><w:suppressAutoHyphens/><w:autoSpaceDN w:val="0"/><w:snapToGrid w:val="0"/><w:jc w:val="both"/><w:textAlignment w:val="baseline"/><w:rPr><w:rFonts w:ascii="標楷體" w:eastAsia="標楷體" w:hAnsi="標楷體" w:hint="eastAsia"/><w:kern w:val="0"/></w:rPr></w:pPr><w:r><w:rPr><w:rFonts w:ascii="標楷體" w:eastAsia="標楷體" w:hAnsi="標楷體" w:hint="eastAsia"/><w:kern w:val="0"/></w:rPr><w:t>依據「防疫資料庫員工研究計畫使用申請說明作業」</w:t></w:r></w:p></w:tc></w:tr><w:tr><w:trPr><w:trHeight w:val="619"/><w:jc w:val="center"/></w:trPr><w:tc><w:tcPr><w:tcW w:w="105.30pt" w:type="dxa"/><w:tcBorders><w:top w:val="single" w:sz="4" w:space="0" w:color="000000"/><w:start w:val="single" w:sz="4" w:space="0" w:color="000000"/><w:bottom w:val="single" w:sz="4" w:space="0" w:color="000000"/><w:end w:val="single" w:sz="4" w:space="0" w:color="000000"/></w:tcBorders><w:shd w:val="clear" w:color="auto" w:fill="auto"/><w:tcMar><w:top w:w="0pt" w:type="dxa"/><w:start w:w="5.40pt" w:type="dxa"/><w:bottom w:w="0pt" w:type="dxa"/><w:end w:w="5.40pt" w:type="dxa"/></w:tcMar><w:vAlign w:val="center"/></w:tcPr><w:p><w:pPr><w:suppressAutoHyphens/><w:autoSpaceDN w:val="0"/><w:snapToGrid w:val="0"/><w:textAlignment w:val="baseline"/><w:rPr><w:rFonts w:ascii="標楷體" w:eastAsia="標楷體" w:hAnsi="標楷體"/><w:kern w:val="0"/></w:rPr></w:pPr><w:r><w:rPr><w:rFonts w:ascii="標楷體" w:eastAsia="標楷體" w:hAnsi="標楷體" w:hint="eastAsia"/><w:kern w:val="0"/></w:rPr><w:t>申請利用目的</w:t></w:r></w:p></w:tc><w:tc><w:tcPr><w:tcW w:w="392.80pt" w:type="dxa"/><w:gridSpan w:val="4"/><w:tcBorders><w:top w:val="single" w:sz="4" w:space="0" w:color="000000"/><w:start w:val="single" w:sz="4" w:space="0" w:color="000000"/><w:bottom w:val="single" w:sz="4" w:space="0" w:color="000000"/><w:end w:val="single" w:sz="4" w:space="0" w:color="000000"/></w:tcBorders><w:shd w:val="clear" w:color="auto" w:fill="auto"/><w:tcMar><w:top w:w="0pt" w:type="dxa"/><w:start w:w="5.40pt" w:type="dxa"/><w:bottom w:w="0pt" w:type="dxa"/><w:end w:w="5.40pt" w:type="dxa"/></w:tcMar><w:vAlign w:val="center"/></w:tcPr><w:p><w:pPr><w:suppressAutoHyphens/><w:autoSpaceDN w:val="0"/><w:snapToGrid w:val="0"/><w:jc w:val="both"/><w:textAlignment w:val="baseline"/><w:rPr><w:rFonts w:ascii="標楷體" w:eastAsia="標楷體" w:hAnsi="標楷體"/><w:kern w:val="0"/></w:rPr></w:pPr><w:r><w:rPr><w:rFonts w:ascii="標楷體" w:eastAsia="標楷體" w:hAnsi="標楷體" w:hint="eastAsia"/><w:kern w:val="0"/></w:rPr><w:t>研究及發表</w:t></w:r></w:p></w:tc></w:tr><w:tr><w:trPr><w:trHeight w:val="496"/><w:jc w:val="center"/></w:trPr><w:tc><w:tcPr><w:tcW w:w="105.30pt" w:type="dxa"/><w:tcBorders><w:top w:val="single" w:sz="4" w:space="0" w:color="000000"/><w:start w:val="single" w:sz="4" w:space="0" w:color="000000"/><w:bottom w:val="single" w:sz="4" w:space="0" w:color="000000"/><w:end w:val="single" w:sz="4" w:space="0" w:color="000000"/></w:tcBorders><w:shd w:val="clear" w:color="auto" w:fill="auto"/><w:tcMar><w:top w:w="0pt" w:type="dxa"/><w:start w:w="5.40pt" w:type="dxa"/><w:bottom w:w="0pt" w:type="dxa"/><w:end w:w="5.40pt" w:type="dxa"/></w:tcMar><w:vAlign w:val="center"/></w:tcPr><w:p><w:pPr><w:suppressAutoHyphens/><w:autoSpaceDN w:val="0"/><w:snapToGrid w:val="0"/><w:textAlignment w:val="baseline"/><w:rPr><w:rFonts w:ascii="標楷體" w:eastAsia="標楷體" w:hAnsi="標楷體"/><w:kern w:val="0"/></w:rPr></w:pPr><w:r><w:rPr><w:rFonts w:ascii="標楷體" w:eastAsia="標楷體" w:hAnsi="標楷體"/><w:kern w:val="0"/></w:rPr><w:t>使用期間</w:t></w:r></w:p></w:tc><w:tc><w:tcPr><w:tcW w:w="392.80pt" w:type="dxa"/><w:gridSpan w:val="4"/><w:tcBorders><w:top w:val="single" w:sz="4" w:space="0" w:color="000000"/><w:start w:val="single" w:sz="4" w:space="0" w:color="000000"/><w:bottom w:val="single" w:sz="4" w:space="0" w:color="000000"/><w:end w:val="single" w:sz="4" w:space="0" w:color="000000"/></w:tcBorders><w:shd w:val="clear" w:color="auto" w:fill="auto"/><w:tcMar><w:top w:w="0pt" w:type="dxa"/><w:start w:w="5.40pt" w:type="dxa"/><w:bottom w:w="0pt" w:type="dxa"/><w:end w:w="5.40pt" w:type="dxa"/></w:tcMar><w:vAlign w:val="center"/></w:tcPr><w:p><w:pPr><w:suppressAutoHyphens/><w:autoSpaceDN w:val="0"/><w:snapToGrid w:val="0"/><w:jc w:val="both"/><w:textAlignment w:val="baseline"/><w:rPr><w:rFonts w:ascii="標楷體" w:eastAsia="標楷體" w:hAnsi="標楷體"/><w:kern w:val="0"/></w:rPr></w:pPr><w:r><w:rPr><w:rFonts w:ascii="標楷體" w:eastAsia="標楷體" w:hAnsi="標楷體" w:hint="eastAsia"/><w:kern w:val="0"/></w:rPr><w:t>自收到資料後至研究期程截止日{execution_end_roc}</w:t></w:r></w:p></w:tc></w:tr><w:tr><w:trPr><w:trHeight w:val="496"/><w:jc w:val="center"/></w:trPr><w:tc><w:tcPr><w:tcW w:w="105.30pt" w:type="dxa"/><w:tcBorders><w:top w:val="single" w:sz="4" w:space="0" w:color="000000"/><w:start w:val="single" w:sz="4" w:space="0" w:color="000000"/><w:bottom w:val="single" w:sz="4" w:space="0" w:color="000000"/><w:end w:val="single" w:sz="4" w:space="0" w:color="000000"/></w:tcBorders><w:shd w:val="clear" w:color="auto" w:fill="auto"/><w:tcMar><w:top w:w="0pt" w:type="dxa"/><w:start w:w="5.40pt" w:type="dxa"/><w:bottom w:w="0pt" w:type="dxa"/><w:end w:w="5.40pt" w:type="dxa"/></w:tcMar><w:vAlign w:val="center"/></w:tcPr><w:p><w:pPr><w:suppressAutoHyphens/><w:autoSpaceDN w:val="0"/><w:snapToGrid w:val="0"/><w:textAlignment w:val="baseline"/><w:rPr><w:rFonts w:ascii="標楷體" w:eastAsia="標楷體" w:hAnsi="標楷體"/><w:kern w:val="0"/></w:rPr></w:pPr><w:r><w:rPr><w:rFonts w:ascii="標楷體" w:eastAsia="標楷體" w:hAnsi="標楷體"/><w:kern w:val="0"/></w:rPr><w:t>交付方式</w:t></w:r></w:p></w:tc><w:tc><w:tcPr><w:tcW w:w="392.80pt" w:type="dxa"/><w:gridSpan w:val="4"/><w:tcBorders><w:top w:val="single" w:sz="4" w:space="0" w:color="000000"/><w:start w:val="single" w:sz="4" w:space="0" w:color="000000"/><w:bottom w:val="single" w:sz="4" w:space="0" w:color="000000"/><w:end w:val="single" w:sz="4" w:space="0" w:color="000000"/></w:tcBorders><w:shd w:val="clear" w:color="auto" w:fill="auto"/><w:tcMar><w:top w:w="0pt" w:type="dxa"/><w:start w:w="5.40pt" w:type="dxa"/><w:bottom w:w="0pt" w:type="dxa"/><w:end w:w="5.40pt" w:type="dxa"/></w:tcMar><w:vAlign w:val="center"/></w:tcPr><w:p><w:pPr><w:suppressAutoHyphens/><w:autoSpaceDN w:val="0"/><w:snapToGrid w:val="0"/><w:jc w:val="both"/><w:textAlignment w:val="baseline"/><w:rPr><w:rFonts w:ascii="標楷體" w:eastAsia="標楷體" w:hAnsi="標楷體"/><w:kern w:val="0"/></w:rPr></w:pPr><w:r><w:rPr><w:rFonts w:ascii="標楷體" w:eastAsia="標楷體" w:hAnsi="標楷體" w:cs="Wingdings 2" w:hint="eastAsia"/><w:kern w:val="0"/></w:rPr><w:t>□</w:t></w:r><w:r><w:rPr><w:rFonts w:ascii="標楷體" w:eastAsia="標楷體" w:hAnsi="標楷體"/><w:kern w:val="0"/></w:rPr><w:t xml:space="preserve">紙本　　</w:t></w:r><w:r><w:rPr><w:rFonts w:ascii="標楷體" w:eastAsia="標楷體" w:hAnsi="標楷體" w:hint="eastAsia"/><w:kern w:val="0"/></w:rPr><w:t>■</w:t></w:r><w:r><w:rPr><w:rFonts w:ascii="標楷體" w:eastAsia="標楷體" w:hAnsi="標楷體" w:hint="eastAsia"/><w:kern w:val="0"/></w:rPr><w:t>數位</w:t></w:r><w:r><w:rPr><w:rFonts w:ascii="標楷體" w:eastAsia="標楷體" w:hAnsi="標楷體"/><w:kern w:val="0"/></w:rPr><w:t>檔</w:t></w:r><w:r><w:rPr><w:rFonts w:ascii="標楷體" w:eastAsia="標楷體" w:hAnsi="標楷體" w:hint="eastAsia"/><w:kern w:val="0"/></w:rPr><w:t>案</w:t></w:r><w:r><w:rPr><w:rFonts w:ascii="標楷體" w:eastAsia="標楷體" w:hAnsi="標楷體"/><w:kern w:val="0"/></w:rPr><w:t xml:space="preserve">　　</w:t></w:r></w:p></w:tc></w:tr><w:tr><w:trPr><w:trHeight w:val="1647"/><w:jc w:val="center"/></w:trPr><w:tc><w:tcPr><w:tcW w:w="105.30pt" w:type="dxa"/><w:tcBorders><w:top w:val="single" w:sz="4" w:space="0" w:color="000000"/><w:start w:val="single" w:sz="4" w:space="0" w:color="000000"/><w:bottom w:val="single" w:sz="4" w:space="0" w:color="000000"/><w:end w:val="single" w:sz="4" w:space="0" w:color="000000"/></w:tcBorders><w:shd w:val="clear" w:color="auto" w:fill="auto"/><w:tcMar><w:top w:w="0pt" w:type="dxa"/><w:start w:w="5.40pt" w:type="dxa"/><w:bottom w:w="0pt" w:type="dxa"/><w:end w:w="5.40pt" w:type="dxa"/></w:tcMar><w:vAlign w:val="center"/></w:tcPr><w:p><w:pPr><w:suppressAutoHyphens/><w:autoSpaceDN w:val="0"/><w:snapToGrid w:val="0"/><w:textAlignment w:val="baseline"/><w:rPr><w:rFonts w:ascii="標楷體" w:eastAsia="標楷體" w:hAnsi="標楷體"/><w:kern w:val="0"/></w:rPr></w:pPr><w:r><w:rPr><w:rFonts w:ascii="標楷體" w:eastAsia="標楷體" w:hAnsi="標楷體" w:cs="標楷體"/><w:color w:val="000000"/><w:kern w:val="0"/></w:rPr><w:t>資料檔案名稱</w:t></w:r><w:r><w:rPr><w:rFonts w:ascii="標楷體" w:eastAsia="標楷體" w:hAnsi="標楷體" w:cs="標楷體" w:hint="eastAsia"/><w:color w:val="000000"/><w:kern w:val="0"/></w:rPr><w:t>及內容</w:t></w:r></w:p></w:tc><w:tc><w:tcPr><w:tcW w:w="392.80pt" w:type="dxa"/><w:gridSpan w:val="4"/><w:tcBorders><w:top w:val="single" w:sz="4" w:space="0" w:color="000000"/><w:start w:val="single" w:sz="4" w:space="0" w:color="000000"/><w:bottom w:val="single" w:sz="4" w:space="0" w:color="000000"/><w:end w:val="single" w:sz="4" w:space="0" w:color="000000"/></w:tcBorders><w:shd w:val="clear" w:color="auto" w:fill="auto"/><w:tcMar><w:top w:w="0pt" w:type="dxa"/><w:start w:w="5.40pt" w:type="dxa"/><w:bottom w:w="0pt" w:type="dxa"/><w:end w:w="5.40pt" w:type="dxa"/></w:tcMar><w:vAlign w:val="center"/></w:tcPr><w:p><w:pPr><w:suppressAutoHyphens/><w:autoSpaceDN w:val="0"/><w:snapToGrid w:val="0"/><w:jc w:val="both"/><w:textAlignment w:val="baseline"/><w:rPr><w:rFonts w:ascii="標楷體" w:eastAsia="標楷體" w:hAnsi="標楷體"/><w:kern w:val="0"/></w:rPr></w:pPr><w:r><w:rPr><w:rFonts w:ascii="標楷體" w:eastAsia="標楷體" w:hAnsi="標楷體" w:hint="eastAsia"/><w:kern w:val="0"/></w:rPr><w:t>{apply_system_text}</w:t></w:r><w:r><w:rPr><w:rFonts w:ascii="標楷體" w:eastAsia="標楷體" w:hAnsi="標楷體" w:hint="eastAsia"/><w:kern w:val="0"/></w:rPr><w:t>中{apply_condition}之人口學資料。</w:t></w:r></w:p></w:tc></w:tr><w:tr><w:trPr><w:trHeight w:val="1106"/><w:jc w:val="center"/></w:trPr><w:tc><w:tcPr><w:tcW w:w="105.30pt" w:type="dxa"/><w:tcBorders><w:top w:val="single" w:sz="4" w:space="0" w:color="000000"/><w:start w:val="single" w:sz="4" w:space="0" w:color="000000"/><w:bottom w:val="single" w:sz="4" w:space="0" w:color="000000"/><w:end w:val="single" w:sz="4" w:space="0" w:color="000000"/></w:tcBorders><w:shd w:val="clear" w:color="auto" w:fill="auto"/><w:tcMar><w:top w:w="0pt" w:type="dxa"/><w:start w:w="5.40pt" w:type="dxa"/><w:bottom w:w="0pt" w:type="dxa"/><w:end w:w="5.40pt" w:type="dxa"/></w:tcMar><w:vAlign w:val="center"/></w:tcPr><w:p><w:pPr><w:suppressAutoHyphens/><w:autoSpaceDN w:val="0"/><w:snapToGrid w:val="0"/><w:jc w:val="center"/><w:textAlignment w:val="baseline"/><w:rPr><w:rFonts w:ascii="標楷體" w:eastAsia="標楷體" w:hAnsi="標楷體"/><w:color w:val="0000FF"/><w:kern w:val="0"/></w:rPr></w:pPr><w:r><w:rPr><w:rFonts w:ascii="標楷體" w:eastAsia="標楷體" w:hAnsi="標楷體" w:hint="eastAsia"/><w:color w:val="0000FF"/><w:kern w:val="0"/></w:rPr><w:t>申請單位</w:t></w:r></w:p><w:p><w:pPr><w:suppressAutoHyphens/><w:autoSpaceDN w:val="0"/><w:snapToGrid w:val="0"/><w:jc w:val="center"/><w:textAlignment w:val="baseline"/><w:rPr><w:rFonts w:ascii="標楷體" w:eastAsia="標楷體" w:hAnsi="標楷體"/><w:color w:val="FF0000"/><w:kern w:val="0"/><w:u w:val="single"/></w:rPr></w:pPr><w:r><w:rPr><w:rFonts w:ascii="標楷體" w:eastAsia="標楷體" w:hAnsi="標楷體" w:hint="eastAsia"/><w:color w:val="0000FF"/><w:kern w:val="0"/></w:rPr><w:t>單位</w:t></w:r><w:r><w:rPr><w:rFonts w:ascii="標楷體" w:eastAsia="標楷體" w:hAnsi="標楷體"/><w:color w:val="0000FF"/><w:kern w:val="0"/></w:rPr><w:t>主管</w:t></w:r></w:p></w:tc><w:tc><w:tcPr><w:tcW w:w="150.35pt" w:type="dxa"/><w:tcBorders><w:top w:val="single" w:sz="4" w:space="0" w:color="000000"/><w:start w:val="single" w:sz="4" w:space="0" w:color="000000"/><w:bottom w:val="single" w:sz="4" w:space="0" w:color="000000"/><w:end w:val="single" w:sz="4" w:space="0" w:color="000000"/></w:tcBorders><w:shd w:val="clear" w:color="auto" w:fill="auto"/><w:tcMar><w:top w:w="0pt" w:type="dxa"/><w:start w:w="5.40pt" w:type="dxa"/><w:bottom w:w="0pt" w:type="dxa"/><w:end w:w="5.40pt" w:type="dxa"/></w:tcMar><w:vAlign w:val="center"/></w:tcPr><w:p><w:pPr><w:suppressAutoHyphens/><w:autoSpaceDN w:val="0"/><w:snapToGrid w:val="0"/><w:jc w:val="both"/><w:textAlignment w:val="baseline"/><w:rPr><w:rFonts w:ascii="標楷體" w:eastAsia="標楷體" w:hAnsi="標楷體"/><w:color w:val="FF0000"/><w:kern w:val="0"/><w:u w:val="single"/></w:rPr></w:pPr></w:p></w:tc><w:tc><w:tcPr><w:tcW w:w="85.25pt" w:type="dxa"/><w:tcBorders><w:top w:val="single" w:sz="4" w:space="0" w:color="000000"/><w:start w:val="single" w:sz="4" w:space="0" w:color="000000"/><w:bottom w:val="single" w:sz="4" w:space="0" w:color="000000"/><w:end w:val="single" w:sz="4" w:space="0" w:color="000000"/></w:tcBorders><w:shd w:val="clear" w:color="auto" w:fill="auto"/><w:tcMar><w:top w:w="0pt" w:type="dxa"/><w:start w:w="5.40pt" w:type="dxa"/><w:bottom w:w="0pt" w:type="dxa"/><w:end w:w="5.40pt" w:type="dxa"/></w:tcMar><w:vAlign w:val="center"/></w:tcPr><w:p><w:pPr><w:widowControl/><w:suppressAutoHyphens/><w:autoSpaceDN w:val="0"/><w:jc w:val="center"/><w:textAlignment w:val="baseline"/><w:rPr><w:rFonts w:ascii="標楷體" w:eastAsia="標楷體" w:hAnsi="標楷體"/><w:color w:val="FF0000"/><w:kern w:val="0"/></w:rPr></w:pPr><w:r><w:rPr><w:rFonts w:ascii="標楷體" w:eastAsia="標楷體" w:hAnsi="標楷體"/><w:color w:val="0000FF"/><w:kern w:val="0"/></w:rPr><w:t>日期</w:t></w:r></w:p></w:tc><w:tc><w:tcPr><w:tcW w:w="157.20pt" w:type="dxa"/><w:gridSpan w:val="2"/><w:tcBorders><w:top w:val="single" w:sz="4" w:space="0" w:color="000000"/><w:start w:val="single" w:sz="4" w:space="0" w:color="000000"/><w:bottom w:val="single" w:sz="4" w:space="0" w:color="000000"/><w:end w:val="single" w:sz="4" w:space="0" w:color="000000"/></w:tcBorders><w:shd w:val="clear" w:color="auto" w:fill="auto"/><w:tcMar><w:top w:w="0pt" w:type="dxa"/><w:start w:w="5.40pt" w:type="dxa"/><w:bottom w:w="0pt" w:type="dxa"/><w:end w:w="5.40pt" w:type="dxa"/></w:tcMar><w:vAlign w:val="center"/></w:tcPr><w:p><w:pPr><w:widowControl/><w:suppressAutoHyphens/><w:autoSpaceDN w:val="0"/><w:jc w:val="both"/><w:textAlignment w:val="baseline"/><w:rPr><w:rFonts w:ascii="標楷體" w:eastAsia="標楷體" w:hAnsi="標楷體"/><w:color w:val="FF0000"/><w:kern w:val="0"/></w:rPr></w:pPr><w:r><w:rPr><w:rFonts w:ascii="標楷體" w:eastAsia="標楷體" w:hAnsi="標楷體"/><w:color w:val="0000FF"/><w:kern w:val="0"/></w:rPr><w:t xml:space="preserve">　　　年　　月　　日</w:t></w:r></w:p></w:tc></w:tr><w:tr><w:trPr><w:trHeight w:val="1106"/><w:jc w:val="center"/></w:trPr><w:tc><w:tcPr><w:tcW w:w="105.30pt" w:type="dxa"/><w:tcBorders><w:top w:val="single" w:sz="4" w:space="0" w:color="000000"/><w:start w:val="single" w:sz="4" w:space="0" w:color="000000"/><w:bottom w:val="single" w:sz="4" w:space="0" w:color="000000"/><w:end w:val="single" w:sz="4" w:space="0" w:color="000000"/></w:tcBorders><w:shd w:val="clear" w:color="auto" w:fill="auto"/><w:tcMar><w:top w:w="0pt" w:type="dxa"/><w:start w:w="5.40pt" w:type="dxa"/><w:bottom w:w="0pt" w:type="dxa"/><w:end w:w="5.40pt" w:type="dxa"/></w:tcMar><w:vAlign w:val="center"/></w:tcPr><w:p><w:pPr><w:suppressAutoHyphens/><w:autoSpaceDN w:val="0"/><w:snapToGrid w:val="0"/><w:jc w:val="center"/><w:textAlignment w:val="baseline"/><w:rPr><w:rFonts w:ascii="標楷體" w:eastAsia="標楷體" w:hAnsi="標楷體"/><w:kern w:val="0"/></w:rPr></w:pPr><w:r><w:rPr><w:rFonts w:ascii="標楷體" w:eastAsia="標楷體" w:hAnsi="標楷體" w:hint="eastAsia"/><w:kern w:val="0"/></w:rPr><w:t>業務</w:t></w:r><w:r><w:rPr><w:rFonts w:ascii="標楷體" w:eastAsia="標楷體" w:hAnsi="標楷體" w:hint="eastAsia"/><w:color w:val="0000FF"/><w:kern w:val="0"/></w:rPr><w:t>權責單位</w:t></w:r></w:p><w:p><w:pPr><w:suppressAutoHyphens/><w:autoSpaceDN w:val="0"/><w:snapToGrid w:val="0"/><w:jc w:val="center"/><w:textAlignment w:val="baseline"/><w:rPr><w:rFonts w:ascii="標楷體" w:eastAsia="標楷體" w:hAnsi="標楷體"/><w:kern w:val="0"/></w:rPr></w:pPr><w:r><w:rPr><w:rFonts w:ascii="標楷體" w:eastAsia="標楷體" w:hAnsi="標楷體"/><w:kern w:val="0"/></w:rPr><w:t>承辦</w:t></w:r><w:r><w:rPr><w:rFonts w:ascii="標楷體" w:eastAsia="標楷體" w:hAnsi="標楷體" w:hint="eastAsia"/><w:color w:val="0000FF"/><w:kern w:val="0"/></w:rPr><w:t>人員</w:t></w:r></w:p></w:tc><w:tc><w:tcPr><w:tcW w:w="150.35pt" w:type="dxa"/><w:tcBorders><w:top w:val="single" w:sz="4" w:space="0" w:color="000000"/><w:start w:val="single" w:sz="4" w:space="0" w:color="000000"/><w:bottom w:val="single" w:sz="4" w:space="0" w:color="000000"/><w:end w:val="single" w:sz="4" w:space="0" w:color="000000"/></w:tcBorders><w:shd w:val="clear" w:color="auto" w:fill="auto"/><w:tcMar><w:top w:w="0pt" w:type="dxa"/><w:start w:w="5.40pt" w:type="dxa"/><w:bottom w:w="0pt" w:type="dxa"/><w:end w:w="5.40pt" w:type="dxa"/></w:tcMar><w:vAlign w:val="center"/></w:tcPr><w:p><w:pPr><w:suppressAutoHyphens/><w:autoSpaceDN w:val="0"/><w:snapToGrid w:val="0"/><w:jc w:val="both"/><w:textAlignment w:val="baseline"/><w:rPr><w:rFonts w:ascii="標楷體" w:eastAsia="標楷體" w:hAnsi="標楷體"/><w:kern w:val="0"/></w:rPr></w:pPr></w:p></w:tc><w:tc><w:tcPr><w:tcW w:w="85.25pt" w:type="dxa"/><w:tcBorders><w:top w:val="single" w:sz="4" w:space="0" w:color="000000"/><w:start w:val="single" w:sz="4" w:space="0" w:color="000000"/><w:bottom w:val="single" w:sz="4" w:space="0" w:color="000000"/><w:end w:val="single" w:sz="4" w:space="0" w:color="000000"/></w:tcBorders><w:shd w:val="clear" w:color="auto" w:fill="auto"/><w:tcMar><w:top w:w="0pt" w:type="dxa"/><w:start w:w="5.40pt" w:type="dxa"/><w:bottom w:w="0pt" w:type="dxa"/><w:end w:w="5.40pt" w:type="dxa"/></w:tcMar><w:vAlign w:val="center"/></w:tcPr><w:p><w:pPr><w:widowControl/><w:suppressAutoHyphens/><w:autoSpaceDN w:val="0"/><w:jc w:val="center"/><w:textAlignment w:val="baseline"/><w:rPr><w:rFonts w:ascii="標楷體" w:eastAsia="標楷體" w:hAnsi="標楷體"/><w:kern w:val="0"/></w:rPr></w:pPr><w:r><w:rPr><w:rFonts w:ascii="標楷體" w:eastAsia="標楷體" w:hAnsi="標楷體"/><w:kern w:val="0"/></w:rPr><w:t>日期</w:t></w:r></w:p></w:tc><w:tc><w:tcPr><w:tcW w:w="157.20pt" w:type="dxa"/><w:gridSpan w:val="2"/><w:tcBorders><w:top w:val="single" w:sz="4" w:space="0" w:color="000000"/><w:start w:val="single" w:sz="4" w:space="0" w:color="000000"/><w:bottom w:val="single" w:sz="4" w:space="0" w:color="000000"/><w:end w:val="single" w:sz="4" w:space="0" w:color="000000"/></w:tcBorders><w:shd w:val="clear" w:color="auto" w:fill="auto"/><w:tcMar><w:top w:w="0pt" w:type="dxa"/><w:start w:w="5.40pt" w:type="dxa"/><w:bottom w:w="0pt" w:type="dxa"/><w:end w:w="5.40pt" w:type="dxa"/></w:tcMar><w:vAlign w:val="center"/></w:tcPr><w:p><w:pPr><w:widowControl/><w:suppressAutoHyphens/><w:autoSpaceDN w:val="0"/><w:jc w:val="both"/><w:textAlignment w:val="baseline"/><w:rPr><w:rFonts w:ascii="標楷體" w:eastAsia="標楷體" w:hAnsi="標楷體"/><w:kern w:val="0"/></w:rPr></w:pPr><w:r><w:rPr><w:rFonts w:ascii="標楷體" w:eastAsia="標楷體" w:hAnsi="標楷體"/><w:kern w:val="0"/></w:rPr><w:t xml:space="preserve">　　　年　　月　　日</w:t></w:r></w:p></w:tc></w:tr><w:tr><w:trPr><w:trHeight w:val="935"/><w:jc w:val="center"/></w:trPr><w:tc><w:tcPr><w:tcW w:w="105.30pt" w:type="dxa"/><w:tcBorders><w:top w:val="single" w:sz="4" w:space="0" w:color="000000"/><w:start w:val="single" w:sz="4" w:space="0" w:color="000000"/><w:bottom w:val="single" w:sz="4" w:space="0" w:color="000000"/><w:end w:val="single" w:sz="4" w:space="0" w:color="000000"/></w:tcBorders><w:shd w:val="clear" w:color="auto" w:fill="auto"/><w:tcMar><w:top w:w="0pt" w:type="dxa"/><w:start w:w="5.40pt" w:type="dxa"/><w:bottom w:w="0pt" w:type="dxa"/><w:end w:w="5.40pt" w:type="dxa"/></w:tcMar><w:vAlign w:val="center"/></w:tcPr><w:p><w:pPr><w:suppressAutoHyphens/><w:autoSpaceDN w:val="0"/><w:snapToGrid w:val="0"/><w:jc w:val="center"/><w:textAlignment w:val="baseline"/><w:rPr><w:rFonts w:ascii="標楷體" w:eastAsia="標楷體" w:hAnsi="標楷體"/><w:kern w:val="0"/></w:rPr></w:pPr><w:r><w:rPr><w:rFonts w:ascii="標楷體" w:eastAsia="標楷體" w:hAnsi="標楷體" w:hint="eastAsia"/><w:kern w:val="0"/></w:rPr><w:t>業務</w:t></w:r><w:r><w:rPr><w:rFonts w:ascii="標楷體" w:eastAsia="標楷體" w:hAnsi="標楷體" w:hint="eastAsia"/><w:color w:val="0000FF"/><w:kern w:val="0"/></w:rPr><w:t>權責</w:t></w:r><w:r><w:rPr><w:rFonts w:ascii="標楷體" w:eastAsia="標楷體" w:hAnsi="標楷體"/><w:kern w:val="0"/></w:rPr><w:t>單位</w:t></w:r></w:p><w:p><w:pPr><w:suppressAutoHyphens/><w:autoSpaceDN w:val="0"/><w:snapToGrid w:val="0"/><w:jc w:val="center"/><w:textAlignment w:val="baseline"/><w:rPr><w:rFonts w:ascii="標楷體" w:eastAsia="標楷體" w:hAnsi="標楷體"/><w:kern w:val="0"/></w:rPr></w:pPr><w:r><w:rPr><w:rFonts w:ascii="標楷體" w:eastAsia="標楷體" w:hAnsi="標楷體" w:hint="eastAsia"/><w:color w:val="0000FF"/><w:kern w:val="0"/></w:rPr><w:t>單位</w:t></w:r><w:r><w:rPr><w:rFonts w:ascii="標楷體" w:eastAsia="標楷體" w:hAnsi="標楷體"/><w:kern w:val="0"/></w:rPr><w:t>主管</w:t></w:r></w:p></w:tc><w:tc><w:tcPr><w:tcW w:w="150.35pt" w:type="dxa"/><w:tcBorders><w:top w:val="single" w:sz="4" w:space="0" w:color="000000"/><w:start w:val="single" w:sz="4" w:space="0" w:color="000000"/><w:bottom w:val="single" w:sz="4" w:space="0" w:color="000000"/><w:end w:val="single" w:sz="4" w:space="0" w:color="000000"/></w:tcBorders><w:shd w:val="clear" w:color="auto" w:fill="auto"/><w:tcMar><w:top w:w="0pt" w:type="dxa"/><w:start w:w="5.40pt" w:type="dxa"/><w:bottom w:w="0pt" w:type="dxa"/><w:end w:w="5.40pt" w:type="dxa"/></w:tcMar></w:tcPr><w:p><w:pPr><w:suppressAutoHyphens/><w:autoSpaceDN w:val="0"/><w:snapToGrid w:val="0"/><w:jc w:val="both"/><w:textAlignment w:val="baseline"/><w:rPr><w:rFonts w:ascii="標楷體" w:eastAsia="標楷體" w:hAnsi="標楷體"/><w:kern w:val="0"/></w:rPr></w:pPr></w:p></w:tc><w:tc><w:tcPr><w:tcW w:w="85.25pt" w:type="dxa"/><w:tcBorders><w:top w:val="single" w:sz="4" w:space="0" w:color="000000"/><w:start w:val="single" w:sz="4" w:space="0" w:color="000000"/><w:bottom w:val="single" w:sz="4" w:space="0" w:color="000000"/><w:end w:val="single" w:sz="4" w:space="0" w:color="000000"/></w:tcBorders><w:shd w:val="clear" w:color="auto" w:fill="auto"/><w:tcMar><w:top w:w="0pt" w:type="dxa"/><w:start w:w="5.40pt" w:type="dxa"/><w:bottom w:w="0pt" w:type="dxa"/><w:end w:w="5.40pt" w:type="dxa"/></w:tcMar><w:vAlign w:val="center"/></w:tcPr><w:p><w:pPr><w:widowControl/><w:suppressAutoHyphens/><w:autoSpaceDN w:val="0"/><w:jc w:val="center"/><w:textAlignment w:val="baseline"/><w:rPr><w:rFonts w:ascii="標楷體" w:eastAsia="標楷體" w:hAnsi="標楷體"/><w:kern w:val="0"/></w:rPr></w:pPr><w:r><w:rPr><w:rFonts w:ascii="標楷體" w:eastAsia="標楷體" w:hAnsi="標楷體"/><w:kern w:val="0"/></w:rPr><w:t>日期</w:t></w:r></w:p></w:tc><w:tc><w:tcPr><w:tcW w:w="157.20pt" w:type="dxa"/><w:gridSpan w:val="2"/><w:tcBorders><w:top w:val="single" w:sz="4" w:space="0" w:color="000000"/><w:start w:val="single" w:sz="4" w:space="0" w:color="000000"/><w:bottom w:val="single" w:sz="4" w:space="0" w:color="000000"/><w:end w:val="single" w:sz="4" w:space="0" w:color="000000"/></w:tcBorders><w:shd w:val="clear" w:color="auto" w:fill="auto"/><w:tcMar><w:top w:w="0pt" w:type="dxa"/><w:start w:w="5.40pt" w:type="dxa"/><w:bottom w:w="0pt" w:type="dxa"/><w:end w:w="5.40pt" w:type="dxa"/></w:tcMar><w:vAlign w:val="center"/></w:tcPr><w:p><w:pPr><w:widowControl/><w:suppressAutoHyphens/><w:autoSpaceDN w:val="0"/><w:jc w:val="both"/><w:textAlignment w:val="baseline"/><w:rPr><w:rFonts w:ascii="標楷體" w:eastAsia="標楷體" w:hAnsi="標楷體"/><w:kern w:val="0"/></w:rPr></w:pPr><w:r><w:rPr><w:rFonts w:ascii="標楷體" w:eastAsia="標楷體" w:hAnsi="標楷體"/><w:kern w:val="0"/></w:rPr><w:t xml:space="preserve">　　　年　　月　　日</w:t></w:r></w:p></w:tc></w:tr></w:tbl><w:p><w:pPr><w:autoSpaceDE w:val="0"/><w:autoSpaceDN w:val="0"/><w:adjustRightInd w:val="0"/><w:ind w:start="21.30pt" w:hangingChars="213" w:hanging="21.30pt"/><w:rPr><w:rFonts w:ascii="標楷體" w:eastAsia="標楷體" w:hAnsi="標楷體"/><w:kern w:val="0"/><w:sz w:val="20"/><w:szCs w:val="20"/></w:rPr></w:pPr><w:r><w:rPr><w:rFonts w:ascii="標楷體" w:eastAsia="標楷體" w:hAnsi="標楷體" w:hint="eastAsia"/><w:kern w:val="0"/><w:sz w:val="20"/><w:szCs w:val="20"/></w:rPr><w:t>註</w:t></w:r><w:r><w:rPr><w:rFonts w:ascii="標楷體" w:eastAsia="標楷體" w:hAnsi="標楷體"/><w:kern w:val="0"/><w:sz w:val="20"/><w:szCs w:val="20"/></w:rPr><w:t>:當事人請求相關權益時，</w:t></w:r><w:r><w:rPr><w:rFonts w:ascii="標楷體" w:eastAsia="標楷體" w:hAnsi="標楷體" w:hint="eastAsia"/><w:kern w:val="0"/><w:sz w:val="20"/><w:szCs w:val="20"/></w:rPr><w:t>本署為</w:t></w:r><w:r><w:rPr><w:rFonts w:ascii="標楷體" w:eastAsia="標楷體" w:hAnsi="標楷體" w:hint="eastAsia"/><w:kern w:val="0"/><w:sz w:val="20"/><w:szCs w:val="20"/></w:rPr><w:t>尊</w:t></w:r><w:r><w:rPr><w:rFonts w:ascii="標楷體" w:eastAsia="標楷體" w:hAnsi="標楷體" w:hint="eastAsia"/><w:kern w:val="0"/><w:sz w:val="20"/><w:szCs w:val="20"/></w:rPr><w:t>重個資當事人權益，得要求資料利用單位執行下列事項</w:t></w:r><w:r><w:rPr><w:rFonts w:ascii="標楷體" w:eastAsia="標楷體" w:hAnsi="標楷體" w:hint="eastAsia"/><w:kern w:val="0"/><w:sz w:val="20"/><w:szCs w:val="20"/></w:rPr><w:t>：</w:t></w:r></w:p><w:p><w:pPr><w:rPr><w:rFonts w:ascii="標楷體" w:eastAsia="標楷體" w:hAnsi="標楷體"/><w:sz w:val="20"/><w:szCs w:val="20"/></w:rPr></w:pPr><w:r><w:rPr><w:rFonts w:ascii="標楷體" w:eastAsia="標楷體" w:hAnsi="標楷體"/><w:kern w:val="0"/><w:sz w:val="20"/><w:szCs w:val="20"/></w:rPr><w:t>1.</w:t></w:r><w:r><w:rPr><w:rFonts w:ascii="標楷體" w:eastAsia="標楷體" w:hAnsi="標楷體"/><w:kern w:val="0"/><w:sz w:val="20"/><w:szCs w:val="20"/></w:rPr><w:t xml:space="preserve"> </w:t></w:r><w:r><w:rPr><w:rFonts w:ascii="標楷體" w:eastAsia="標楷體" w:hAnsi="標楷體" w:hint="eastAsia"/><w:kern w:val="0"/><w:sz w:val="20"/><w:szCs w:val="20"/></w:rPr><w:t>回</w:t></w:r><w:r><w:rPr><w:rFonts w:ascii="標楷體" w:eastAsia="標楷體" w:hAnsi="標楷體" w:hint="eastAsia"/><w:kern w:val="0"/><w:sz w:val="20"/><w:szCs w:val="20"/></w:rPr><w:t>應</w:t></w:r><w:r><w:rPr><w:rFonts w:ascii="標楷體" w:eastAsia="標楷體" w:hAnsi="標楷體" w:hint="eastAsia"/><w:kern w:val="0"/><w:sz w:val="20"/><w:szCs w:val="20"/></w:rPr><w:t>當事人</w:t></w:r><w:r><w:rPr><w:rFonts w:ascii="標楷體" w:eastAsia="標楷體" w:hAnsi="標楷體" w:hint="eastAsia"/><w:kern w:val="0"/><w:sz w:val="20"/><w:szCs w:val="20"/></w:rPr><w:t>.</w:t></w:r><w:r><w:rPr><w:rFonts w:ascii="標楷體" w:eastAsia="標楷體" w:hAnsi="標楷體" w:hint="eastAsia"/><w:kern w:val="0"/><w:sz w:val="20"/><w:szCs w:val="20"/></w:rPr><w:t>個</w:t></w:r><w:r><w:rPr><w:rFonts w:ascii="標楷體" w:eastAsia="標楷體" w:hAnsi="標楷體" w:hint="eastAsia"/><w:kern w:val="0"/><w:sz w:val="20"/><w:szCs w:val="20"/></w:rPr><w:t>人</w:t></w:r><w:r><w:rPr><w:rFonts w:ascii="標楷體" w:eastAsia="標楷體" w:hAnsi="標楷體" w:hint="eastAsia"/><w:kern w:val="0"/><w:sz w:val="20"/><w:szCs w:val="20"/></w:rPr><w:t>資</w:t></w:r><w:r><w:rPr><w:rFonts w:ascii="標楷體" w:eastAsia="標楷體" w:hAnsi="標楷體" w:hint="eastAsia"/><w:kern w:val="0"/><w:sz w:val="20"/><w:szCs w:val="20"/></w:rPr><w:t>料</w:t></w:r><w:r><w:rPr><w:rFonts w:ascii="標楷體" w:eastAsia="標楷體" w:hAnsi="標楷體" w:hint="eastAsia"/><w:kern w:val="0"/><w:sz w:val="20"/><w:szCs w:val="20"/></w:rPr><w:t>處理目的及方式</w:t></w:r><w:r><w:rPr><w:rFonts w:ascii="標楷體" w:eastAsia="標楷體" w:hAnsi="標楷體" w:hint="eastAsia"/><w:kern w:val="0"/><w:sz w:val="20"/><w:szCs w:val="20"/><w:lang w:eastAsia="zh-HK"/></w:rPr><w:t>；</w:t></w:r><w:r><w:rPr><w:rFonts w:ascii="標楷體" w:eastAsia="標楷體" w:hAnsi="標楷體"/><w:kern w:val="0"/><w:sz w:val="20"/><w:szCs w:val="20"/></w:rPr><w:t>2.</w:t></w:r><w:r><w:rPr><w:rFonts w:ascii="標楷體" w:eastAsia="標楷體" w:hAnsi="標楷體"/><w:kern w:val="0"/><w:sz w:val="20"/><w:szCs w:val="20"/></w:rPr><w:t xml:space="preserve"> 更新</w:t></w:r><w:r><w:rPr><w:rFonts w:ascii="標楷體" w:eastAsia="標楷體" w:hAnsi="標楷體" w:hint="eastAsia"/><w:kern w:val="0"/><w:sz w:val="20"/><w:szCs w:val="20"/></w:rPr><w:t>個人資料</w:t></w:r><w:r><w:rPr><w:rFonts w:ascii="標楷體" w:eastAsia="標楷體" w:hAnsi="標楷體" w:hint="eastAsia"/><w:kern w:val="0"/><w:sz w:val="20"/><w:szCs w:val="20"/><w:lang w:eastAsia="zh-HK"/></w:rPr><w:t>；</w:t></w:r><w:r><w:rPr><w:rFonts w:ascii="標楷體" w:eastAsia="標楷體" w:hAnsi="標楷體"/><w:kern w:val="0"/><w:sz w:val="20"/><w:szCs w:val="20"/></w:rPr><w:t>3.</w:t></w:r><w:r><w:rPr><w:rFonts w:ascii="標楷體" w:eastAsia="標楷體" w:hAnsi="標楷體"/><w:kern w:val="0"/><w:sz w:val="20"/><w:szCs w:val="20"/></w:rPr><w:t xml:space="preserve"> 刪除</w:t></w:r><w:r><w:rPr><w:rFonts w:ascii="標楷體" w:eastAsia="標楷體" w:hAnsi="標楷體" w:hint="eastAsia"/><w:kern w:val="0"/><w:sz w:val="20"/><w:szCs w:val="20"/></w:rPr><w:t>個人資料</w:t></w:r><w:r><w:rPr><w:rFonts w:ascii="標楷體" w:eastAsia="標楷體" w:hAnsi="標楷體" w:hint="eastAsia"/><w:kern w:val="0"/><w:sz w:val="20"/><w:szCs w:val="20"/><w:lang w:eastAsia="zh-HK"/></w:rPr><w:t>；</w:t></w:r><w:r><w:rPr><w:rFonts w:ascii="標楷體" w:eastAsia="標楷體" w:hAnsi="標楷體"/><w:kern w:val="0"/><w:sz w:val="20"/><w:szCs w:val="20"/></w:rPr><w:t>4.</w:t></w:r><w:r><w:rPr><w:rFonts w:ascii="標楷體" w:eastAsia="標楷體" w:hAnsi="標楷體"/><w:kern w:val="0"/><w:sz w:val="20"/><w:szCs w:val="20"/></w:rPr><w:t xml:space="preserve"> </w:t></w:r><w:r><w:rPr><w:rFonts w:ascii="標楷體" w:eastAsia="標楷體" w:hAnsi="標楷體" w:hint="eastAsia"/><w:kern w:val="0"/><w:sz w:val="20"/><w:szCs w:val="20"/></w:rPr><w:t>停止利用個人資料。</w:t></w:r></w:p><w:sectPr><w:headerReference w:type="default" r:id="rId11"/><w:footerReference w:type="default" r:id="rId12"/><w:pgSz w:w="612pt" w:h="792pt" w:code="1"/><w:pgMar w:top="28.35pt" w:right="56.70pt" w:bottom="28.35pt" w:left="56.70pt" w:header="56.70pt" w:footer="56.70pt" w:gutter="0pt"/><w:cols w:space="36pt"/><w:noEndnote/></w:sectPr></w:body></w:document>
+<file path=word/document.xml><?xml version="1.0" encoding="utf-8"?>
+<w:document xmlns:wpc="http://schemas.microsoft.com/office/word/2010/wordprocessingCanvas" xmlns:cx="http://schemas.microsoft.com/office/drawing/2014/chartex" xmlns:cx1="http://schemas.microsoft.com/office/drawing/2015/9/8/chartex" xmlns:cx2="http://schemas.microsoft.com/office/drawing/2015/10/21/chartex" xmlns:cx3="http://schemas.microsoft.com/office/drawing/2016/5/9/chartex" xmlns:cx4="http://schemas.microsoft.com/office/drawing/2016/5/10/chartex" xmlns:cx5="http://schemas.microsoft.com/office/drawing/2016/5/11/chartex" xmlns:cx6="http://schemas.microsoft.com/office/drawing/2016/5/12/chartex" xmlns:cx7="http://schemas.microsoft.com/office/drawing/2016/5/13/chartex" xmlns:cx8="http://schemas.microsoft.com/office/drawing/2016/5/14/chartex" xmlns:mc="http://schemas.openxmlformats.org/markup-compatibility/2006" xmlns:aink="http://schemas.microsoft.com/office/drawing/2016/ink" xmlns:am3d="http://schemas.microsoft.com/office/drawing/2017/model3d" xmlns:o="urn:schemas-microsoft-com:office:office" xmlns:oel="http://schemas.microsoft.com/office/2019/extlst" xmlns:r="http://schemas.openxmlformats.org/officeDocument/2006/relationships" xmlns:m="http://schemas.openxmlformats.org/officeDocument/2006/math" xmlns:v="urn:schemas-microsoft-com:vml" xmlns:wp14="http://schemas.microsoft.com/office/word/2010/wordprocessingDrawing" xmlns:wp="http://schemas.openxmlformats.org/drawingml/2006/wordprocessingDrawing" xmlns:w10="urn:schemas-microsoft-com:office:word" xmlns:w="http://schemas.openxmlformats.org/wordprocessingml/2006/main" xmlns:w14="http://schemas.microsoft.com/office/word/2010/wordml" xmlns:w15="http://schemas.microsoft.com/office/word/2012/wordml" xmlns:w16cex="http://schemas.microsoft.com/office/word/2018/wordml/cex" xmlns:w16cid="http://schemas.microsoft.com/office/word/2016/wordml/cid" xmlns:w16="http://schemas.microsoft.com/office/word/2018/wordml" xmlns:w16sdtdh="http://schemas.microsoft.com/office/word/2020/wordml/sdtdatahash" xmlns:w16se="http://schemas.microsoft.com/office/word/2015/wordml/symex" xmlns:wpg="http://schemas.microsoft.com/office/word/2010/wordprocessingGroup" xmlns:wpi="http://schemas.microsoft.com/office/word/2010/wordprocessingInk" xmlns:wne="http://schemas.microsoft.com/office/word/2006/wordml" xmlns:wps="http://schemas.microsoft.com/office/word/2010/wordprocessingShape" mc:Ignorable="w14 w15 w16se w16cid w16 w16cex w16sdtdh wp14">
+  <w:body>
+    <w:p>
+      <w:pPr>
+        <w:autoSpaceDE w:val="0"/>
+        <w:autoSpaceDN w:val="0"/>
+        <w:adjustRightInd w:val="0"/>
+        <w:spacing w:line="320" w:lineRule="exact"/>
+        <w:ind w:leftChars="400" w:left="960"/>
+        <w:jc w:val="center"/>
+        <w:rPr>
+          <w:rFonts w:ascii="標楷體" w:eastAsia="標楷體" w:hAnsi="標楷體"/>
+          <w:b/>
+          <w:noProof/>
+          <w:color w:val="000000"/>
+          <w:kern w:val="0"/>
+          <w:sz w:val="32"/>
+          <w:szCs w:val="32"/>
+        </w:rPr>
+      </w:pPr>
+      <w:r>
+        <w:rPr>
+          <w:rFonts w:ascii="標楷體" w:eastAsia="標楷體" w:hAnsi="標楷體" w:hint="eastAsia"/>
+          <w:b/>
+          <w:noProof/>
+          <w:color w:val="000000"/>
+          <w:kern w:val="0"/>
+          <w:sz w:val="32"/>
+          <w:szCs w:val="32"/>
+        </w:rPr>
+        <w:t>應用系統維護單</w:t>
+      </w:r>
+    </w:p>
+    <w:p>
+      <w:pPr>
+        <w:autoSpaceDE w:val="0"/>
+        <w:autoSpaceDN w:val="0"/>
+        <w:adjustRightInd w:val="0"/>
+        <w:ind w:leftChars="2400" w:left="5760" w:rightChars="171" w:right="410"/>
+        <w:jc w:val="center"/>
+        <w:rPr>
+          <w:rFonts w:ascii="標楷體" w:eastAsia="標楷體" w:hAnsi="標楷體"/>
+          <w:color w:val="000000"/>
+          <w:szCs w:val="24"/>
+        </w:rPr>
+      </w:pPr>
+      <w:r>
+        <w:rPr>
+          <w:rFonts w:ascii="標楷體" w:eastAsia="標楷體" w:hAnsi="標楷體" w:hint="eastAsia"/>
+          <w:color w:val="000000"/>
+          <w:szCs w:val="24"/>
+        </w:rPr>
+        <w:t xml:space="preserve">表單編號：                  </w:t>
+      </w:r>
+    </w:p>
+    <w:tbl>
+      <w:tblPr>
+        <w:tblW w:w="5000" w:type="pct"/>
+        <w:tblBorders>
+          <w:top w:val="single" w:sz="4" w:space="0" w:color="auto"/>
+          <w:left w:val="single" w:sz="4" w:space="0" w:color="auto"/>
+          <w:bottom w:val="single" w:sz="4" w:space="0" w:color="auto"/>
+          <w:right w:val="single" w:sz="4" w:space="0" w:color="auto"/>
+          <w:insideH w:val="single" w:sz="4" w:space="0" w:color="auto"/>
+          <w:insideV w:val="single" w:sz="4" w:space="0" w:color="auto"/>
+        </w:tblBorders>
+        <w:tblLook w:val="01E0" w:firstRow="1" w:lastRow="1" w:firstColumn="1" w:lastColumn="1" w:noHBand="0" w:noVBand="0"/>
+      </w:tblPr>
+      <w:tblGrid>
+        <w:gridCol w:w="531"/>
+        <w:gridCol w:w="663"/>
+        <w:gridCol w:w="1700"/>
+        <w:gridCol w:w="1105"/>
+        <w:gridCol w:w="3468"/>
+        <w:gridCol w:w="3295"/>
+      </w:tblGrid>
+      <w:tr>
+        <w:trPr>
+          <w:trHeight w:val="397"/>
+        </w:trPr>
+        <w:tc>
+          <w:tcPr>
+            <w:tcW w:w="248" w:type="pct"/>
+            <w:vMerge w:val="restart"/>
+            <w:textDirection w:val="tbRlV"/>
+            <w:vAlign w:val="center"/>
+          </w:tcPr>
+          <w:p>
+            <w:pPr>
+              <w:ind w:left="113" w:right="113"/>
+              <w:jc w:val="center"/>
+              <w:rPr>
+                <w:rFonts w:ascii="標楷體" w:eastAsia="標楷體" w:hAnsi="標楷體"/>
+                <w:sz w:val="20"/>
+              </w:rPr>
+            </w:pPr>
+            <w:r>
+              <w:rPr>
+                <w:rFonts w:ascii="標楷體" w:eastAsia="標楷體" w:hAnsi="標楷體" w:hint="eastAsia"/>
+                <w:sz w:val="20"/>
+              </w:rPr>
+              <w:t>本欄由申請單位填寫</w:t>
+            </w:r>
+          </w:p>
+        </w:tc>
+        <w:tc>
+          <w:tcPr>
+            <w:tcW w:w="4752" w:type="pct"/>
+            <w:gridSpan w:val="5"/>
+            <w:vAlign w:val="center"/>
+          </w:tcPr>
+          <w:p>
+            <w:pPr>
+              <w:jc w:val="both"/>
+              <w:rPr>
+                <w:rFonts w:ascii="標楷體" w:eastAsia="標楷體" w:hAnsi="標楷體"/>
+                <w:szCs w:val="24"/>
+              </w:rPr>
+            </w:pPr>
+            <w:r>
+              <w:rPr>
+                <w:rFonts w:ascii="標楷體" w:eastAsia="標楷體" w:hAnsi="標楷體" w:hint="eastAsia"/>
+                <w:szCs w:val="24"/>
+              </w:rPr>
+              <w:t xml:space="preserve">系統名稱：{apply_system_text}</w:t>
+            </w:r>
+          </w:p>
+        </w:tc>
+      </w:tr>
+      <w:tr>
+        <w:trPr>
+          <w:trHeight w:val="397"/>
+        </w:trPr>
+        <w:tc>
+          <w:tcPr>
+            <w:tcW w:w="248" w:type="pct"/>
+            <w:vMerge/>
+            <w:vAlign w:val="center"/>
+          </w:tcPr>
+          <w:p>
+            <w:pPr>
+              <w:jc w:val="center"/>
+              <w:rPr>
+                <w:rFonts w:ascii="標楷體" w:eastAsia="標楷體" w:hAnsi="標楷體"/>
+                <w:szCs w:val="24"/>
+              </w:rPr>
+            </w:pPr>
+          </w:p>
+        </w:tc>
+        <w:tc>
+          <w:tcPr>
+            <w:tcW w:w="3220" w:type="pct"/>
+            <w:gridSpan w:val="4"/>
+            <w:vAlign w:val="center"/>
+          </w:tcPr>
+          <w:p>
+            <w:pPr>
+              <w:jc w:val="both"/>
+              <w:rPr>
+                <w:rFonts w:ascii="標楷體" w:eastAsia="標楷體" w:hAnsi="標楷體"/>
+                <w:szCs w:val="24"/>
+              </w:rPr>
+            </w:pPr>
+            <w:r>
+              <w:rPr>
+                <w:rFonts w:ascii="標楷體" w:eastAsia="標楷體" w:hAnsi="標楷體" w:hint="eastAsia"/>
+                <w:szCs w:val="24"/>
+              </w:rPr>
+              <w:t xml:space="preserve">申請單位：{pi_unit}</w:t>
+            </w:r>
+          </w:p>
+        </w:tc>
+        <w:tc>
+          <w:tcPr>
+            <w:tcW w:w="1532" w:type="pct"/>
+            <w:vAlign w:val="center"/>
+          </w:tcPr>
+          <w:p>
+            <w:pPr>
+              <w:jc w:val="both"/>
+              <w:rPr>
+                <w:rFonts w:ascii="標楷體" w:eastAsia="標楷體" w:hAnsi="標楷體"/>
+                <w:sz w:val="22"/>
+                <w:szCs w:val="22"/>
+              </w:rPr>
+            </w:pPr>
+            <w:r>
+              <w:rPr>
+                <w:rFonts w:ascii="標楷體" w:eastAsia="標楷體" w:hAnsi="標楷體" w:hint="eastAsia"/>
+                <w:sz w:val="22"/>
+                <w:szCs w:val="22"/>
+              </w:rPr>
+              <w:t xml:space="preserve">申請日期：民國{apply_date_roc}</w:t>
+            </w:r>
+          </w:p>
+        </w:tc>
+      </w:tr>
+      <w:tr>
+        <w:tc>
+          <w:tcPr>
+            <w:tcW w:w="248" w:type="pct"/>
+            <w:vMerge/>
+            <w:vAlign w:val="center"/>
+          </w:tcPr>
+          <w:p>
+            <w:pPr>
+              <w:jc w:val="center"/>
+              <w:rPr>
+                <w:rFonts w:ascii="標楷體" w:eastAsia="標楷體" w:hAnsi="標楷體"/>
+                <w:szCs w:val="24"/>
+              </w:rPr>
+            </w:pPr>
+          </w:p>
+        </w:tc>
+        <w:tc>
+          <w:tcPr>
+            <w:tcW w:w="302" w:type="pct"/>
+            <w:vAlign w:val="center"/>
+          </w:tcPr>
+          <w:p>
+            <w:pPr>
+              <w:ind w:left="113" w:right="113"/>
+              <w:jc w:val="center"/>
+              <w:rPr>
+                <w:rFonts w:ascii="標楷體" w:eastAsia="標楷體" w:hAnsi="標楷體"/>
+                <w:sz w:val="22"/>
+                <w:szCs w:val="22"/>
+              </w:rPr>
+            </w:pPr>
+            <w:r>
+              <w:rPr>
+                <w:rFonts w:ascii="標楷體" w:eastAsia="標楷體" w:hAnsi="標楷體" w:hint="eastAsia"/>
+                <w:sz w:val="22"/>
+                <w:szCs w:val="22"/>
+              </w:rPr>
+              <w:t>需求項目</w:t>
+            </w:r>
+          </w:p>
+        </w:tc>
+        <w:tc>
+          <w:tcPr>
+            <w:tcW w:w="4450" w:type="pct"/>
+            <w:gridSpan w:val="4"/>
+          </w:tcPr>
+          <w:p>
+            <w:pPr>
+              <w:tabs>
+                <w:tab w:val="left" w:pos="1132"/>
+              </w:tabs>
+              <w:ind w:left="1000" w:hangingChars="500" w:hanging="1000"/>
+              <w:rPr>
+                <w:rFonts w:ascii="標楷體" w:eastAsia="標楷體" w:hAnsi="標楷體"/>
+                <w:sz w:val="20"/>
+              </w:rPr>
+            </w:pPr>
+            <w:r>
+              <w:rPr>
+                <w:rFonts w:ascii="標楷體" w:eastAsia="標楷體" w:hAnsi="標楷體" w:hint="eastAsia"/>
+                <w:sz w:val="20"/>
+              </w:rPr>
+              <w:t>□系統資料維護(系統無提供維護介面者)</w:t>
+            </w:r>
+          </w:p>
+          <w:p>
+            <w:pPr>
+              <w:tabs>
+                <w:tab w:val="left" w:pos="1132"/>
+              </w:tabs>
+              <w:rPr>
+                <w:rFonts w:ascii="標楷體" w:eastAsia="標楷體" w:hAnsi="標楷體"/>
+                <w:sz w:val="20"/>
+              </w:rPr>
+            </w:pPr>
+            <w:r>
+              <w:rPr>
+                <w:rFonts w:ascii="標楷體" w:eastAsia="標楷體" w:hAnsi="標楷體" w:hint="eastAsia"/>
+                <w:sz w:val="20"/>
+              </w:rPr>
+              <w:t>□系統資料下載(系統無提供下載介面者)</w:t>
+            </w:r>
+          </w:p>
+          <w:p>
+            <w:pPr>
+              <w:tabs>
+                <w:tab w:val="left" w:pos="1132"/>
+              </w:tabs>
+              <w:rPr>
+                <w:rFonts w:ascii="標楷體" w:eastAsia="標楷體" w:hAnsi="標楷體"/>
+                <w:sz w:val="20"/>
+              </w:rPr>
+            </w:pPr>
+            <w:r>
+              <w:rPr>
+                <w:rFonts w:ascii="標楷體" w:eastAsia="標楷體" w:hAnsi="標楷體" w:hint="eastAsia"/>
+                <w:sz w:val="20"/>
+              </w:rPr>
+              <w:t>□系統程式錯誤維護(出現錯誤訊息視窗)</w:t>
+            </w:r>
+            <w:r>
+              <w:rPr>
+                <w:rFonts w:ascii="標楷體" w:eastAsia="標楷體" w:hAnsi="標楷體"/>
+                <w:sz w:val="20"/>
+              </w:rPr>
+              <w:t>-</w:t>
+            </w:r>
+            <w:r>
+              <w:rPr>
+                <w:rFonts w:ascii="標楷體" w:eastAsia="標楷體" w:hAnsi="標楷體" w:hint="eastAsia"/>
+                <w:sz w:val="18"/>
+                <w:szCs w:val="18"/>
+              </w:rPr>
+              <w:t>此項需求請直接將維護單遞交資訊室系統管理人</w:t>
+            </w:r>
+          </w:p>
+          <w:p>
+            <w:pPr>
+              <w:ind w:left="200" w:hangingChars="100" w:hanging="200"/>
+              <w:rPr>
+                <w:rFonts w:ascii="標楷體" w:eastAsia="標楷體" w:hAnsi="標楷體"/>
+                <w:sz w:val="20"/>
+              </w:rPr>
+            </w:pPr>
+            <w:r>
+              <w:rPr>
+                <w:rFonts w:ascii="標楷體" w:eastAsia="標楷體" w:hAnsi="標楷體" w:hint="eastAsia"/>
+                <w:sz w:val="20"/>
+              </w:rPr>
+              <w:t>□系統</w:t>
+            </w:r>
+            <w:r>
+              <w:rPr>
+                <w:rFonts w:ascii="標楷體" w:eastAsia="標楷體" w:hAnsi="標楷體" w:hint="eastAsia"/>
+                <w:sz w:val="20"/>
+              </w:rPr>
+              <w:t>程</w:t>
+            </w:r>
+            <w:r>
+              <w:rPr>
+                <w:rFonts w:ascii="標楷體" w:eastAsia="標楷體" w:hAnsi="標楷體"/>
+                <w:sz w:val="20"/>
+              </w:rPr>
+              <w:t>式</w:t>
+            </w:r>
+            <w:r>
+              <w:rPr>
+                <w:rFonts w:ascii="標楷體" w:eastAsia="標楷體" w:hAnsi="標楷體" w:hint="eastAsia"/>
+                <w:sz w:val="20"/>
+              </w:rPr>
+              <w:t>錯誤維護(</w:t>
+            </w:r>
+            <w:r>
+              <w:rPr>
+                <w:rFonts w:eastAsia="標楷體" w:hint="eastAsia"/>
+                <w:sz w:val="20"/>
+              </w:rPr>
+              <w:t>未出現錯誤訊息視窗</w:t>
+            </w:r>
+            <w:r>
+              <w:rPr>
+                <w:rFonts w:eastAsia="標楷體" w:hint="eastAsia"/>
+                <w:sz w:val="20"/>
+              </w:rPr>
+              <w:t>)</w:t>
+            </w:r>
+          </w:p>
+          <w:p>
+            <w:pPr>
+              <w:tabs>
+                <w:tab w:val="left" w:pos="1132"/>
+              </w:tabs>
+              <w:ind w:left="1000" w:hangingChars="500" w:hanging="1000"/>
+              <w:rPr>
+                <w:rFonts w:ascii="標楷體" w:eastAsia="標楷體" w:hAnsi="標楷體"/>
+                <w:sz w:val="20"/>
+              </w:rPr>
+            </w:pPr>
+            <w:r>
+              <w:rPr>
+                <w:rFonts w:ascii="標楷體" w:eastAsia="標楷體" w:hAnsi="標楷體" w:hint="eastAsia"/>
+                <w:sz w:val="20"/>
+              </w:rPr>
+              <w:t>■機敏資料庫使用(倉儲資料下載，僅限一次性擷取使用) ─核可案之申請資料經加密/去</w:t>
+            </w:r>
+            <w:r>
+              <w:rPr>
+                <w:rFonts w:ascii="標楷體" w:eastAsia="標楷體" w:hAnsi="標楷體"/>
+                <w:sz w:val="20"/>
+              </w:rPr>
+              <w:t>識別</w:t>
+            </w:r>
+            <w:r>
+              <w:rPr>
+                <w:rFonts w:ascii="標楷體" w:eastAsia="標楷體" w:hAnsi="標楷體" w:hint="eastAsia"/>
+                <w:sz w:val="20"/>
+              </w:rPr>
+              <w:t>化等前置處理</w:t>
+            </w:r>
+          </w:p>
+          <w:p>
+            <w:pPr>
+              <w:tabs>
+                <w:tab w:val="left" w:pos="1132"/>
+              </w:tabs>
+              <w:ind w:firstLineChars="100" w:firstLine="200"/>
+              <w:rPr>
+                <w:rFonts w:ascii="標楷體" w:eastAsia="標楷體" w:hAnsi="標楷體"/>
+                <w:sz w:val="20"/>
+              </w:rPr>
+            </w:pPr>
+            <w:r>
+              <w:rPr>
+                <w:rFonts w:ascii="標楷體" w:eastAsia="標楷體" w:hAnsi="標楷體" w:hint="eastAsia"/>
+                <w:sz w:val="20"/>
+              </w:rPr>
+              <w:t>後，僅放置於獨立作業區供申請者使用，並</w:t>
+            </w:r>
+            <w:r>
+              <w:rPr>
+                <w:rFonts w:ascii="標楷體" w:eastAsia="標楷體" w:hAnsi="標楷體"/>
+                <w:sz w:val="20"/>
+              </w:rPr>
+              <w:t>僅限</w:t>
+            </w:r>
+            <w:r>
+              <w:rPr>
+                <w:rFonts w:ascii="標楷體" w:eastAsia="標楷體" w:hAnsi="標楷體" w:hint="eastAsia"/>
+                <w:sz w:val="20"/>
+              </w:rPr>
+              <w:t>攜出</w:t>
+            </w:r>
+            <w:r>
+              <w:rPr>
+                <w:rFonts w:ascii="標楷體" w:eastAsia="標楷體" w:hAnsi="標楷體"/>
+                <w:sz w:val="20"/>
+              </w:rPr>
+              <w:t>統計</w:t>
+            </w:r>
+            <w:r>
+              <w:rPr>
+                <w:rFonts w:ascii="標楷體" w:eastAsia="標楷體" w:hAnsi="標楷體" w:hint="eastAsia"/>
+                <w:sz w:val="20"/>
+              </w:rPr>
+              <w:t>分</w:t>
+            </w:r>
+            <w:r>
+              <w:rPr>
+                <w:rFonts w:ascii="標楷體" w:eastAsia="標楷體" w:hAnsi="標楷體"/>
+                <w:sz w:val="20"/>
+              </w:rPr>
+              <w:t>析結</w:t>
+            </w:r>
+            <w:r>
+              <w:rPr>
+                <w:rFonts w:ascii="標楷體" w:eastAsia="標楷體" w:hAnsi="標楷體" w:hint="eastAsia"/>
+                <w:sz w:val="20"/>
+              </w:rPr>
+              <w:t>果。</w:t>
+            </w:r>
+          </w:p>
+          <w:p>
+            <w:pPr>
+              <w:tabs>
+                <w:tab w:val="left" w:pos="1132"/>
+              </w:tabs>
+              <w:ind w:left="1000" w:hangingChars="500" w:hanging="1000"/>
+              <w:rPr>
+                <w:rFonts w:ascii="標楷體" w:eastAsia="標楷體" w:hAnsi="標楷體"/>
+                <w:sz w:val="20"/>
+              </w:rPr>
+            </w:pPr>
+            <w:r>
+              <w:rPr>
+                <w:rFonts w:ascii="標楷體" w:eastAsia="標楷體" w:hAnsi="標楷體" w:hint="eastAsia"/>
+                <w:sz w:val="20"/>
+              </w:rPr>
+              <w:t>□配合資料庫移轉(僅適用相同作業系統及相同版本資料庫，資料庫升版或降版非維護範疇)</w:t>
+            </w:r>
+          </w:p>
+          <w:p>
+            <w:pPr>
+              <w:tabs>
+                <w:tab w:val="left" w:pos="1132"/>
+              </w:tabs>
+              <w:ind w:firstLineChars="100" w:firstLine="200"/>
+              <w:rPr>
+                <w:rFonts w:ascii="標楷體" w:eastAsia="標楷體" w:hAnsi="標楷體"/>
+                <w:b/>
+                <w:sz w:val="20"/>
+              </w:rPr>
+            </w:pPr>
+            <w:r>
+              <w:rPr>
+                <w:rFonts w:ascii="標楷體" w:eastAsia="標楷體" w:hAnsi="標楷體" w:hint="eastAsia"/>
+                <w:b/>
+                <w:sz w:val="20"/>
+              </w:rPr>
+              <w:t>※系統功能新增/修改請改填寫「應用系統變更單」</w:t>
+            </w:r>
+          </w:p>
+        </w:tc>
+      </w:tr>
+      <w:tr>
+        <w:trPr>
+          <w:cantSplit/>
+          <w:trHeight w:val="1667"/>
+        </w:trPr>
+        <w:tc>
+          <w:tcPr>
+            <w:tcW w:w="248" w:type="pct"/>
+            <w:vMerge/>
+            <w:vAlign w:val="center"/>
+          </w:tcPr>
+          <w:p>
+            <w:pPr>
+              <w:jc w:val="center"/>
+              <w:rPr>
+                <w:rFonts w:ascii="標楷體" w:eastAsia="標楷體" w:hAnsi="標楷體"/>
+                <w:szCs w:val="24"/>
+              </w:rPr>
+            </w:pPr>
+          </w:p>
+        </w:tc>
+        <w:tc>
+          <w:tcPr>
+            <w:tcW w:w="302" w:type="pct"/>
+            <w:textDirection w:val="tbRlV"/>
+            <w:vAlign w:val="center"/>
+          </w:tcPr>
+          <w:p>
+            <w:pPr>
+              <w:ind w:left="113" w:right="113"/>
+              <w:jc w:val="center"/>
+              <w:rPr>
+                <w:rFonts w:ascii="標楷體" w:eastAsia="標楷體" w:hAnsi="標楷體"/>
+                <w:sz w:val="22"/>
+                <w:szCs w:val="22"/>
+              </w:rPr>
+            </w:pPr>
+            <w:r>
+              <w:rPr>
+                <w:rFonts w:ascii="標楷體" w:eastAsia="標楷體" w:hAnsi="標楷體" w:hint="eastAsia"/>
+                <w:sz w:val="22"/>
+                <w:szCs w:val="22"/>
+              </w:rPr>
+              <w:t>需求內容描述</w:t>
+            </w:r>
+          </w:p>
+        </w:tc>
+        <w:tc>
+          <w:tcPr>
+            <w:tcW w:w="4450" w:type="pct"/>
+            <w:gridSpan w:val="4"/>
+          </w:tcPr>
+          <w:p>
+            <w:pPr>
+              <w:rPr>
+                <w:rFonts w:ascii="標楷體" w:eastAsia="標楷體" w:hAnsi="標楷體"/>
+                <w:sz w:val="22"/>
+                <w:szCs w:val="22"/>
+              </w:rPr>
+            </w:pPr>
+            <w:r>
+              <w:rPr>
+                <w:rFonts w:ascii="標楷體" w:eastAsia="標楷體" w:hAnsi="標楷體" w:hint="eastAsia"/>
+                <w:sz w:val="22"/>
+                <w:szCs w:val="22"/>
+              </w:rPr>
+              <w:t xml:space="preserve">{doc11_request_desc}</w:t>
+            </w:r>
+          </w:p>
+          <w:p>
+            <w:pPr>
+              <w:rPr>
+                <w:rFonts w:ascii="標楷體" w:eastAsia="標楷體" w:hAnsi="標楷體"/>
+                <w:sz w:val="20"/>
+              </w:rPr>
+            </w:pPr>
+          </w:p>
+          <w:p>
+            <w:pPr>
+              <w:rPr>
+                <w:rFonts w:ascii="標楷體" w:eastAsia="標楷體" w:hAnsi="標楷體"/>
+                <w:sz w:val="20"/>
+              </w:rPr>
+            </w:pPr>
+          </w:p>
+          <w:p>
+            <w:pPr>
+              <w:rPr>
+                <w:rFonts w:ascii="標楷體" w:eastAsia="標楷體" w:hAnsi="標楷體"/>
+                <w:sz w:val="22"/>
+                <w:szCs w:val="22"/>
+              </w:rPr>
+            </w:pPr>
+          </w:p>
+        </w:tc>
+      </w:tr>
+      <w:tr>
+        <w:trPr>
+          <w:trHeight w:val="567"/>
+        </w:trPr>
+        <w:tc>
+          <w:tcPr>
+            <w:tcW w:w="248" w:type="pct"/>
+            <w:vMerge/>
+            <w:vAlign w:val="center"/>
+          </w:tcPr>
+          <w:p>
+            <w:pPr>
+              <w:jc w:val="center"/>
+              <w:rPr>
+                <w:rFonts w:ascii="標楷體" w:eastAsia="標楷體" w:hAnsi="標楷體"/>
+                <w:szCs w:val="24"/>
+              </w:rPr>
+            </w:pPr>
+          </w:p>
+        </w:tc>
+        <w:tc>
+          <w:tcPr>
+            <w:tcW w:w="1093" w:type="pct"/>
+            <w:gridSpan w:val="2"/>
+            <w:vAlign w:val="center"/>
+          </w:tcPr>
+          <w:p>
+            <w:pPr>
+              <w:jc w:val="center"/>
+              <w:rPr>
+                <w:rFonts w:ascii="標楷體" w:eastAsia="標楷體" w:hAnsi="標楷體"/>
+                <w:sz w:val="22"/>
+                <w:szCs w:val="22"/>
+              </w:rPr>
+            </w:pPr>
+            <w:r>
+              <w:rPr>
+                <w:rFonts w:ascii="標楷體" w:eastAsia="標楷體" w:hAnsi="標楷體" w:hint="eastAsia"/>
+                <w:sz w:val="22"/>
+                <w:szCs w:val="22"/>
+              </w:rPr>
+              <w:t>申請單位核章</w:t>
+            </w:r>
+          </w:p>
+        </w:tc>
+        <w:tc>
+          <w:tcPr>
+            <w:tcW w:w="3659" w:type="pct"/>
+            <w:gridSpan w:val="3"/>
+          </w:tcPr>
+          <w:p>
+            <w:pPr>
+              <w:rPr>
+                <w:rFonts w:ascii="標楷體" w:eastAsia="標楷體" w:hAnsi="標楷體"/>
+                <w:sz w:val="22"/>
+                <w:szCs w:val="22"/>
+              </w:rPr>
+            </w:pPr>
+          </w:p>
+        </w:tc>
+      </w:tr>
+      <w:tr>
+        <w:trPr>
+          <w:trHeight w:val="415"/>
+        </w:trPr>
+        <w:tc>
+          <w:tcPr>
+            <w:tcW w:w="248" w:type="pct"/>
+            <w:vMerge w:val="restart"/>
+            <w:textDirection w:val="tbRlV"/>
+            <w:vAlign w:val="center"/>
+          </w:tcPr>
+          <w:p>
+            <w:pPr>
+              <w:ind w:left="113" w:right="113"/>
+              <w:jc w:val="center"/>
+              <w:rPr>
+                <w:rFonts w:ascii="標楷體" w:eastAsia="標楷體" w:hAnsi="標楷體"/>
+                <w:sz w:val="20"/>
+              </w:rPr>
+            </w:pPr>
+            <w:r>
+              <w:rPr>
+                <w:rFonts w:ascii="標楷體" w:eastAsia="標楷體" w:hAnsi="標楷體" w:hint="eastAsia"/>
+                <w:sz w:val="20"/>
+              </w:rPr>
+              <w:t>本欄由權責單位填寫</w:t>
+            </w:r>
+          </w:p>
+        </w:tc>
+        <w:tc>
+          <w:tcPr>
+            <w:tcW w:w="4752" w:type="pct"/>
+            <w:gridSpan w:val="5"/>
+          </w:tcPr>
+          <w:p>
+            <w:pPr>
+              <w:rPr>
+                <w:rFonts w:ascii="標楷體" w:eastAsia="標楷體" w:hAnsi="標楷體"/>
+                <w:sz w:val="22"/>
+                <w:szCs w:val="22"/>
+              </w:rPr>
+            </w:pPr>
+            <w:r>
+              <w:rPr>
+                <w:rFonts w:ascii="標楷體" w:eastAsia="標楷體" w:hAnsi="標楷體" w:hint="eastAsia"/>
+                <w:sz w:val="22"/>
+                <w:szCs w:val="22"/>
+              </w:rPr>
+              <w:t>□</w:t>
+            </w:r>
+            <w:r>
+              <w:rPr>
+                <w:rFonts w:ascii="標楷體" w:eastAsia="標楷體" w:hAnsi="標楷體" w:hint="eastAsia"/>
+                <w:sz w:val="22"/>
+                <w:szCs w:val="22"/>
+              </w:rPr>
+              <w:t>業</w:t>
+            </w:r>
+            <w:r>
+              <w:rPr>
+                <w:rFonts w:ascii="標楷體" w:eastAsia="標楷體" w:hAnsi="標楷體"/>
+                <w:sz w:val="22"/>
+                <w:szCs w:val="22"/>
+              </w:rPr>
+              <w:t>務權責</w:t>
+            </w:r>
+            <w:r>
+              <w:rPr>
+                <w:rFonts w:ascii="標楷體" w:eastAsia="標楷體" w:hAnsi="標楷體" w:hint="eastAsia"/>
+                <w:sz w:val="22"/>
+                <w:szCs w:val="22"/>
+              </w:rPr>
+              <w:t>單位</w:t>
+            </w:r>
+            <w:r>
+              <w:rPr>
+                <w:rFonts w:ascii="標楷體" w:eastAsia="標楷體" w:hAnsi="標楷體" w:hint="eastAsia"/>
+                <w:sz w:val="22"/>
+                <w:szCs w:val="22"/>
+              </w:rPr>
+              <w:t>同申請單位者，</w:t>
+            </w:r>
+            <w:r>
+              <w:rPr>
+                <w:rFonts w:ascii="標楷體" w:eastAsia="標楷體" w:hAnsi="標楷體" w:hint="eastAsia"/>
+                <w:sz w:val="22"/>
+                <w:szCs w:val="22"/>
+              </w:rPr>
+              <w:t>業</w:t>
+            </w:r>
+            <w:r>
+              <w:rPr>
+                <w:rFonts w:ascii="標楷體" w:eastAsia="標楷體" w:hAnsi="標楷體"/>
+                <w:sz w:val="22"/>
+                <w:szCs w:val="22"/>
+              </w:rPr>
+              <w:t>務權責</w:t>
+            </w:r>
+            <w:r>
+              <w:rPr>
+                <w:rFonts w:ascii="標楷體" w:eastAsia="標楷體" w:hAnsi="標楷體" w:hint="eastAsia"/>
+                <w:sz w:val="22"/>
+                <w:szCs w:val="22"/>
+              </w:rPr>
+              <w:t>單位</w:t>
+            </w:r>
+            <w:r>
+              <w:rPr>
+                <w:rFonts w:ascii="標楷體" w:eastAsia="標楷體" w:hAnsi="標楷體" w:hint="eastAsia"/>
+                <w:sz w:val="22"/>
+                <w:szCs w:val="22"/>
+              </w:rPr>
+              <w:t>可免填寫免核章</w:t>
+            </w:r>
+          </w:p>
+        </w:tc>
+      </w:tr>
+      <w:tr>
+        <w:trPr>
+          <w:trHeight w:val="733"/>
+        </w:trPr>
+        <w:tc>
+          <w:tcPr>
+            <w:tcW w:w="248" w:type="pct"/>
+            <w:vMerge/>
+            <w:vAlign w:val="center"/>
+          </w:tcPr>
+          <w:p>
+            <w:pPr>
+              <w:jc w:val="center"/>
+              <w:rPr>
+                <w:rFonts w:ascii="標楷體" w:eastAsia="標楷體" w:hAnsi="標楷體"/>
+                <w:szCs w:val="24"/>
+              </w:rPr>
+            </w:pPr>
+          </w:p>
+        </w:tc>
+        <w:tc>
+          <w:tcPr>
+            <w:tcW w:w="1093" w:type="pct"/>
+            <w:gridSpan w:val="2"/>
+            <w:vMerge w:val="restart"/>
+            <w:vAlign w:val="center"/>
+          </w:tcPr>
+          <w:p>
+            <w:pPr>
+              <w:jc w:val="center"/>
+              <w:rPr>
+                <w:rFonts w:ascii="標楷體" w:eastAsia="標楷體" w:hAnsi="標楷體"/>
+                <w:sz w:val="22"/>
+                <w:szCs w:val="22"/>
+              </w:rPr>
+            </w:pPr>
+            <w:r>
+              <w:rPr>
+                <w:rFonts w:ascii="標楷體" w:eastAsia="標楷體" w:hAnsi="標楷體" w:hint="eastAsia"/>
+                <w:sz w:val="22"/>
+                <w:szCs w:val="22"/>
+              </w:rPr>
+              <w:t>業</w:t>
+            </w:r>
+            <w:r>
+              <w:rPr>
+                <w:rFonts w:ascii="標楷體" w:eastAsia="標楷體" w:hAnsi="標楷體"/>
+                <w:sz w:val="22"/>
+                <w:szCs w:val="22"/>
+              </w:rPr>
+              <w:t>務權責</w:t>
+            </w:r>
+            <w:r>
+              <w:rPr>
+                <w:rFonts w:ascii="標楷體" w:eastAsia="標楷體" w:hAnsi="標楷體" w:hint="eastAsia"/>
+                <w:sz w:val="22"/>
+                <w:szCs w:val="22"/>
+              </w:rPr>
+              <w:t>單位</w:t>
+            </w:r>
+          </w:p>
+          <w:p>
+            <w:pPr>
+              <w:jc w:val="center"/>
+              <w:rPr>
+                <w:rFonts w:ascii="標楷體" w:eastAsia="標楷體" w:hAnsi="標楷體"/>
+                <w:sz w:val="22"/>
+                <w:szCs w:val="22"/>
+              </w:rPr>
+            </w:pPr>
+          </w:p>
+          <w:p>
+            <w:pPr>
+              <w:jc w:val="center"/>
+              <w:rPr>
+                <w:rFonts w:ascii="標楷體" w:eastAsia="標楷體" w:hAnsi="標楷體"/>
+                <w:sz w:val="22"/>
+                <w:szCs w:val="22"/>
+              </w:rPr>
+            </w:pPr>
+            <w:r>
+              <w:rPr>
+                <w:rFonts w:ascii="標楷體" w:eastAsia="標楷體" w:hAnsi="標楷體" w:hint="eastAsia"/>
+                <w:sz w:val="22"/>
+                <w:szCs w:val="22"/>
+              </w:rPr>
+              <w:t>______________</w:t>
+            </w:r>
+          </w:p>
+        </w:tc>
+        <w:tc>
+          <w:tcPr>
+            <w:tcW w:w="515" w:type="pct"/>
+            <w:vAlign w:val="center"/>
+          </w:tcPr>
+          <w:p>
+            <w:pPr>
+              <w:jc w:val="center"/>
+              <w:rPr>
+                <w:rFonts w:ascii="標楷體" w:eastAsia="標楷體" w:hAnsi="標楷體"/>
+                <w:sz w:val="20"/>
+              </w:rPr>
+            </w:pPr>
+            <w:r>
+              <w:rPr>
+                <w:rFonts w:ascii="標楷體" w:eastAsia="標楷體" w:hAnsi="標楷體" w:hint="eastAsia"/>
+                <w:sz w:val="22"/>
+                <w:szCs w:val="22"/>
+              </w:rPr>
+              <w:t>審查意見</w:t>
+            </w:r>
+          </w:p>
+        </w:tc>
+        <w:tc>
+          <w:tcPr>
+            <w:tcW w:w="3144" w:type="pct"/>
+            <w:gridSpan w:val="2"/>
+          </w:tcPr>
+          <w:p>
+            <w:pPr>
+              <w:widowControl/>
+              <w:rPr>
+                <w:rFonts w:ascii="標楷體" w:eastAsia="標楷體" w:hAnsi="標楷體"/>
+                <w:sz w:val="20"/>
+              </w:rPr>
+            </w:pPr>
+          </w:p>
+          <w:p>
+            <w:pPr>
+              <w:widowControl/>
+              <w:rPr>
+                <w:rFonts w:ascii="標楷體" w:eastAsia="標楷體" w:hAnsi="標楷體"/>
+                <w:sz w:val="20"/>
+              </w:rPr>
+            </w:pPr>
+          </w:p>
+          <w:p>
+            <w:pPr>
+              <w:rPr>
+                <w:rFonts w:ascii="標楷體" w:eastAsia="標楷體" w:hAnsi="標楷體"/>
+                <w:sz w:val="20"/>
+              </w:rPr>
+            </w:pPr>
+            <w:r>
+              <w:rPr>
+                <w:rFonts w:ascii="標楷體" w:eastAsia="標楷體" w:hAnsi="標楷體" w:hint="eastAsia"/>
+                <w:sz w:val="20"/>
+              </w:rPr>
+              <w:t>是否同意需求內容：□同意 □不同意</w:t>
+            </w:r>
+          </w:p>
+        </w:tc>
+      </w:tr>
+      <w:tr>
+        <w:trPr>
+          <w:trHeight w:val="659"/>
+        </w:trPr>
+        <w:tc>
+          <w:tcPr>
+            <w:tcW w:w="248" w:type="pct"/>
+            <w:vMerge/>
+            <w:vAlign w:val="center"/>
+          </w:tcPr>
+          <w:p>
+            <w:pPr>
+              <w:jc w:val="center"/>
+              <w:rPr>
+                <w:rFonts w:ascii="標楷體" w:eastAsia="標楷體" w:hAnsi="標楷體"/>
+                <w:szCs w:val="24"/>
+              </w:rPr>
+            </w:pPr>
+          </w:p>
+        </w:tc>
+        <w:tc>
+          <w:tcPr>
+            <w:tcW w:w="1093" w:type="pct"/>
+            <w:gridSpan w:val="2"/>
+            <w:vMerge/>
+            <w:vAlign w:val="center"/>
+          </w:tcPr>
+          <w:p>
+            <w:pPr>
+              <w:jc w:val="center"/>
+              <w:rPr>
+                <w:rFonts w:ascii="標楷體" w:eastAsia="標楷體" w:hAnsi="標楷體"/>
+                <w:sz w:val="22"/>
+                <w:szCs w:val="22"/>
+              </w:rPr>
+            </w:pPr>
+          </w:p>
+        </w:tc>
+        <w:tc>
+          <w:tcPr>
+            <w:tcW w:w="515" w:type="pct"/>
+            <w:vAlign w:val="center"/>
+          </w:tcPr>
+          <w:p>
+            <w:pPr>
+              <w:jc w:val="center"/>
+              <w:rPr>
+                <w:rFonts w:ascii="標楷體" w:eastAsia="標楷體" w:hAnsi="標楷體"/>
+                <w:sz w:val="22"/>
+                <w:szCs w:val="22"/>
+              </w:rPr>
+            </w:pPr>
+            <w:r>
+              <w:rPr>
+                <w:rFonts w:ascii="標楷體" w:eastAsia="標楷體" w:hAnsi="標楷體" w:hint="eastAsia"/>
+                <w:sz w:val="22"/>
+                <w:szCs w:val="22"/>
+              </w:rPr>
+              <w:t>核  章</w:t>
+            </w:r>
+          </w:p>
+        </w:tc>
+        <w:tc>
+          <w:tcPr>
+            <w:tcW w:w="3144" w:type="pct"/>
+            <w:gridSpan w:val="2"/>
+          </w:tcPr>
+          <w:p>
+            <w:pPr>
+              <w:rPr>
+                <w:rFonts w:ascii="標楷體" w:eastAsia="標楷體" w:hAnsi="標楷體"/>
+                <w:sz w:val="22"/>
+                <w:szCs w:val="22"/>
+              </w:rPr>
+            </w:pPr>
+          </w:p>
+        </w:tc>
+      </w:tr>
+      <w:tr>
+        <w:trPr>
+          <w:trHeight w:val="325"/>
+        </w:trPr>
+        <w:tc>
+          <w:tcPr>
+            <w:tcW w:w="248" w:type="pct"/>
+            <w:vMerge/>
+            <w:vAlign w:val="center"/>
+          </w:tcPr>
+          <w:p>
+            <w:pPr>
+              <w:jc w:val="center"/>
+              <w:rPr>
+                <w:rFonts w:ascii="標楷體" w:eastAsia="標楷體" w:hAnsi="標楷體"/>
+                <w:szCs w:val="24"/>
+              </w:rPr>
+            </w:pPr>
+          </w:p>
+        </w:tc>
+        <w:tc>
+          <w:tcPr>
+            <w:tcW w:w="4752" w:type="pct"/>
+            <w:gridSpan w:val="5"/>
+            <w:vAlign w:val="center"/>
+          </w:tcPr>
+          <w:p>
+            <w:pPr>
+              <w:widowControl/>
+              <w:rPr>
+                <w:rFonts w:ascii="標楷體" w:eastAsia="標楷體" w:hAnsi="標楷體"/>
+                <w:sz w:val="20"/>
+              </w:rPr>
+            </w:pPr>
+            <w:r>
+              <w:rPr>
+                <w:rFonts w:ascii="標楷體" w:eastAsia="標楷體" w:hAnsi="標楷體" w:hint="eastAsia"/>
+                <w:sz w:val="22"/>
+                <w:szCs w:val="22"/>
+              </w:rPr>
+              <w:t>□系統權責單位同申請單位者，系統</w:t>
+            </w:r>
+            <w:r>
+              <w:rPr>
+                <w:rFonts w:ascii="標楷體" w:eastAsia="標楷體" w:hAnsi="標楷體"/>
+                <w:sz w:val="22"/>
+                <w:szCs w:val="22"/>
+              </w:rPr>
+              <w:t>權責</w:t>
+            </w:r>
+            <w:r>
+              <w:rPr>
+                <w:rFonts w:ascii="標楷體" w:eastAsia="標楷體" w:hAnsi="標楷體" w:hint="eastAsia"/>
+                <w:sz w:val="22"/>
+                <w:szCs w:val="22"/>
+              </w:rPr>
+              <w:t>單位可免填寫免核章</w:t>
+            </w:r>
+          </w:p>
+        </w:tc>
+      </w:tr>
+      <w:tr>
+        <w:trPr>
+          <w:trHeight w:val="733"/>
+        </w:trPr>
+        <w:tc>
+          <w:tcPr>
+            <w:tcW w:w="248" w:type="pct"/>
+            <w:vMerge/>
+            <w:vAlign w:val="center"/>
+          </w:tcPr>
+          <w:p>
+            <w:pPr>
+              <w:jc w:val="center"/>
+              <w:rPr>
+                <w:rFonts w:ascii="標楷體" w:eastAsia="標楷體" w:hAnsi="標楷體"/>
+                <w:szCs w:val="24"/>
+              </w:rPr>
+            </w:pPr>
+          </w:p>
+        </w:tc>
+        <w:tc>
+          <w:tcPr>
+            <w:tcW w:w="1093" w:type="pct"/>
+            <w:gridSpan w:val="2"/>
+            <w:vMerge w:val="restart"/>
+            <w:vAlign w:val="center"/>
+          </w:tcPr>
+          <w:p>
+            <w:pPr>
+              <w:jc w:val="center"/>
+              <w:rPr>
+                <w:rFonts w:ascii="標楷體" w:eastAsia="標楷體" w:hAnsi="標楷體"/>
+                <w:sz w:val="22"/>
+                <w:szCs w:val="22"/>
+              </w:rPr>
+            </w:pPr>
+            <w:r>
+              <w:rPr>
+                <w:rFonts w:ascii="標楷體" w:eastAsia="標楷體" w:hAnsi="標楷體" w:hint="eastAsia"/>
+                <w:sz w:val="22"/>
+                <w:szCs w:val="22"/>
+              </w:rPr>
+              <w:t>系統</w:t>
+            </w:r>
+            <w:r>
+              <w:rPr>
+                <w:rFonts w:ascii="標楷體" w:eastAsia="標楷體" w:hAnsi="標楷體"/>
+                <w:sz w:val="22"/>
+                <w:szCs w:val="22"/>
+              </w:rPr>
+              <w:t>權責</w:t>
+            </w:r>
+            <w:r>
+              <w:rPr>
+                <w:rFonts w:ascii="標楷體" w:eastAsia="標楷體" w:hAnsi="標楷體" w:hint="eastAsia"/>
+                <w:sz w:val="22"/>
+                <w:szCs w:val="22"/>
+              </w:rPr>
+              <w:t>單位</w:t>
+            </w:r>
+          </w:p>
+        </w:tc>
+        <w:tc>
+          <w:tcPr>
+            <w:tcW w:w="515" w:type="pct"/>
+            <w:vAlign w:val="center"/>
+          </w:tcPr>
+          <w:p>
+            <w:pPr>
+              <w:jc w:val="center"/>
+              <w:rPr>
+                <w:rFonts w:ascii="標楷體" w:eastAsia="標楷體" w:hAnsi="標楷體"/>
+                <w:sz w:val="20"/>
+              </w:rPr>
+            </w:pPr>
+            <w:r>
+              <w:rPr>
+                <w:rFonts w:ascii="標楷體" w:eastAsia="標楷體" w:hAnsi="標楷體" w:hint="eastAsia"/>
+                <w:sz w:val="22"/>
+                <w:szCs w:val="22"/>
+              </w:rPr>
+              <w:t>審查意見</w:t>
+            </w:r>
+          </w:p>
+        </w:tc>
+        <w:tc>
+          <w:tcPr>
+            <w:tcW w:w="3144" w:type="pct"/>
+            <w:gridSpan w:val="2"/>
+          </w:tcPr>
+          <w:p>
+            <w:pPr>
+              <w:widowControl/>
+              <w:rPr>
+                <w:rFonts w:ascii="標楷體" w:eastAsia="標楷體" w:hAnsi="標楷體"/>
+                <w:sz w:val="20"/>
+              </w:rPr>
+            </w:pPr>
+          </w:p>
+          <w:p>
+            <w:pPr>
+              <w:widowControl/>
+              <w:rPr>
+                <w:rFonts w:ascii="標楷體" w:eastAsia="標楷體" w:hAnsi="標楷體"/>
+                <w:sz w:val="20"/>
+              </w:rPr>
+            </w:pPr>
+          </w:p>
+          <w:p>
+            <w:pPr>
+              <w:rPr>
+                <w:rFonts w:ascii="標楷體" w:eastAsia="標楷體" w:hAnsi="標楷體"/>
+                <w:sz w:val="20"/>
+              </w:rPr>
+            </w:pPr>
+            <w:r>
+              <w:rPr>
+                <w:rFonts w:ascii="標楷體" w:eastAsia="標楷體" w:hAnsi="標楷體" w:hint="eastAsia"/>
+                <w:sz w:val="20"/>
+              </w:rPr>
+              <w:t>是否同意進行維護：□同意 □不同意</w:t>
+            </w:r>
+          </w:p>
+        </w:tc>
+      </w:tr>
+      <w:tr>
+        <w:trPr>
+          <w:trHeight w:val="565"/>
+        </w:trPr>
+        <w:tc>
+          <w:tcPr>
+            <w:tcW w:w="248" w:type="pct"/>
+            <w:vMerge/>
+            <w:vAlign w:val="center"/>
+          </w:tcPr>
+          <w:p>
+            <w:pPr>
+              <w:jc w:val="center"/>
+              <w:rPr>
+                <w:rFonts w:ascii="標楷體" w:eastAsia="標楷體" w:hAnsi="標楷體"/>
+                <w:szCs w:val="24"/>
+              </w:rPr>
+            </w:pPr>
+          </w:p>
+        </w:tc>
+        <w:tc>
+          <w:tcPr>
+            <w:tcW w:w="1093" w:type="pct"/>
+            <w:gridSpan w:val="2"/>
+            <w:vMerge/>
+          </w:tcPr>
+          <w:p>
+            <w:pPr>
+              <w:jc w:val="center"/>
+              <w:rPr>
+                <w:rFonts w:ascii="標楷體" w:eastAsia="標楷體" w:hAnsi="標楷體"/>
+                <w:sz w:val="22"/>
+                <w:szCs w:val="22"/>
+              </w:rPr>
+            </w:pPr>
+          </w:p>
+        </w:tc>
+        <w:tc>
+          <w:tcPr>
+            <w:tcW w:w="515" w:type="pct"/>
+            <w:vAlign w:val="center"/>
+          </w:tcPr>
+          <w:p>
+            <w:pPr>
+              <w:jc w:val="center"/>
+              <w:rPr>
+                <w:rFonts w:ascii="標楷體" w:eastAsia="標楷體" w:hAnsi="標楷體"/>
+                <w:sz w:val="20"/>
+              </w:rPr>
+            </w:pPr>
+            <w:r>
+              <w:rPr>
+                <w:rFonts w:ascii="標楷體" w:eastAsia="標楷體" w:hAnsi="標楷體" w:hint="eastAsia"/>
+                <w:sz w:val="22"/>
+                <w:szCs w:val="22"/>
+              </w:rPr>
+              <w:t>核  章</w:t>
+            </w:r>
+          </w:p>
+        </w:tc>
+        <w:tc>
+          <w:tcPr>
+            <w:tcW w:w="3144" w:type="pct"/>
+            <w:gridSpan w:val="2"/>
+          </w:tcPr>
+          <w:p>
+            <w:pPr>
+              <w:widowControl/>
+              <w:rPr>
+                <w:rFonts w:ascii="標楷體" w:eastAsia="標楷體" w:hAnsi="標楷體"/>
+                <w:sz w:val="20"/>
+              </w:rPr>
+            </w:pPr>
+          </w:p>
+          <w:p>
+            <w:pPr>
+              <w:rPr>
+                <w:rFonts w:ascii="標楷體" w:eastAsia="標楷體" w:hAnsi="標楷體"/>
+                <w:sz w:val="20"/>
+              </w:rPr>
+            </w:pPr>
+          </w:p>
+        </w:tc>
+      </w:tr>
+      <w:tr>
+        <w:trPr>
+          <w:trHeight w:val="397"/>
+        </w:trPr>
+        <w:tc>
+          <w:tcPr>
+            <w:tcW w:w="248" w:type="pct"/>
+            <w:vMerge w:val="restart"/>
+            <w:textDirection w:val="tbRlV"/>
+            <w:vAlign w:val="center"/>
+          </w:tcPr>
+          <w:p>
+            <w:pPr>
+              <w:ind w:left="113" w:right="113"/>
+              <w:jc w:val="center"/>
+              <w:rPr>
+                <w:rFonts w:ascii="標楷體" w:eastAsia="標楷體" w:hAnsi="標楷體"/>
+                <w:sz w:val="20"/>
+              </w:rPr>
+            </w:pPr>
+            <w:r>
+              <w:rPr>
+                <w:rFonts w:ascii="標楷體" w:eastAsia="標楷體" w:hAnsi="標楷體" w:hint="eastAsia"/>
+                <w:sz w:val="20"/>
+              </w:rPr>
+              <w:t>本欄由資訊室填寫</w:t>
+            </w:r>
+          </w:p>
+        </w:tc>
+        <w:tc>
+          <w:tcPr>
+            <w:tcW w:w="4752" w:type="pct"/>
+            <w:gridSpan w:val="5"/>
+            <w:vAlign w:val="center"/>
+          </w:tcPr>
+          <w:p>
+            <w:pPr>
+              <w:jc w:val="both"/>
+              <w:rPr>
+                <w:rFonts w:ascii="標楷體" w:eastAsia="標楷體" w:hAnsi="標楷體"/>
+                <w:szCs w:val="24"/>
+              </w:rPr>
+            </w:pPr>
+            <w:r>
+              <w:rPr>
+                <w:rFonts w:ascii="標楷體" w:eastAsia="標楷體" w:hAnsi="標楷體" w:hint="eastAsia"/>
+                <w:szCs w:val="24"/>
+              </w:rPr>
+              <w:t>資訊室收件時間：</w:t>
+            </w:r>
+          </w:p>
+        </w:tc>
+      </w:tr>
+      <w:tr>
+        <w:trPr>
+          <w:cantSplit/>
+          <w:trHeight w:val="285"/>
+        </w:trPr>
+        <w:tc>
+          <w:tcPr>
+            <w:tcW w:w="248" w:type="pct"/>
+            <w:vMerge/>
+            <w:vAlign w:val="center"/>
+          </w:tcPr>
+          <w:p>
+            <w:pPr>
+              <w:jc w:val="center"/>
+              <w:rPr>
+                <w:rFonts w:ascii="標楷體" w:eastAsia="標楷體" w:hAnsi="標楷體"/>
+                <w:szCs w:val="24"/>
+              </w:rPr>
+            </w:pPr>
+          </w:p>
+        </w:tc>
+        <w:tc>
+          <w:tcPr>
+            <w:tcW w:w="302" w:type="pct"/>
+            <w:vMerge w:val="restart"/>
+            <w:textDirection w:val="tbRlV"/>
+            <w:vAlign w:val="center"/>
+          </w:tcPr>
+          <w:p>
+            <w:pPr>
+              <w:ind w:left="113" w:right="113"/>
+              <w:jc w:val="center"/>
+              <w:rPr>
+                <w:rFonts w:ascii="標楷體" w:eastAsia="標楷體" w:hAnsi="標楷體"/>
+                <w:sz w:val="22"/>
+                <w:szCs w:val="22"/>
+              </w:rPr>
+            </w:pPr>
+            <w:r>
+              <w:rPr>
+                <w:rFonts w:ascii="標楷體" w:eastAsia="標楷體" w:hAnsi="標楷體" w:hint="eastAsia"/>
+                <w:sz w:val="22"/>
+                <w:szCs w:val="22"/>
+              </w:rPr>
+              <w:t>審查意見</w:t>
+            </w:r>
+          </w:p>
+        </w:tc>
+        <w:tc>
+          <w:tcPr>
+            <w:tcW w:w="4450" w:type="pct"/>
+            <w:gridSpan w:val="4"/>
+            <w:vAlign w:val="center"/>
+          </w:tcPr>
+          <w:p>
+            <w:pPr>
+              <w:jc w:val="both"/>
+              <w:rPr>
+                <w:rFonts w:ascii="標楷體" w:eastAsia="標楷體" w:hAnsi="標楷體"/>
+                <w:sz w:val="22"/>
+                <w:szCs w:val="22"/>
+              </w:rPr>
+            </w:pPr>
+            <w:r>
+              <w:rPr>
+                <w:rFonts w:ascii="標楷體" w:eastAsia="標楷體" w:hAnsi="標楷體" w:hint="eastAsia"/>
+                <w:sz w:val="22"/>
+                <w:szCs w:val="22"/>
+              </w:rPr>
+              <w:t>(系統承辦人填)</w:t>
+            </w:r>
+          </w:p>
+        </w:tc>
+      </w:tr>
+      <w:tr>
+        <w:trPr>
+          <w:cantSplit/>
+          <w:trHeight w:val="582"/>
+        </w:trPr>
+        <w:tc>
+          <w:tcPr>
+            <w:tcW w:w="248" w:type="pct"/>
+            <w:vMerge/>
+            <w:vAlign w:val="center"/>
+          </w:tcPr>
+          <w:p>
+            <w:pPr>
+              <w:jc w:val="center"/>
+              <w:rPr>
+                <w:rFonts w:ascii="標楷體" w:eastAsia="標楷體" w:hAnsi="標楷體"/>
+                <w:szCs w:val="24"/>
+              </w:rPr>
+            </w:pPr>
+          </w:p>
+        </w:tc>
+        <w:tc>
+          <w:tcPr>
+            <w:tcW w:w="302" w:type="pct"/>
+            <w:vMerge/>
+            <w:textDirection w:val="tbRlV"/>
+            <w:vAlign w:val="center"/>
+          </w:tcPr>
+          <w:p>
+            <w:pPr>
+              <w:ind w:left="113" w:right="113"/>
+              <w:jc w:val="center"/>
+              <w:rPr>
+                <w:rFonts w:ascii="標楷體" w:eastAsia="標楷體" w:hAnsi="標楷體"/>
+                <w:sz w:val="22"/>
+                <w:szCs w:val="22"/>
+              </w:rPr>
+            </w:pPr>
+          </w:p>
+        </w:tc>
+        <w:tc>
+          <w:tcPr>
+            <w:tcW w:w="4450" w:type="pct"/>
+            <w:gridSpan w:val="4"/>
+            <w:vAlign w:val="center"/>
+          </w:tcPr>
+          <w:p>
+            <w:pPr>
+              <w:jc w:val="both"/>
+              <w:rPr>
+                <w:rFonts w:ascii="標楷體" w:eastAsia="標楷體" w:hAnsi="標楷體"/>
+                <w:color w:val="0000FF"/>
+                <w:sz w:val="22"/>
+                <w:szCs w:val="22"/>
+                <w:u w:val="single"/>
+              </w:rPr>
+            </w:pPr>
+            <w:r>
+              <w:rPr>
+                <w:rFonts w:ascii="標楷體" w:eastAsia="標楷體" w:hAnsi="標楷體" w:hint="eastAsia"/>
+                <w:color w:val="0000FF"/>
+                <w:sz w:val="22"/>
+                <w:szCs w:val="22"/>
+                <w:u w:val="single"/>
+              </w:rPr>
+              <w:t>□</w:t>
+            </w:r>
+            <w:r>
+              <w:rPr>
+                <w:rFonts w:ascii="標楷體" w:eastAsia="標楷體" w:hAnsi="標楷體" w:hint="eastAsia"/>
+                <w:color w:val="0000FF"/>
+                <w:sz w:val="22"/>
+                <w:szCs w:val="22"/>
+                <w:u w:val="single"/>
+              </w:rPr>
+              <w:t>請廠商</w:t>
+            </w:r>
+            <w:r>
+              <w:rPr>
+                <w:rFonts w:ascii="標楷體" w:eastAsia="標楷體" w:hAnsi="標楷體" w:hint="eastAsia"/>
+                <w:color w:val="0000FF"/>
+                <w:sz w:val="22"/>
+                <w:szCs w:val="22"/>
+                <w:u w:val="single"/>
+              </w:rPr>
+              <w:t>依需求辦理。</w:t>
+            </w:r>
+          </w:p>
+          <w:p>
+            <w:pPr>
+              <w:jc w:val="both"/>
+              <w:rPr>
+                <w:rFonts w:ascii="標楷體" w:eastAsia="標楷體" w:hAnsi="標楷體"/>
+                <w:color w:val="FF0000"/>
+                <w:sz w:val="22"/>
+                <w:szCs w:val="22"/>
+              </w:rPr>
+            </w:pPr>
+            <w:r>
+              <w:rPr>
+                <w:rFonts w:ascii="標楷體" w:eastAsia="標楷體" w:hAnsi="標楷體" w:hint="eastAsia"/>
+                <w:color w:val="0000FF"/>
+                <w:sz w:val="22"/>
+                <w:szCs w:val="22"/>
+                <w:u w:val="single"/>
+              </w:rPr>
+              <w:t>□其它:</w:t>
+            </w:r>
+          </w:p>
+        </w:tc>
+      </w:tr>
+      <w:tr>
+        <w:trPr>
+          <w:trHeight w:val="397"/>
+        </w:trPr>
+        <w:tc>
+          <w:tcPr>
+            <w:tcW w:w="248" w:type="pct"/>
+            <w:vMerge/>
+            <w:vAlign w:val="center"/>
+          </w:tcPr>
+          <w:p>
+            <w:pPr>
+              <w:jc w:val="center"/>
+              <w:rPr>
+                <w:rFonts w:ascii="標楷體" w:eastAsia="標楷體" w:hAnsi="標楷體"/>
+                <w:szCs w:val="24"/>
+              </w:rPr>
+            </w:pPr>
+          </w:p>
+        </w:tc>
+        <w:tc>
+          <w:tcPr>
+            <w:tcW w:w="3220" w:type="pct"/>
+            <w:gridSpan w:val="4"/>
+            <w:vAlign w:val="center"/>
+          </w:tcPr>
+          <w:p>
+            <w:pPr>
+              <w:jc w:val="both"/>
+              <w:rPr>
+                <w:rFonts w:ascii="標楷體" w:eastAsia="標楷體" w:hAnsi="標楷體"/>
+                <w:szCs w:val="24"/>
+              </w:rPr>
+            </w:pPr>
+            <w:r>
+              <w:rPr>
+                <w:rFonts w:ascii="標楷體" w:eastAsia="標楷體" w:hAnsi="標楷體" w:hint="eastAsia"/>
+                <w:szCs w:val="24"/>
+              </w:rPr>
+              <w:t>通知廠商時間：</w:t>
+            </w:r>
+          </w:p>
+        </w:tc>
+        <w:tc>
+          <w:tcPr>
+            <w:tcW w:w="1532" w:type="pct"/>
+            <w:vAlign w:val="center"/>
+          </w:tcPr>
+          <w:p>
+            <w:pPr>
+              <w:jc w:val="both"/>
+              <w:rPr>
+                <w:rFonts w:ascii="標楷體" w:eastAsia="標楷體" w:hAnsi="標楷體"/>
+                <w:szCs w:val="24"/>
+              </w:rPr>
+            </w:pPr>
+            <w:r>
+              <w:rPr>
+                <w:rFonts w:ascii="標楷體" w:eastAsia="標楷體" w:hAnsi="標楷體" w:hint="eastAsia"/>
+                <w:szCs w:val="24"/>
+              </w:rPr>
+              <w:t>廠商到場時間：</w:t>
+            </w:r>
+          </w:p>
+        </w:tc>
+      </w:tr>
+      <w:tr>
+        <w:trPr>
+          <w:cantSplit/>
+          <w:trHeight w:val="361"/>
+        </w:trPr>
+        <w:tc>
+          <w:tcPr>
+            <w:tcW w:w="248" w:type="pct"/>
+            <w:vMerge/>
+            <w:vAlign w:val="center"/>
+          </w:tcPr>
+          <w:p>
+            <w:pPr>
+              <w:jc w:val="center"/>
+              <w:rPr>
+                <w:rFonts w:ascii="標楷體" w:eastAsia="標楷體" w:hAnsi="標楷體"/>
+                <w:szCs w:val="24"/>
+              </w:rPr>
+            </w:pPr>
+          </w:p>
+        </w:tc>
+        <w:tc>
+          <w:tcPr>
+            <w:tcW w:w="302" w:type="pct"/>
+            <w:vMerge w:val="restart"/>
+            <w:textDirection w:val="tbRlV"/>
+            <w:vAlign w:val="center"/>
+          </w:tcPr>
+          <w:p>
+            <w:pPr>
+              <w:ind w:left="113" w:right="113"/>
+              <w:jc w:val="center"/>
+              <w:rPr>
+                <w:rFonts w:ascii="標楷體" w:eastAsia="標楷體" w:hAnsi="標楷體"/>
+                <w:sz w:val="22"/>
+                <w:szCs w:val="22"/>
+              </w:rPr>
+            </w:pPr>
+            <w:r>
+              <w:rPr>
+                <w:rFonts w:ascii="標楷體" w:eastAsia="標楷體" w:hAnsi="標楷體" w:hint="eastAsia"/>
+                <w:sz w:val="22"/>
+                <w:szCs w:val="22"/>
+              </w:rPr>
+              <w:t>處理情形</w:t>
+            </w:r>
+          </w:p>
+        </w:tc>
+        <w:tc>
+          <w:tcPr>
+            <w:tcW w:w="2918" w:type="pct"/>
+            <w:gridSpan w:val="3"/>
+            <w:vAlign w:val="center"/>
+          </w:tcPr>
+          <w:p>
+            <w:pPr>
+              <w:jc w:val="both"/>
+              <w:rPr>
+                <w:rFonts w:ascii="標楷體" w:eastAsia="標楷體" w:hAnsi="標楷體"/>
+                <w:sz w:val="20"/>
+              </w:rPr>
+            </w:pPr>
+            <w:r>
+              <w:rPr>
+                <w:rFonts w:ascii="標楷體" w:eastAsia="標楷體" w:hAnsi="標楷體" w:hint="eastAsia"/>
+                <w:sz w:val="20"/>
+              </w:rPr>
+              <w:t>(如有修改功能異動需檢附測試報告)</w:t>
+            </w:r>
+          </w:p>
+        </w:tc>
+        <w:tc>
+          <w:tcPr>
+            <w:tcW w:w="1532" w:type="pct"/>
+            <w:vMerge w:val="restart"/>
+          </w:tcPr>
+          <w:p>
+            <w:pPr>
+              <w:jc w:val="both"/>
+              <w:rPr>
+                <w:rFonts w:ascii="標楷體" w:eastAsia="標楷體" w:hAnsi="標楷體"/>
+                <w:sz w:val="20"/>
+              </w:rPr>
+            </w:pPr>
+            <w:r>
+              <w:rPr>
+                <w:rFonts w:ascii="標楷體" w:eastAsia="標楷體" w:hAnsi="標楷體" w:hint="eastAsia"/>
+                <w:sz w:val="20"/>
+              </w:rPr>
+              <w:t xml:space="preserve">新增程式支數：                 </w:t>
+            </w:r>
+          </w:p>
+          <w:p>
+            <w:pPr>
+              <w:jc w:val="both"/>
+              <w:rPr>
+                <w:rFonts w:ascii="標楷體" w:eastAsia="標楷體" w:hAnsi="標楷體"/>
+                <w:sz w:val="20"/>
+              </w:rPr>
+            </w:pPr>
+            <w:r>
+              <w:rPr>
+                <w:rFonts w:ascii="標楷體" w:eastAsia="標楷體" w:hAnsi="標楷體" w:hint="eastAsia"/>
+                <w:sz w:val="20"/>
+              </w:rPr>
+              <w:t xml:space="preserve">異動程式支數：                 </w:t>
+            </w:r>
+          </w:p>
+          <w:p>
+            <w:pPr>
+              <w:jc w:val="both"/>
+              <w:rPr>
+                <w:rFonts w:ascii="標楷體" w:eastAsia="標楷體" w:hAnsi="標楷體"/>
+                <w:sz w:val="20"/>
+              </w:rPr>
+            </w:pPr>
+            <w:r>
+              <w:rPr>
+                <w:rFonts w:ascii="標楷體" w:eastAsia="標楷體" w:hAnsi="標楷體" w:hint="eastAsia"/>
+                <w:sz w:val="20"/>
+              </w:rPr>
+              <w:t>實際服務工時</w:t>
+            </w:r>
+            <w:r>
+              <w:rPr>
+                <w:rFonts w:ascii="標楷體" w:eastAsia="標楷體" w:hAnsi="標楷體" w:hint="eastAsia"/>
+                <w:color w:val="FF0000"/>
+                <w:sz w:val="20"/>
+              </w:rPr>
+              <w:t>：</w:t>
+            </w:r>
+            <w:r>
+              <w:rPr>
+                <w:rFonts w:ascii="標楷體" w:eastAsia="標楷體" w:hAnsi="標楷體" w:hint="eastAsia"/>
+                <w:sz w:val="20"/>
+              </w:rPr>
+              <w:t>__________________</w:t>
+            </w:r>
+          </w:p>
+          <w:p>
+            <w:pPr>
+              <w:jc w:val="both"/>
+              <w:rPr>
+                <w:rFonts w:ascii="標楷體" w:eastAsia="標楷體" w:hAnsi="標楷體"/>
+                <w:sz w:val="20"/>
+              </w:rPr>
+            </w:pPr>
+            <w:r>
+              <w:rPr>
+                <w:rFonts w:ascii="標楷體" w:eastAsia="標楷體" w:hAnsi="標楷體" w:hint="eastAsia"/>
+                <w:sz w:val="20"/>
+              </w:rPr>
+              <w:t>(廠商)完成時間：_______________</w:t>
+            </w:r>
+          </w:p>
+          <w:p>
+            <w:pPr>
+              <w:jc w:val="both"/>
+              <w:rPr>
+                <w:rFonts w:ascii="標楷體" w:eastAsia="標楷體" w:hAnsi="標楷體"/>
+                <w:sz w:val="20"/>
+              </w:rPr>
+            </w:pPr>
+            <w:r>
+              <w:rPr>
+                <w:rFonts w:ascii="標楷體" w:eastAsia="標楷體" w:hAnsi="標楷體" w:hint="eastAsia"/>
+                <w:sz w:val="20"/>
+              </w:rPr>
+              <w:t>(廠商)簽名</w:t>
+            </w:r>
+            <w:r>
+              <w:rPr>
+                <w:rFonts w:ascii="標楷體" w:eastAsia="標楷體" w:hAnsi="標楷體" w:hint="eastAsia"/>
+                <w:color w:val="FF0000"/>
+                <w:sz w:val="20"/>
+              </w:rPr>
+              <w:t>：</w:t>
+            </w:r>
+            <w:r>
+              <w:rPr>
+                <w:rFonts w:ascii="標楷體" w:eastAsia="標楷體" w:hAnsi="標楷體" w:hint="eastAsia"/>
+                <w:sz w:val="20"/>
+              </w:rPr>
+              <w:t>___________________</w:t>
+            </w:r>
+          </w:p>
+        </w:tc>
+      </w:tr>
+      <w:tr>
+        <w:trPr>
+          <w:cantSplit/>
+          <w:trHeight w:val="720"/>
+        </w:trPr>
+        <w:tc>
+          <w:tcPr>
+            <w:tcW w:w="248" w:type="pct"/>
+            <w:vMerge/>
+            <w:vAlign w:val="center"/>
+          </w:tcPr>
+          <w:p>
+            <w:pPr>
+              <w:jc w:val="center"/>
+              <w:rPr>
+                <w:rFonts w:ascii="標楷體" w:eastAsia="標楷體" w:hAnsi="標楷體"/>
+                <w:szCs w:val="24"/>
+              </w:rPr>
+            </w:pPr>
+          </w:p>
+        </w:tc>
+        <w:tc>
+          <w:tcPr>
+            <w:tcW w:w="302" w:type="pct"/>
+            <w:vMerge/>
+            <w:textDirection w:val="tbRlV"/>
+            <w:vAlign w:val="center"/>
+          </w:tcPr>
+          <w:p>
+            <w:pPr>
+              <w:ind w:left="113" w:right="113"/>
+              <w:jc w:val="center"/>
+              <w:rPr>
+                <w:rFonts w:ascii="標楷體" w:eastAsia="標楷體" w:hAnsi="標楷體"/>
+                <w:sz w:val="22"/>
+                <w:szCs w:val="22"/>
+              </w:rPr>
+            </w:pPr>
+          </w:p>
+        </w:tc>
+        <w:tc>
+          <w:tcPr>
+            <w:tcW w:w="2918" w:type="pct"/>
+            <w:gridSpan w:val="3"/>
+            <w:vAlign w:val="center"/>
+          </w:tcPr>
+          <w:p>
+            <w:pPr>
+              <w:jc w:val="both"/>
+              <w:rPr>
+                <w:rFonts w:ascii="標楷體" w:eastAsia="標楷體" w:hAnsi="標楷體"/>
+                <w:color w:val="0000FF"/>
+                <w:sz w:val="20"/>
+                <w:u w:val="single"/>
+              </w:rPr>
+            </w:pPr>
+            <w:r>
+              <w:rPr>
+                <w:rFonts w:ascii="標楷體" w:eastAsia="標楷體" w:hAnsi="標楷體" w:hint="eastAsia"/>
+                <w:color w:val="0000FF"/>
+                <w:sz w:val="22"/>
+                <w:szCs w:val="22"/>
+                <w:u w:val="single"/>
+              </w:rPr>
+              <w:t>□</w:t>
+            </w:r>
+            <w:r>
+              <w:rPr>
+                <w:rFonts w:ascii="標楷體" w:eastAsia="標楷體" w:hAnsi="標楷體" w:hint="eastAsia"/>
+                <w:color w:val="0000FF"/>
+                <w:sz w:val="22"/>
+                <w:szCs w:val="22"/>
+                <w:u w:val="single"/>
+              </w:rPr>
+              <w:t>已</w:t>
+            </w:r>
+            <w:r>
+              <w:rPr>
+                <w:rFonts w:ascii="標楷體" w:eastAsia="標楷體" w:hAnsi="標楷體" w:hint="eastAsia"/>
+                <w:color w:val="0000FF"/>
+                <w:sz w:val="22"/>
+                <w:szCs w:val="22"/>
+                <w:u w:val="single"/>
+              </w:rPr>
+              <w:t>依需求辦理。</w:t>
+            </w:r>
+          </w:p>
+          <w:p>
+            <w:pPr>
+              <w:jc w:val="both"/>
+              <w:rPr>
+                <w:rFonts w:ascii="標楷體" w:eastAsia="標楷體" w:hAnsi="標楷體"/>
+                <w:sz w:val="20"/>
+              </w:rPr>
+            </w:pPr>
+            <w:r>
+              <w:rPr>
+                <w:rFonts w:ascii="標楷體" w:eastAsia="標楷體" w:hAnsi="標楷體" w:hint="eastAsia"/>
+                <w:color w:val="0000FF"/>
+                <w:sz w:val="22"/>
+                <w:szCs w:val="22"/>
+                <w:u w:val="single"/>
+              </w:rPr>
+              <w:t>□其它:</w:t>
+            </w:r>
+          </w:p>
+        </w:tc>
+        <w:tc>
+          <w:tcPr>
+            <w:tcW w:w="1532" w:type="pct"/>
+            <w:vMerge/>
+          </w:tcPr>
+          <w:p>
+            <w:pPr>
+              <w:jc w:val="both"/>
+              <w:rPr>
+                <w:rFonts w:ascii="標楷體" w:eastAsia="標楷體" w:hAnsi="標楷體"/>
+                <w:sz w:val="20"/>
+              </w:rPr>
+            </w:pPr>
+          </w:p>
+        </w:tc>
+      </w:tr>
+      <w:tr>
+        <w:trPr>
+          <w:trHeight w:val="582"/>
+        </w:trPr>
+        <w:tc>
+          <w:tcPr>
+            <w:tcW w:w="1341" w:type="pct"/>
+            <w:gridSpan w:val="3"/>
+            <w:vAlign w:val="center"/>
+          </w:tcPr>
+          <w:p>
+            <w:pPr>
+              <w:jc w:val="center"/>
+              <w:rPr>
+                <w:rFonts w:ascii="標楷體" w:eastAsia="標楷體" w:hAnsi="標楷體"/>
+                <w:szCs w:val="24"/>
+              </w:rPr>
+            </w:pPr>
+            <w:r>
+              <w:rPr>
+                <w:rFonts w:ascii="標楷體" w:eastAsia="標楷體" w:hAnsi="標楷體" w:hint="eastAsia"/>
+                <w:szCs w:val="24"/>
+              </w:rPr>
+              <w:t>申請單位確認核章</w:t>
+            </w:r>
+          </w:p>
+        </w:tc>
+        <w:tc>
+          <w:tcPr>
+            <w:tcW w:w="3659" w:type="pct"/>
+            <w:gridSpan w:val="3"/>
+            <w:vAlign w:val="center"/>
+          </w:tcPr>
+          <w:p>
+            <w:pPr>
+              <w:jc w:val="both"/>
+              <w:rPr>
+                <w:rFonts w:ascii="標楷體" w:eastAsia="標楷體" w:hAnsi="標楷體"/>
+                <w:color w:val="0000FF"/>
+                <w:szCs w:val="24"/>
+                <w:u w:val="single"/>
+              </w:rPr>
+            </w:pPr>
+            <w:r>
+              <w:rPr>
+                <w:rFonts w:ascii="標楷體" w:eastAsia="標楷體" w:hAnsi="標楷體" w:hint="eastAsia"/>
+                <w:color w:val="0000FF"/>
+                <w:sz w:val="22"/>
+                <w:szCs w:val="22"/>
+                <w:u w:val="single"/>
+              </w:rPr>
+              <w:t>□</w:t>
+            </w:r>
+            <w:r>
+              <w:rPr>
+                <w:rFonts w:ascii="標楷體" w:eastAsia="標楷體" w:hAnsi="標楷體" w:hint="eastAsia"/>
+                <w:color w:val="0000FF"/>
+                <w:sz w:val="22"/>
+                <w:szCs w:val="22"/>
+                <w:u w:val="single"/>
+              </w:rPr>
+              <w:t>確認</w:t>
+            </w:r>
+            <w:r>
+              <w:rPr>
+                <w:rFonts w:ascii="標楷體" w:eastAsia="標楷體" w:hAnsi="標楷體" w:hint="eastAsia"/>
+                <w:color w:val="0000FF"/>
+                <w:sz w:val="22"/>
+                <w:szCs w:val="22"/>
+                <w:u w:val="single"/>
+              </w:rPr>
+              <w:t>辦理結果</w:t>
+            </w:r>
+            <w:r>
+              <w:rPr>
+                <w:rFonts w:ascii="標楷體" w:eastAsia="標楷體" w:hAnsi="標楷體" w:hint="eastAsia"/>
+                <w:color w:val="0000FF"/>
+                <w:sz w:val="22"/>
+                <w:szCs w:val="22"/>
+                <w:u w:val="single"/>
+              </w:rPr>
+              <w:t>與</w:t>
+            </w:r>
+            <w:r>
+              <w:rPr>
+                <w:rFonts w:ascii="標楷體" w:eastAsia="標楷體" w:hAnsi="標楷體" w:hint="eastAsia"/>
+                <w:color w:val="0000FF"/>
+                <w:sz w:val="22"/>
+                <w:szCs w:val="22"/>
+                <w:u w:val="single"/>
+              </w:rPr>
+              <w:t>需求</w:t>
+            </w:r>
+            <w:r>
+              <w:rPr>
+                <w:rFonts w:ascii="標楷體" w:eastAsia="標楷體" w:hAnsi="標楷體" w:hint="eastAsia"/>
+                <w:color w:val="0000FF"/>
+                <w:sz w:val="22"/>
+                <w:szCs w:val="22"/>
+                <w:u w:val="single"/>
+              </w:rPr>
+              <w:t>項目</w:t>
+            </w:r>
+            <w:r>
+              <w:rPr>
+                <w:rFonts w:ascii="標楷體" w:eastAsia="標楷體" w:hAnsi="標楷體" w:hint="eastAsia"/>
+                <w:color w:val="0000FF"/>
+                <w:sz w:val="22"/>
+                <w:szCs w:val="22"/>
+                <w:u w:val="single"/>
+              </w:rPr>
+              <w:t>一致</w:t>
+            </w:r>
+            <w:r>
+              <w:rPr>
+                <w:rFonts w:ascii="標楷體" w:eastAsia="標楷體" w:hAnsi="標楷體" w:hint="eastAsia"/>
+                <w:color w:val="0000FF"/>
+                <w:sz w:val="22"/>
+                <w:szCs w:val="22"/>
+                <w:u w:val="single"/>
+              </w:rPr>
+              <w:t>。</w:t>
+            </w:r>
+          </w:p>
+          <w:p>
+            <w:pPr>
+              <w:jc w:val="both"/>
+              <w:rPr>
+                <w:rFonts w:ascii="標楷體" w:eastAsia="標楷體" w:hAnsi="標楷體"/>
+                <w:szCs w:val="24"/>
+              </w:rPr>
+            </w:pPr>
+            <w:r>
+              <w:rPr>
+                <w:rFonts w:ascii="標楷體" w:eastAsia="標楷體" w:hAnsi="標楷體" w:hint="eastAsia"/>
+                <w:color w:val="0000FF"/>
+                <w:sz w:val="22"/>
+                <w:szCs w:val="22"/>
+                <w:u w:val="single"/>
+              </w:rPr>
+              <w:t>□其它:</w:t>
+            </w:r>
+          </w:p>
+        </w:tc>
+      </w:tr>
+      <w:tr>
+        <w:trPr>
+          <w:trHeight w:val="567"/>
+        </w:trPr>
+        <w:tc>
+          <w:tcPr>
+            <w:tcW w:w="1341" w:type="pct"/>
+            <w:gridSpan w:val="3"/>
+            <w:vAlign w:val="center"/>
+          </w:tcPr>
+          <w:p>
+            <w:pPr>
+              <w:jc w:val="center"/>
+              <w:rPr>
+                <w:rFonts w:ascii="標楷體" w:eastAsia="標楷體" w:hAnsi="標楷體"/>
+                <w:szCs w:val="24"/>
+              </w:rPr>
+            </w:pPr>
+            <w:r>
+              <w:rPr>
+                <w:rFonts w:ascii="標楷體" w:eastAsia="標楷體" w:hAnsi="標楷體" w:hint="eastAsia"/>
+                <w:szCs w:val="24"/>
+              </w:rPr>
+              <w:t>資訊室核章</w:t>
+            </w:r>
+          </w:p>
+        </w:tc>
+        <w:tc>
+          <w:tcPr>
+            <w:tcW w:w="3659" w:type="pct"/>
+            <w:gridSpan w:val="3"/>
+            <w:vAlign w:val="center"/>
+          </w:tcPr>
+          <w:p>
+            <w:pPr>
+              <w:jc w:val="both"/>
+              <w:rPr>
+                <w:rFonts w:ascii="標楷體" w:eastAsia="標楷體" w:hAnsi="標楷體"/>
+                <w:szCs w:val="24"/>
+              </w:rPr>
+            </w:pPr>
+          </w:p>
+        </w:tc>
+      </w:tr>
+    </w:tbl>
+    <w:p>
+      <w:pPr>
+        <w:rPr>
+          <w:rFonts w:ascii="標楷體" w:eastAsia="標楷體" w:hAnsi="標楷體"/>
+          <w:sz w:val="20"/>
+          <w:szCs w:val="24"/>
+        </w:rPr>
+      </w:pPr>
+      <w:r>
+        <w:rPr>
+          <w:rFonts w:ascii="標楷體" w:eastAsia="標楷體" w:hAnsi="標楷體" w:hint="eastAsia"/>
+          <w:sz w:val="20"/>
+          <w:szCs w:val="24"/>
+        </w:rPr>
+        <w:t>備註：  一、系統維護單需先會系統權責單位同意後，始得送資</w:t>
+      </w:r>
+      <w:r>
+        <w:rPr>
+          <w:rFonts w:ascii="標楷體" w:eastAsia="標楷體" w:hAnsi="標楷體"/>
+          <w:sz w:val="20"/>
+          <w:szCs w:val="24"/>
+        </w:rPr>
+        <w:t>訊室</w:t>
+      </w:r>
+      <w:r>
+        <w:rPr>
+          <w:rFonts w:ascii="標楷體" w:eastAsia="標楷體" w:hAnsi="標楷體" w:hint="eastAsia"/>
+          <w:sz w:val="20"/>
+          <w:szCs w:val="24"/>
+        </w:rPr>
+        <w:t>辦理。</w:t>
+      </w:r>
+    </w:p>
+    <w:p>
+      <w:pPr>
+        <w:spacing w:line="280" w:lineRule="exact"/>
+        <w:ind w:firstLineChars="400" w:firstLine="800"/>
+        <w:rPr>
+          <w:rFonts w:ascii="標楷體" w:eastAsia="標楷體" w:hAnsi="標楷體"/>
+          <w:sz w:val="20"/>
+          <w:szCs w:val="24"/>
+        </w:rPr>
+      </w:pPr>
+      <w:r>
+        <w:rPr>
+          <w:rFonts w:ascii="標楷體" w:eastAsia="標楷體" w:hAnsi="標楷體" w:hint="eastAsia"/>
+          <w:sz w:val="20"/>
+          <w:szCs w:val="24"/>
+        </w:rPr>
+        <w:t>二、維護需求若不屬系統維護契約範圍內，請申請單位依行政程序另案辦理。</w:t>
+      </w:r>
+    </w:p>
+    <w:p>
+      <w:pPr>
+        <w:spacing w:line="280" w:lineRule="exact"/>
+        <w:ind w:firstLineChars="400" w:firstLine="800"/>
+      </w:pPr>
+      <w:r>
+        <w:rPr>
+          <w:rFonts w:ascii="標楷體" w:eastAsia="標楷體" w:hAnsi="標楷體" w:hint="eastAsia"/>
+          <w:sz w:val="20"/>
+          <w:szCs w:val="24"/>
+        </w:rPr>
+        <w:t>三、需求內容描述中，請避</w:t>
+      </w:r>
+      <w:r>
+        <w:rPr>
+          <w:rFonts w:ascii="標楷體" w:eastAsia="標楷體" w:hAnsi="標楷體"/>
+          <w:sz w:val="20"/>
+          <w:szCs w:val="24"/>
+        </w:rPr>
+        <w:t>免呈現</w:t>
+      </w:r>
+      <w:r>
+        <w:rPr>
+          <w:rFonts w:ascii="標楷體" w:eastAsia="標楷體" w:hAnsi="標楷體" w:hint="eastAsia"/>
+          <w:sz w:val="20"/>
+          <w:szCs w:val="24"/>
+        </w:rPr>
+        <w:t>可識別個人資料之文字或圖表(可遮蔽處</w:t>
+      </w:r>
+      <w:r>
+        <w:rPr>
+          <w:rFonts w:ascii="標楷體" w:eastAsia="標楷體" w:hAnsi="標楷體"/>
+          <w:sz w:val="20"/>
+          <w:szCs w:val="24"/>
+        </w:rPr>
+        <w:t>理</w:t>
+      </w:r>
+      <w:r>
+        <w:rPr>
+          <w:rFonts w:ascii="標楷體" w:eastAsia="標楷體" w:hAnsi="標楷體" w:hint="eastAsia"/>
+          <w:sz w:val="20"/>
+          <w:szCs w:val="24"/>
+        </w:rPr>
+        <w:t xml:space="preserve">)，以遵守本署資訊安全政策。 </w:t>
+      </w:r>
+    </w:p>
+    <w:sectPr>
+      <w:headerReference w:type="default" r:id="rId12"/>
+      <w:footerReference w:type="default" r:id="rId13"/>
+      <w:pgSz w:w="11906" w:h="16838" w:code="9"/>
+      <w:pgMar w:top="567" w:right="567" w:bottom="567" w:left="567" w:header="567" w:footer="567" w:gutter="0"/>
+      <w:cols w:space="425"/>
+      <w:docGrid w:linePitch="360" w:charSpace="45863"/>
+    </w:sectPr>
+  </w:body>
+</w:document>
 </file>
 
 <file path=word/endnotes.xml><?xml version="1.0" encoding="utf-8"?>
-<w:endnotes xmlns:cx="http://schemas.microsoft.com/office/drawing/2014/chartex" xmlns:cx1="http://schemas.microsoft.com/office/drawing/2015/9/8/chartex" xmlns:cx2="http://schemas.microsoft.com/office/drawing/2015/10/21/chartex" xmlns:cx3="http://schemas.microsoft.com/office/drawing/2016/5/9/chartex" xmlns:cx4="http://schemas.microsoft.com/office/drawing/2016/5/10/chartex" xmlns:cx5="http://schemas.microsoft.com/office/drawing/2016/5/11/chartex" xmlns:cx6="http://schemas.microsoft.com/office/drawing/2016/5/12/chartex" xmlns:cx7="http://schemas.microsoft.com/office/drawing/2016/5/13/chartex" xmlns:cx8="http://schemas.microsoft.com/office/drawing/2016/5/14/chartex" xmlns:mc="http://schemas.openxmlformats.org/markup-compatibility/2006" xmlns:aink="http://schemas.microsoft.com/office/drawing/2016/ink" xmlns:am3d="http://schemas.microsoft.com/office/drawing/2017/model3d" xmlns:o="urn:schemas-microsoft-com:office:office" xmlns:oel="http://schemas.microsoft.com/office/2019/extlst" xmlns:r="http://purl.oclc.org/ooxml/officeDocument/relationships" xmlns:m="http://purl.oclc.org/ooxml/officeDocument/math" xmlns:v="urn:schemas-microsoft-com:vml" xmlns:wp14="http://schemas.microsoft.com/office/word/2010/wordprocessingDrawing" xmlns:wp="http://purl.oclc.org/ooxml/drawingml/wordprocessingDrawing" xmlns:w10="urn:schemas-microsoft-com:office:word" xmlns:w="http://purl.oclc.org/ooxml/wordprocessingml/main" xmlns:w14="http://schemas.microsoft.com/office/word/2010/wordml" xmlns:w15="http://schemas.microsoft.com/office/word/2012/wordml" xmlns:w16cex="http://schemas.microsoft.com/office/word/2018/wordml/cex" xmlns:w16cid="http://schemas.microsoft.com/office/word/2016/wordml/cid" xmlns:w16="http://schemas.microsoft.com/office/word/2018/wordml" xmlns:w16sdtdh="http://schemas.microsoft.com/office/word/2020/wordml/sdtdatahash" xmlns:w16se="http://schemas.microsoft.com/office/word/2015/wordml/symex" xmlns:wpi="http://schemas.microsoft.com/office/word/2010/wordprocessingInk" xmlns:wne="http://schemas.microsoft.com/office/word/2006/wordml" mc:Ignorable="w14 w15 w16se w16cid w16 w16cex w16sdtdh wne wp14">
+<w:endnotes xmlns:wpc="http://schemas.microsoft.com/office/word/2010/wordprocessingCanvas" xmlns:cx="http://schemas.microsoft.com/office/drawing/2014/chartex" xmlns:cx1="http://schemas.microsoft.com/office/drawing/2015/9/8/chartex" xmlns:cx2="http://schemas.microsoft.com/office/drawing/2015/10/21/chartex" xmlns:cx3="http://schemas.microsoft.com/office/drawing/2016/5/9/chartex" xmlns:cx4="http://schemas.microsoft.com/office/drawing/2016/5/10/chartex" xmlns:cx5="http://schemas.microsoft.com/office/drawing/2016/5/11/chartex" xmlns:cx6="http://schemas.microsoft.com/office/drawing/2016/5/12/chartex" xmlns:cx7="http://schemas.microsoft.com/office/drawing/2016/5/13/chartex" xmlns:cx8="http://schemas.microsoft.com/office/drawing/2016/5/14/chartex" xmlns:mc="http://schemas.openxmlformats.org/markup-compatibility/2006" xmlns:aink="http://schemas.microsoft.com/office/drawing/2016/ink" xmlns:am3d="http://schemas.microsoft.com/office/drawing/2017/model3d" xmlns:o="urn:schemas-microsoft-com:office:office" xmlns:oel="http://schemas.microsoft.com/office/2019/extlst" xmlns:r="http://schemas.openxmlformats.org/officeDocument/2006/relationships" xmlns:m="http://schemas.openxmlformats.org/officeDocument/2006/math" xmlns:v="urn:schemas-microsoft-com:vml" xmlns:wp14="http://schemas.microsoft.com/office/word/2010/wordprocessingDrawing" xmlns:wp="http://schemas.openxmlformats.org/drawingml/2006/wordprocessingDrawing" xmlns:w10="urn:schemas-microsoft-com:office:word" xmlns:w="http://schemas.openxmlformats.org/wordprocessingml/2006/main" xmlns:w14="http://schemas.microsoft.com/office/word/2010/wordml" xmlns:w15="http://schemas.microsoft.com/office/word/2012/wordml" xmlns:w16cex="http://schemas.microsoft.com/office/word/2018/wordml/cex" xmlns:w16cid="http://schemas.microsoft.com/office/word/2016/wordml/cid" xmlns:w16="http://schemas.microsoft.com/office/word/2018/wordml" xmlns:w16sdtdh="http://schemas.microsoft.com/office/word/2020/wordml/sdtdatahash" xmlns:w16se="http://schemas.microsoft.com/office/word/2015/wordml/symex" xmlns:wpg="http://schemas.microsoft.com/office/word/2010/wordprocessingGroup" xmlns:wpi="http://schemas.microsoft.com/office/word/2010/wordprocessingInk" xmlns:wne="http://schemas.microsoft.com/office/word/2006/wordml" xmlns:wps="http://schemas.microsoft.com/office/word/2010/wordprocessingShape" mc:Ignorable="w14 w15 w16se w16cid w16 w16cex w16sdtdh wp14">
   <w:endnote w:type="separator" w:id="-1">
     <w:p>
       <w:r>
@@ -23,119 +2211,91 @@
 </file>
 
 <file path=word/footer1.xml><?xml version="1.0" encoding="utf-8"?>
-<w:ftr xmlns:cx="http://schemas.microsoft.com/office/drawing/2014/chartex" xmlns:cx1="http://schemas.microsoft.com/office/drawing/2015/9/8/chartex" xmlns:cx2="http://schemas.microsoft.com/office/drawing/2015/10/21/chartex" xmlns:cx3="http://schemas.microsoft.com/office/drawing/2016/5/9/chartex" xmlns:cx4="http://schemas.microsoft.com/office/drawing/2016/5/10/chartex" xmlns:cx5="http://schemas.microsoft.com/office/drawing/2016/5/11/chartex" xmlns:cx6="http://schemas.microsoft.com/office/drawing/2016/5/12/chartex" xmlns:cx7="http://schemas.microsoft.com/office/drawing/2016/5/13/chartex" xmlns:cx8="http://schemas.microsoft.com/office/drawing/2016/5/14/chartex" xmlns:mc="http://schemas.openxmlformats.org/markup-compatibility/2006" xmlns:aink="http://schemas.microsoft.com/office/drawing/2016/ink" xmlns:am3d="http://schemas.microsoft.com/office/drawing/2017/model3d" xmlns:o="urn:schemas-microsoft-com:office:office" xmlns:oel="http://schemas.microsoft.com/office/2019/extlst" xmlns:r="http://purl.oclc.org/ooxml/officeDocument/relationships" xmlns:m="http://purl.oclc.org/ooxml/officeDocument/math" xmlns:v="urn:schemas-microsoft-com:vml" xmlns:wp14="http://schemas.microsoft.com/office/word/2010/wordprocessingDrawing" xmlns:wp="http://purl.oclc.org/ooxml/drawingml/wordprocessingDrawing" xmlns:w10="urn:schemas-microsoft-com:office:word" xmlns:w="http://purl.oclc.org/ooxml/wordprocessingml/main" xmlns:w14="http://schemas.microsoft.com/office/word/2010/wordml" xmlns:w15="http://schemas.microsoft.com/office/word/2012/wordml" xmlns:w16cex="http://schemas.microsoft.com/office/word/2018/wordml/cex" xmlns:w16cid="http://schemas.microsoft.com/office/word/2016/wordml/cid" xmlns:w16="http://schemas.microsoft.com/office/word/2018/wordml" xmlns:w16sdtdh="http://schemas.microsoft.com/office/word/2020/wordml/sdtdatahash" xmlns:w16se="http://schemas.microsoft.com/office/word/2015/wordml/symex" xmlns:wpi="http://schemas.microsoft.com/office/word/2010/wordprocessingInk" xmlns:wne="http://schemas.microsoft.com/office/word/2006/wordml" mc:Ignorable="w14 w15 w16se w16cid w16 w16cex w16sdtdh wne wp14">
+<w:ftr xmlns:wpc="http://schemas.microsoft.com/office/word/2010/wordprocessingCanvas" xmlns:cx="http://schemas.microsoft.com/office/drawing/2014/chartex" xmlns:cx1="http://schemas.microsoft.com/office/drawing/2015/9/8/chartex" xmlns:cx2="http://schemas.microsoft.com/office/drawing/2015/10/21/chartex" xmlns:cx3="http://schemas.microsoft.com/office/drawing/2016/5/9/chartex" xmlns:cx4="http://schemas.microsoft.com/office/drawing/2016/5/10/chartex" xmlns:cx5="http://schemas.microsoft.com/office/drawing/2016/5/11/chartex" xmlns:cx6="http://schemas.microsoft.com/office/drawing/2016/5/12/chartex" xmlns:cx7="http://schemas.microsoft.com/office/drawing/2016/5/13/chartex" xmlns:cx8="http://schemas.microsoft.com/office/drawing/2016/5/14/chartex" xmlns:mc="http://schemas.openxmlformats.org/markup-compatibility/2006" xmlns:aink="http://schemas.microsoft.com/office/drawing/2016/ink" xmlns:am3d="http://schemas.microsoft.com/office/drawing/2017/model3d" xmlns:o="urn:schemas-microsoft-com:office:office" xmlns:oel="http://schemas.microsoft.com/office/2019/extlst" xmlns:r="http://schemas.openxmlformats.org/officeDocument/2006/relationships" xmlns:m="http://schemas.openxmlformats.org/officeDocument/2006/math" xmlns:v="urn:schemas-microsoft-com:vml" xmlns:wp14="http://schemas.microsoft.com/office/word/2010/wordprocessingDrawing" xmlns:wp="http://schemas.openxmlformats.org/drawingml/2006/wordprocessingDrawing" xmlns:w10="urn:schemas-microsoft-com:office:word" xmlns:w="http://schemas.openxmlformats.org/wordprocessingml/2006/main" xmlns:w14="http://schemas.microsoft.com/office/word/2010/wordml" xmlns:w15="http://schemas.microsoft.com/office/word/2012/wordml" xmlns:w16cex="http://schemas.microsoft.com/office/word/2018/wordml/cex" xmlns:w16cid="http://schemas.microsoft.com/office/word/2016/wordml/cid" xmlns:w16="http://schemas.microsoft.com/office/word/2018/wordml" xmlns:w16sdtdh="http://schemas.microsoft.com/office/word/2020/wordml/sdtdatahash" xmlns:w16se="http://schemas.microsoft.com/office/word/2015/wordml/symex" xmlns:wpg="http://schemas.microsoft.com/office/word/2010/wordprocessingGroup" xmlns:wpi="http://schemas.microsoft.com/office/word/2010/wordprocessingInk" xmlns:wne="http://schemas.microsoft.com/office/word/2006/wordml" xmlns:wps="http://schemas.microsoft.com/office/word/2010/wordprocessingShape" mc:Ignorable="w14 w15 w16se w16cid w16 w16cex w16sdtdh wp14">
   <w:p>
     <w:pPr>
-      <w:pStyle w:val="a4"/>
-      <w:tabs>
-        <w:tab w:val="clear" w:pos="415.30pt"/>
-        <w:tab w:val="end" w:pos="496.15pt"/>
-      </w:tabs>
+      <w:pStyle w:val="a5"/>
     </w:pPr>
     <w:r>
       <w:rPr>
         <w:rFonts w:ascii="標楷體" w:eastAsia="標楷體" w:hAnsi="標楷體" w:hint="eastAsia"/>
       </w:rPr>
-      <w:t>機密等級</w:t>
+      <w:t>機密等級：</w:t>
+    </w:r>
+    <w:r>
+      <w:rPr>
+        <w:rFonts w:ascii="標楷體" w:eastAsia="標楷體" w:hAnsi="標楷體" w:hint="eastAsia"/>
+        <w:color w:val="0000FF"/>
+      </w:rPr>
+      <w:t>限制</w:t>
+    </w:r>
+    <w:r>
+      <w:rPr>
+        <w:rFonts w:ascii="標楷體" w:eastAsia="標楷體" w:hAnsi="標楷體" w:hint="eastAsia"/>
+        <w:color w:val="0000FF"/>
+      </w:rPr>
+      <w:t>使用</w:t>
     </w:r>
     <w:r>
       <w:rPr>
         <w:rFonts w:ascii="標楷體" w:eastAsia="標楷體" w:hAnsi="標楷體" w:hint="eastAsia"/>
       </w:rPr>
-      <w:t>：</w:t>
+      <w:t xml:space="preserve">                                           </w:t>
     </w:r>
     <w:r>
       <w:rPr>
         <w:rFonts w:ascii="標楷體" w:eastAsia="標楷體" w:hAnsi="標楷體" w:hint="eastAsia"/>
       </w:rPr>
-      <w:t>限制使用</w:t>
+      <w:t xml:space="preserve">       </w:t>
     </w:r>
     <w:r>
       <w:rPr>
         <w:rFonts w:ascii="標楷體" w:eastAsia="標楷體" w:hAnsi="標楷體" w:hint="eastAsia"/>
       </w:rPr>
-      <w:tab/>
+      <w:t xml:space="preserve">    </w:t>
     </w:r>
     <w:r>
       <w:rPr>
         <w:rFonts w:ascii="標楷體" w:eastAsia="標楷體" w:hAnsi="標楷體" w:hint="eastAsia"/>
       </w:rPr>
-      <w:tab/>
+      <w:t>表單編號：D-205-0045-</w:t>
     </w:r>
     <w:r>
       <w:rPr>
         <w:rFonts w:ascii="標楷體" w:eastAsia="標楷體" w:hAnsi="標楷體" w:hint="eastAsia"/>
       </w:rPr>
-      <w:t>表單編號</w:t>
+      <w:t>11</w:t>
     </w:r>
     <w:r>
       <w:rPr>
         <w:rFonts w:ascii="標楷體" w:eastAsia="標楷體" w:hAnsi="標楷體" w:hint="eastAsia"/>
       </w:rPr>
-      <w:t>：</w:t>
+      <w:t>4</w:t>
     </w:r>
     <w:r>
       <w:rPr>
-        <w:rStyle w:val="a5"/>
-        <w:rFonts w:ascii="標楷體" w:eastAsia="標楷體" w:hAnsi="標楷體"/>
+        <w:rFonts w:ascii="標楷體" w:eastAsia="標楷體" w:hAnsi="標楷體" w:hint="eastAsia"/>
       </w:rPr>
-      <w:t>D-205-0</w:t>
+      <w:t>0519</w:t>
     </w:r>
     <w:r>
       <w:rPr>
-        <w:rStyle w:val="a5"/>
         <w:rFonts w:ascii="標楷體" w:eastAsia="標楷體" w:hAnsi="標楷體" w:hint="eastAsia"/>
       </w:rPr>
-      <w:t>113</w:t>
+      <w:t>-V4.</w:t>
     </w:r>
     <w:r>
       <w:rPr>
-        <w:rStyle w:val="a5"/>
-        <w:rFonts w:ascii="標楷體" w:eastAsia="標楷體" w:hAnsi="標楷體"/>
-      </w:rPr>
-      <w:t>-</w:t>
-    </w:r>
-    <w:r>
-      <w:rPr>
-        <w:rStyle w:val="a5"/>
         <w:rFonts w:ascii="標楷體" w:eastAsia="標楷體" w:hAnsi="標楷體" w:hint="eastAsia"/>
       </w:rPr>
-      <w:t>1</w:t>
-    </w:r>
-    <w:r>
-      <w:rPr>
-        <w:rStyle w:val="a5"/>
-        <w:rFonts w:ascii="標楷體" w:eastAsia="標楷體" w:hAnsi="標楷體" w:hint="eastAsia"/>
-      </w:rPr>
-      <w:t>14</w:t>
-    </w:r>
-    <w:r>
-      <w:rPr>
-        <w:rStyle w:val="a5"/>
-        <w:rFonts w:ascii="標楷體" w:eastAsia="標楷體" w:hAnsi="標楷體"/>
-      </w:rPr>
-      <w:t>0410</w:t>
-    </w:r>
-    <w:r>
-      <w:rPr>
-        <w:rStyle w:val="a5"/>
-        <w:rFonts w:ascii="標楷體" w:eastAsia="標楷體" w:hAnsi="標楷體"/>
-      </w:rPr>
-      <w:t>-V</w:t>
-    </w:r>
-    <w:r>
-      <w:rPr>
-        <w:rStyle w:val="a5"/>
-        <w:rFonts w:ascii="標楷體" w:eastAsia="標楷體" w:hAnsi="標楷體" w:hint="eastAsia"/>
-      </w:rPr>
-      <w:t>5.0</w:t>
+      <w:t>6</w:t>
     </w:r>
   </w:p>
 </w:ftr>
 </file>
 
 <file path=word/footnotes.xml><?xml version="1.0" encoding="utf-8"?>
-<w:footnotes xmlns:cx="http://schemas.microsoft.com/office/drawing/2014/chartex" xmlns:cx1="http://schemas.microsoft.com/office/drawing/2015/9/8/chartex" xmlns:cx2="http://schemas.microsoft.com/office/drawing/2015/10/21/chartex" xmlns:cx3="http://schemas.microsoft.com/office/drawing/2016/5/9/chartex" xmlns:cx4="http://schemas.microsoft.com/office/drawing/2016/5/10/chartex" xmlns:cx5="http://schemas.microsoft.com/office/drawing/2016/5/11/chartex" xmlns:cx6="http://schemas.microsoft.com/office/drawing/2016/5/12/chartex" xmlns:cx7="http://schemas.microsoft.com/office/drawing/2016/5/13/chartex" xmlns:cx8="http://schemas.microsoft.com/office/drawing/2016/5/14/chartex" xmlns:mc="http://schemas.openxmlformats.org/markup-compatibility/2006" xmlns:aink="http://schemas.microsoft.com/office/drawing/2016/ink" xmlns:am3d="http://schemas.microsoft.com/office/drawing/2017/model3d" xmlns:o="urn:schemas-microsoft-com:office:office" xmlns:oel="http://schemas.microsoft.com/office/2019/extlst" xmlns:r="http://purl.oclc.org/ooxml/officeDocument/relationships" xmlns:m="http://purl.oclc.org/ooxml/officeDocument/math" xmlns:v="urn:schemas-microsoft-com:vml" xmlns:wp14="http://schemas.microsoft.com/office/word/2010/wordprocessingDrawing" xmlns:wp="http://purl.oclc.org/ooxml/drawingml/wordprocessingDrawing" xmlns:w10="urn:schemas-microsoft-com:office:word" xmlns:w="http://purl.oclc.org/ooxml/wordprocessingml/main" xmlns:w14="http://schemas.microsoft.com/office/word/2010/wordml" xmlns:w15="http://schemas.microsoft.com/office/word/2012/wordml" xmlns:w16cex="http://schemas.microsoft.com/office/word/2018/wordml/cex" xmlns:w16cid="http://schemas.microsoft.com/office/word/2016/wordml/cid" xmlns:w16="http://schemas.microsoft.com/office/word/2018/wordml" xmlns:w16sdtdh="http://schemas.microsoft.com/office/word/2020/wordml/sdtdatahash" xmlns:w16se="http://schemas.microsoft.com/office/word/2015/wordml/symex" xmlns:wpi="http://schemas.microsoft.com/office/word/2010/wordprocessingInk" xmlns:wne="http://schemas.microsoft.com/office/word/2006/wordml" mc:Ignorable="w14 w15 w16se w16cid w16 w16cex w16sdtdh wne wp14">
+<w:footnotes xmlns:wpc="http://schemas.microsoft.com/office/word/2010/wordprocessingCanvas" xmlns:cx="http://schemas.microsoft.com/office/drawing/2014/chartex" xmlns:cx1="http://schemas.microsoft.com/office/drawing/2015/9/8/chartex" xmlns:cx2="http://schemas.microsoft.com/office/drawing/2015/10/21/chartex" xmlns:cx3="http://schemas.microsoft.com/office/drawing/2016/5/9/chartex" xmlns:cx4="http://schemas.microsoft.com/office/drawing/2016/5/10/chartex" xmlns:cx5="http://schemas.microsoft.com/office/drawing/2016/5/11/chartex" xmlns:cx6="http://schemas.microsoft.com/office/drawing/2016/5/12/chartex" xmlns:cx7="http://schemas.microsoft.com/office/drawing/2016/5/13/chartex" xmlns:cx8="http://schemas.microsoft.com/office/drawing/2016/5/14/chartex" xmlns:mc="http://schemas.openxmlformats.org/markup-compatibility/2006" xmlns:aink="http://schemas.microsoft.com/office/drawing/2016/ink" xmlns:am3d="http://schemas.microsoft.com/office/drawing/2017/model3d" xmlns:o="urn:schemas-microsoft-com:office:office" xmlns:oel="http://schemas.microsoft.com/office/2019/extlst" xmlns:r="http://schemas.openxmlformats.org/officeDocument/2006/relationships" xmlns:m="http://schemas.openxmlformats.org/officeDocument/2006/math" xmlns:v="urn:schemas-microsoft-com:vml" xmlns:wp14="http://schemas.microsoft.com/office/word/2010/wordprocessingDrawing" xmlns:wp="http://schemas.openxmlformats.org/drawingml/2006/wordprocessingDrawing" xmlns:w10="urn:schemas-microsoft-com:office:word" xmlns:w="http://schemas.openxmlformats.org/wordprocessingml/2006/main" xmlns:w14="http://schemas.microsoft.com/office/word/2010/wordml" xmlns:w15="http://schemas.microsoft.com/office/word/2012/wordml" xmlns:w16cex="http://schemas.microsoft.com/office/word/2018/wordml/cex" xmlns:w16cid="http://schemas.microsoft.com/office/word/2016/wordml/cid" xmlns:w16="http://schemas.microsoft.com/office/word/2018/wordml" xmlns:w16sdtdh="http://schemas.microsoft.com/office/word/2020/wordml/sdtdatahash" xmlns:w16se="http://schemas.microsoft.com/office/word/2015/wordml/symex" xmlns:wpg="http://schemas.microsoft.com/office/word/2010/wordprocessingGroup" xmlns:wpi="http://schemas.microsoft.com/office/word/2010/wordprocessingInk" xmlns:wne="http://schemas.microsoft.com/office/word/2006/wordml" xmlns:wps="http://schemas.microsoft.com/office/word/2010/wordprocessingShape" mc:Ignorable="w14 w15 w16se w16cid w16 w16cex w16sdtdh wp14">
   <w:footnote w:type="separator" w:id="-1">
     <w:p>
       <w:r>
@@ -154,15 +2314,12 @@
 </file>
 
 <file path=word/header1.xml><?xml version="1.0" encoding="utf-8"?>
-<w:hdr xmlns:cx="http://schemas.microsoft.com/office/drawing/2014/chartex" xmlns:cx1="http://schemas.microsoft.com/office/drawing/2015/9/8/chartex" xmlns:cx2="http://schemas.microsoft.com/office/drawing/2015/10/21/chartex" xmlns:cx3="http://schemas.microsoft.com/office/drawing/2016/5/9/chartex" xmlns:cx4="http://schemas.microsoft.com/office/drawing/2016/5/10/chartex" xmlns:cx5="http://schemas.microsoft.com/office/drawing/2016/5/11/chartex" xmlns:cx6="http://schemas.microsoft.com/office/drawing/2016/5/12/chartex" xmlns:cx7="http://schemas.microsoft.com/office/drawing/2016/5/13/chartex" xmlns:cx8="http://schemas.microsoft.com/office/drawing/2016/5/14/chartex" xmlns:mc="http://schemas.openxmlformats.org/markup-compatibility/2006" xmlns:aink="http://schemas.microsoft.com/office/drawing/2016/ink" xmlns:am3d="http://schemas.microsoft.com/office/drawing/2017/model3d" xmlns:o="urn:schemas-microsoft-com:office:office" xmlns:oel="http://schemas.microsoft.com/office/2019/extlst" xmlns:r="http://purl.oclc.org/ooxml/officeDocument/relationships" xmlns:m="http://purl.oclc.org/ooxml/officeDocument/math" xmlns:v="urn:schemas-microsoft-com:vml" xmlns:wp14="http://schemas.microsoft.com/office/word/2010/wordprocessingDrawing" xmlns:wp="http://purl.oclc.org/ooxml/drawingml/wordprocessingDrawing" xmlns:w10="urn:schemas-microsoft-com:office:word" xmlns:w="http://purl.oclc.org/ooxml/wordprocessingml/main" xmlns:w14="http://schemas.microsoft.com/office/word/2010/wordml" xmlns:w15="http://schemas.microsoft.com/office/word/2012/wordml" xmlns:w16cex="http://schemas.microsoft.com/office/word/2018/wordml/cex" xmlns:w16cid="http://schemas.microsoft.com/office/word/2016/wordml/cid" xmlns:w16="http://schemas.microsoft.com/office/word/2018/wordml" xmlns:w16sdtdh="http://schemas.microsoft.com/office/word/2020/wordml/sdtdatahash" xmlns:w16se="http://schemas.microsoft.com/office/word/2015/wordml/symex" xmlns:wpi="http://schemas.microsoft.com/office/word/2010/wordprocessingInk" xmlns:wne="http://schemas.microsoft.com/office/word/2006/wordml" mc:Ignorable="w14 w15 w16se w16cid w16 w16cex w16sdtdh wne wp14">
+<w:hdr xmlns:wpc="http://schemas.microsoft.com/office/word/2010/wordprocessingCanvas" xmlns:cx="http://schemas.microsoft.com/office/drawing/2014/chartex" xmlns:cx1="http://schemas.microsoft.com/office/drawing/2015/9/8/chartex" xmlns:cx2="http://schemas.microsoft.com/office/drawing/2015/10/21/chartex" xmlns:cx3="http://schemas.microsoft.com/office/drawing/2016/5/9/chartex" xmlns:cx4="http://schemas.microsoft.com/office/drawing/2016/5/10/chartex" xmlns:cx5="http://schemas.microsoft.com/office/drawing/2016/5/11/chartex" xmlns:cx6="http://schemas.microsoft.com/office/drawing/2016/5/12/chartex" xmlns:cx7="http://schemas.microsoft.com/office/drawing/2016/5/13/chartex" xmlns:cx8="http://schemas.microsoft.com/office/drawing/2016/5/14/chartex" xmlns:mc="http://schemas.openxmlformats.org/markup-compatibility/2006" xmlns:aink="http://schemas.microsoft.com/office/drawing/2016/ink" xmlns:am3d="http://schemas.microsoft.com/office/drawing/2017/model3d" xmlns:o="urn:schemas-microsoft-com:office:office" xmlns:oel="http://schemas.microsoft.com/office/2019/extlst" xmlns:r="http://schemas.openxmlformats.org/officeDocument/2006/relationships" xmlns:m="http://schemas.openxmlformats.org/officeDocument/2006/math" xmlns:v="urn:schemas-microsoft-com:vml" xmlns:wp14="http://schemas.microsoft.com/office/word/2010/wordprocessingDrawing" xmlns:wp="http://schemas.openxmlformats.org/drawingml/2006/wordprocessingDrawing" xmlns:w10="urn:schemas-microsoft-com:office:word" xmlns:w="http://schemas.openxmlformats.org/wordprocessingml/2006/main" xmlns:w14="http://schemas.microsoft.com/office/word/2010/wordml" xmlns:w15="http://schemas.microsoft.com/office/word/2012/wordml" xmlns:w16cex="http://schemas.microsoft.com/office/word/2018/wordml/cex" xmlns:w16cid="http://schemas.microsoft.com/office/word/2016/wordml/cid" xmlns:w16="http://schemas.microsoft.com/office/word/2018/wordml" xmlns:w16sdtdh="http://schemas.microsoft.com/office/word/2020/wordml/sdtdatahash" xmlns:w16se="http://schemas.microsoft.com/office/word/2015/wordml/symex" xmlns:wpg="http://schemas.microsoft.com/office/word/2010/wordprocessingGroup" xmlns:wpi="http://schemas.microsoft.com/office/word/2010/wordprocessingInk" xmlns:wne="http://schemas.microsoft.com/office/word/2006/wordml" xmlns:wps="http://schemas.microsoft.com/office/word/2010/wordprocessingShape" mc:Ignorable="w14 w15 w16se w16cid w16 w16cex w16sdtdh wp14">
   <w:p>
     <w:pPr>
-      <w:pStyle w:val="a3"/>
-      <w:tabs>
-        <w:tab w:val="clear" w:pos="415.30pt"/>
-        <w:tab w:val="end" w:pos="496.15pt"/>
-      </w:tabs>
-      <w:jc w:val="end"/>
+      <w:pStyle w:val="a4"/>
+      <w:ind w:left="2" w:right="100"/>
+      <w:jc w:val="right"/>
       <w:rPr>
         <w:rFonts w:ascii="標楷體" w:eastAsia="標楷體" w:hAnsi="標楷體"/>
         <w:sz w:val="24"/>
@@ -182,17 +2339,20 @@
 </file>
 
 <file path=word/numbering.xml><?xml version="1.0" encoding="utf-8"?>
-<w:numbering xmlns:cx="http://schemas.microsoft.com/office/drawing/2014/chartex" xmlns:cx1="http://schemas.microsoft.com/office/drawing/2015/9/8/chartex" xmlns:cx2="http://schemas.microsoft.com/office/drawing/2015/10/21/chartex" xmlns:cx3="http://schemas.microsoft.com/office/drawing/2016/5/9/chartex" xmlns:cx4="http://schemas.microsoft.com/office/drawing/2016/5/10/chartex" xmlns:cx5="http://schemas.microsoft.com/office/drawing/2016/5/11/chartex" xmlns:cx6="http://schemas.microsoft.com/office/drawing/2016/5/12/chartex" xmlns:cx7="http://schemas.microsoft.com/office/drawing/2016/5/13/chartex" xmlns:cx8="http://schemas.microsoft.com/office/drawing/2016/5/14/chartex" xmlns:mc="http://schemas.openxmlformats.org/markup-compatibility/2006" xmlns:aink="http://schemas.microsoft.com/office/drawing/2016/ink" xmlns:am3d="http://schemas.microsoft.com/office/drawing/2017/model3d" xmlns:o="urn:schemas-microsoft-com:office:office" xmlns:oel="http://schemas.microsoft.com/office/2019/extlst" xmlns:r="http://purl.oclc.org/ooxml/officeDocument/relationships" xmlns:m="http://purl.oclc.org/ooxml/officeDocument/math" xmlns:v="urn:schemas-microsoft-com:vml" xmlns:wp14="http://schemas.microsoft.com/office/word/2010/wordprocessingDrawing" xmlns:wp="http://purl.oclc.org/ooxml/drawingml/wordprocessingDrawing" xmlns:w10="urn:schemas-microsoft-com:office:word" xmlns:w="http://purl.oclc.org/ooxml/wordprocessingml/main" xmlns:w14="http://schemas.microsoft.com/office/word/2010/wordml" xmlns:w15="http://schemas.microsoft.com/office/word/2012/wordml" xmlns:w16cex="http://schemas.microsoft.com/office/word/2018/wordml/cex" xmlns:w16cid="http://schemas.microsoft.com/office/word/2016/wordml/cid" xmlns:w16="http://schemas.microsoft.com/office/word/2018/wordml" xmlns:w16sdtdh="http://schemas.microsoft.com/office/word/2020/wordml/sdtdatahash" xmlns:w16se="http://schemas.microsoft.com/office/word/2015/wordml/symex" xmlns:wpi="http://schemas.microsoft.com/office/word/2010/wordprocessingInk" xmlns:wne="http://schemas.microsoft.com/office/word/2006/wordml" mc:Ignorable="w14 w15 w16se w16cid w16 w16cex w16sdtdh wne wp14">
+<w:numbering xmlns:wpc="http://schemas.microsoft.com/office/word/2010/wordprocessingCanvas" xmlns:cx="http://schemas.microsoft.com/office/drawing/2014/chartex" xmlns:cx1="http://schemas.microsoft.com/office/drawing/2015/9/8/chartex" xmlns:cx2="http://schemas.microsoft.com/office/drawing/2015/10/21/chartex" xmlns:cx3="http://schemas.microsoft.com/office/drawing/2016/5/9/chartex" xmlns:cx4="http://schemas.microsoft.com/office/drawing/2016/5/10/chartex" xmlns:cx5="http://schemas.microsoft.com/office/drawing/2016/5/11/chartex" xmlns:cx6="http://schemas.microsoft.com/office/drawing/2016/5/12/chartex" xmlns:cx7="http://schemas.microsoft.com/office/drawing/2016/5/13/chartex" xmlns:cx8="http://schemas.microsoft.com/office/drawing/2016/5/14/chartex" xmlns:mc="http://schemas.openxmlformats.org/markup-compatibility/2006" xmlns:aink="http://schemas.microsoft.com/office/drawing/2016/ink" xmlns:am3d="http://schemas.microsoft.com/office/drawing/2017/model3d" xmlns:o="urn:schemas-microsoft-com:office:office" xmlns:oel="http://schemas.microsoft.com/office/2019/extlst" xmlns:r="http://schemas.openxmlformats.org/officeDocument/2006/relationships" xmlns:m="http://schemas.openxmlformats.org/officeDocument/2006/math" xmlns:v="urn:schemas-microsoft-com:vml" xmlns:wp14="http://schemas.microsoft.com/office/word/2010/wordprocessingDrawing" xmlns:wp="http://schemas.openxmlformats.org/drawingml/2006/wordprocessingDrawing" xmlns:w10="urn:schemas-microsoft-com:office:word" xmlns:w="http://schemas.openxmlformats.org/wordprocessingml/2006/main" xmlns:w14="http://schemas.microsoft.com/office/word/2010/wordml" xmlns:w15="http://schemas.microsoft.com/office/word/2012/wordml" xmlns:w16cex="http://schemas.microsoft.com/office/word/2018/wordml/cex" xmlns:w16cid="http://schemas.microsoft.com/office/word/2016/wordml/cid" xmlns:w16="http://schemas.microsoft.com/office/word/2018/wordml" xmlns:w16sdtdh="http://schemas.microsoft.com/office/word/2020/wordml/sdtdatahash" xmlns:w16se="http://schemas.microsoft.com/office/word/2015/wordml/symex" xmlns:wpg="http://schemas.microsoft.com/office/word/2010/wordprocessingGroup" xmlns:wpi="http://schemas.microsoft.com/office/word/2010/wordprocessingInk" xmlns:wne="http://schemas.microsoft.com/office/word/2006/wordml" xmlns:wps="http://schemas.microsoft.com/office/word/2010/wordprocessingShape" mc:Ignorable="w14 w15 w16se w16cid w16 w16cex w16sdtdh wp14">
   <w:abstractNum w:abstractNumId="0" w15:restartNumberingAfterBreak="0">
-    <w:nsid w:val="43026743"/>
+    <w:nsid w:val="35EB42EB"/>
     <w:multiLevelType w:val="hybridMultilevel"/>
-    <w:tmpl w:val="E92A86EA"/>
-    <w:lvl w:ilvl="0" w:tplc="703E61FE">
+    <w:tmpl w:val="A4524EC4"/>
+    <w:lvl w:ilvl="0" w:tplc="87BA6344">
       <w:numFmt w:val="bullet"/>
       <w:lvlText w:val="□"/>
-      <w:lvlJc w:val="start"/>
+      <w:lvlJc w:val="left"/>
       <w:pPr>
-        <w:ind w:start="18pt" w:hanging="18pt"/>
+        <w:tabs>
+          <w:tab w:val="num" w:pos="360"/>
+        </w:tabs>
+        <w:ind w:left="360" w:hanging="360"/>
       </w:pPr>
       <w:rPr>
         <w:rFonts w:ascii="標楷體" w:eastAsia="標楷體" w:hAnsi="標楷體" w:cs="Times New Roman" w:hint="eastAsia"/>
@@ -202,9 +2362,12 @@
       <w:start w:val="1"/>
       <w:numFmt w:val="bullet"/>
       <w:lvlText w:val=""/>
-      <w:lvlJc w:val="start"/>
+      <w:lvlJc w:val="left"/>
       <w:pPr>
-        <w:ind w:start="48pt" w:hanging="24pt"/>
+        <w:tabs>
+          <w:tab w:val="num" w:pos="960"/>
+        </w:tabs>
+        <w:ind w:left="960" w:hanging="480"/>
       </w:pPr>
       <w:rPr>
         <w:rFonts w:ascii="Wingdings" w:hAnsi="Wingdings" w:hint="default"/>
@@ -214,9 +2377,12 @@
       <w:start w:val="1"/>
       <w:numFmt w:val="bullet"/>
       <w:lvlText w:val=""/>
-      <w:lvlJc w:val="start"/>
+      <w:lvlJc w:val="left"/>
       <w:pPr>
-        <w:ind w:start="72pt" w:hanging="24pt"/>
+        <w:tabs>
+          <w:tab w:val="num" w:pos="1440"/>
+        </w:tabs>
+        <w:ind w:left="1440" w:hanging="480"/>
       </w:pPr>
       <w:rPr>
         <w:rFonts w:ascii="Wingdings" w:hAnsi="Wingdings" w:hint="default"/>
@@ -226,9 +2392,12 @@
       <w:start w:val="1"/>
       <w:numFmt w:val="bullet"/>
       <w:lvlText w:val=""/>
-      <w:lvlJc w:val="start"/>
+      <w:lvlJc w:val="left"/>
       <w:pPr>
-        <w:ind w:start="96pt" w:hanging="24pt"/>
+        <w:tabs>
+          <w:tab w:val="num" w:pos="1920"/>
+        </w:tabs>
+        <w:ind w:left="1920" w:hanging="480"/>
       </w:pPr>
       <w:rPr>
         <w:rFonts w:ascii="Wingdings" w:hAnsi="Wingdings" w:hint="default"/>
@@ -238,9 +2407,12 @@
       <w:start w:val="1"/>
       <w:numFmt w:val="bullet"/>
       <w:lvlText w:val=""/>
-      <w:lvlJc w:val="start"/>
+      <w:lvlJc w:val="left"/>
       <w:pPr>
-        <w:ind w:start="120pt" w:hanging="24pt"/>
+        <w:tabs>
+          <w:tab w:val="num" w:pos="2400"/>
+        </w:tabs>
+        <w:ind w:left="2400" w:hanging="480"/>
       </w:pPr>
       <w:rPr>
         <w:rFonts w:ascii="Wingdings" w:hAnsi="Wingdings" w:hint="default"/>
@@ -250,9 +2422,12 @@
       <w:start w:val="1"/>
       <w:numFmt w:val="bullet"/>
       <w:lvlText w:val=""/>
-      <w:lvlJc w:val="start"/>
+      <w:lvlJc w:val="left"/>
       <w:pPr>
-        <w:ind w:start="144pt" w:hanging="24pt"/>
+        <w:tabs>
+          <w:tab w:val="num" w:pos="2880"/>
+        </w:tabs>
+        <w:ind w:left="2880" w:hanging="480"/>
       </w:pPr>
       <w:rPr>
         <w:rFonts w:ascii="Wingdings" w:hAnsi="Wingdings" w:hint="default"/>
@@ -262,9 +2437,12 @@
       <w:start w:val="1"/>
       <w:numFmt w:val="bullet"/>
       <w:lvlText w:val=""/>
-      <w:lvlJc w:val="start"/>
+      <w:lvlJc w:val="left"/>
       <w:pPr>
-        <w:ind w:start="168pt" w:hanging="24pt"/>
+        <w:tabs>
+          <w:tab w:val="num" w:pos="3360"/>
+        </w:tabs>
+        <w:ind w:left="3360" w:hanging="480"/>
       </w:pPr>
       <w:rPr>
         <w:rFonts w:ascii="Wingdings" w:hAnsi="Wingdings" w:hint="default"/>
@@ -274,9 +2452,12 @@
       <w:start w:val="1"/>
       <w:numFmt w:val="bullet"/>
       <w:lvlText w:val=""/>
-      <w:lvlJc w:val="start"/>
+      <w:lvlJc w:val="left"/>
       <w:pPr>
-        <w:ind w:start="192pt" w:hanging="24pt"/>
+        <w:tabs>
+          <w:tab w:val="num" w:pos="3840"/>
+        </w:tabs>
+        <w:ind w:left="3840" w:hanging="480"/>
       </w:pPr>
       <w:rPr>
         <w:rFonts w:ascii="Wingdings" w:hAnsi="Wingdings" w:hint="default"/>
@@ -286,9 +2467,12 @@
       <w:start w:val="1"/>
       <w:numFmt w:val="bullet"/>
       <w:lvlText w:val=""/>
-      <w:lvlJc w:val="start"/>
+      <w:lvlJc w:val="left"/>
       <w:pPr>
-        <w:ind w:start="216pt" w:hanging="24pt"/>
+        <w:tabs>
+          <w:tab w:val="num" w:pos="4320"/>
+        </w:tabs>
+        <w:ind w:left="4320" w:hanging="480"/>
       </w:pPr>
       <w:rPr>
         <w:rFonts w:ascii="Wingdings" w:hAnsi="Wingdings" w:hint="default"/>
@@ -296,105 +2480,132 @@
     </w:lvl>
   </w:abstractNum>
   <w:abstractNum w:abstractNumId="1" w15:restartNumberingAfterBreak="0">
-    <w:nsid w:val="715815BD"/>
+    <w:nsid w:val="72DA67A0"/>
     <w:multiLevelType w:val="hybridMultilevel"/>
-    <w:tmpl w:val="531243D4"/>
-    <w:lvl w:ilvl="0" w:tplc="C6EE5292">
+    <w:tmpl w:val="F164389E"/>
+    <w:lvl w:ilvl="0" w:tplc="51D2411A">
       <w:start w:val="1"/>
       <w:numFmt w:val="taiwaneseCountingThousand"/>
-      <w:lvlText w:val="%1"/>
-      <w:lvlJc w:val="start"/>
+      <w:lvlText w:val="%1、"/>
+      <w:lvlJc w:val="left"/>
       <w:pPr>
-        <w:ind w:start="24pt" w:hanging="24pt"/>
+        <w:tabs>
+          <w:tab w:val="num" w:pos="480"/>
+        </w:tabs>
+        <w:ind w:left="480" w:hanging="480"/>
       </w:pPr>
       <w:rPr>
-        <w:rFonts w:hint="eastAsia"/>
+        <w:rFonts w:hint="default"/>
       </w:rPr>
     </w:lvl>
     <w:lvl w:ilvl="1" w:tplc="04090019" w:tentative="1">
       <w:start w:val="1"/>
       <w:numFmt w:val="ideographTraditional"/>
       <w:lvlText w:val="%2、"/>
-      <w:lvlJc w:val="start"/>
+      <w:lvlJc w:val="left"/>
       <w:pPr>
-        <w:ind w:start="48pt" w:hanging="24pt"/>
+        <w:tabs>
+          <w:tab w:val="num" w:pos="960"/>
+        </w:tabs>
+        <w:ind w:left="960" w:hanging="480"/>
       </w:pPr>
     </w:lvl>
     <w:lvl w:ilvl="2" w:tplc="0409001B" w:tentative="1">
       <w:start w:val="1"/>
       <w:numFmt w:val="lowerRoman"/>
       <w:lvlText w:val="%3."/>
-      <w:lvlJc w:val="end"/>
+      <w:lvlJc w:val="right"/>
       <w:pPr>
-        <w:ind w:start="72pt" w:hanging="24pt"/>
+        <w:tabs>
+          <w:tab w:val="num" w:pos="1440"/>
+        </w:tabs>
+        <w:ind w:left="1440" w:hanging="480"/>
       </w:pPr>
     </w:lvl>
     <w:lvl w:ilvl="3" w:tplc="0409000F" w:tentative="1">
       <w:start w:val="1"/>
       <w:numFmt w:val="decimal"/>
       <w:lvlText w:val="%4."/>
-      <w:lvlJc w:val="start"/>
+      <w:lvlJc w:val="left"/>
       <w:pPr>
-        <w:ind w:start="96pt" w:hanging="24pt"/>
+        <w:tabs>
+          <w:tab w:val="num" w:pos="1920"/>
+        </w:tabs>
+        <w:ind w:left="1920" w:hanging="480"/>
       </w:pPr>
     </w:lvl>
     <w:lvl w:ilvl="4" w:tplc="04090019" w:tentative="1">
       <w:start w:val="1"/>
       <w:numFmt w:val="ideographTraditional"/>
       <w:lvlText w:val="%5、"/>
-      <w:lvlJc w:val="start"/>
+      <w:lvlJc w:val="left"/>
       <w:pPr>
-        <w:ind w:start="120pt" w:hanging="24pt"/>
+        <w:tabs>
+          <w:tab w:val="num" w:pos="2400"/>
+        </w:tabs>
+        <w:ind w:left="2400" w:hanging="480"/>
       </w:pPr>
     </w:lvl>
     <w:lvl w:ilvl="5" w:tplc="0409001B" w:tentative="1">
       <w:start w:val="1"/>
       <w:numFmt w:val="lowerRoman"/>
       <w:lvlText w:val="%6."/>
-      <w:lvlJc w:val="end"/>
+      <w:lvlJc w:val="right"/>
       <w:pPr>
-        <w:ind w:start="144pt" w:hanging="24pt"/>
+        <w:tabs>
+          <w:tab w:val="num" w:pos="2880"/>
+        </w:tabs>
+        <w:ind w:left="2880" w:hanging="480"/>
       </w:pPr>
     </w:lvl>
     <w:lvl w:ilvl="6" w:tplc="0409000F" w:tentative="1">
       <w:start w:val="1"/>
       <w:numFmt w:val="decimal"/>
       <w:lvlText w:val="%7."/>
-      <w:lvlJc w:val="start"/>
+      <w:lvlJc w:val="left"/>
       <w:pPr>
-        <w:ind w:start="168pt" w:hanging="24pt"/>
+        <w:tabs>
+          <w:tab w:val="num" w:pos="3360"/>
+        </w:tabs>
+        <w:ind w:left="3360" w:hanging="480"/>
       </w:pPr>
     </w:lvl>
     <w:lvl w:ilvl="7" w:tplc="04090019" w:tentative="1">
       <w:start w:val="1"/>
       <w:numFmt w:val="ideographTraditional"/>
       <w:lvlText w:val="%8、"/>
-      <w:lvlJc w:val="start"/>
+      <w:lvlJc w:val="left"/>
       <w:pPr>
-        <w:ind w:start="192pt" w:hanging="24pt"/>
+        <w:tabs>
+          <w:tab w:val="num" w:pos="3840"/>
+        </w:tabs>
+        <w:ind w:left="3840" w:hanging="480"/>
       </w:pPr>
     </w:lvl>
     <w:lvl w:ilvl="8" w:tplc="0409001B" w:tentative="1">
       <w:start w:val="1"/>
       <w:numFmt w:val="lowerRoman"/>
       <w:lvlText w:val="%9."/>
-      <w:lvlJc w:val="end"/>
+      <w:lvlJc w:val="right"/>
       <w:pPr>
-        <w:ind w:start="216pt" w:hanging="24pt"/>
+        <w:tabs>
+          <w:tab w:val="num" w:pos="4320"/>
+        </w:tabs>
+        <w:ind w:left="4320" w:hanging="480"/>
       </w:pPr>
     </w:lvl>
   </w:abstractNum>
-  <w:num w:numId="1" w16cid:durableId="1688022527">
+  <w:num w:numId="1" w16cid:durableId="647396411">
     <w:abstractNumId w:val="0"/>
   </w:num>
-  <w:num w:numId="2" w16cid:durableId="293828763">
+  <w:num w:numId="2" w16cid:durableId="840973258">
     <w:abstractNumId w:val="1"/>
   </w:num>
 </w:numbering>
 </file>
 
 <file path=word/styles.xml><?xml version="1.0" encoding="utf-8"?>
-<w:styles xmlns:mc="http://schemas.openxmlformats.org/markup-compatibility/2006" xmlns:r="http://purl.oclc.org/ooxml/officeDocument/relationships" xmlns:w="http://purl.oclc.org/ooxml/wordprocessingml/main" xmlns:w14="http://schemas.microsoft.com/office/word/2010/wordml" xmlns:w15="http://schemas.microsoft.com/office/word/2012/wordml" xmlns:w16cex="http://schemas.microsoft.com/office/word/2018/wordml/cex" xmlns:w16cid="http://schemas.microsoft.com/office/word/2016/wordml/cid" xmlns:w16="http://schemas.microsoft.com/office/word/2018/wordml" xmlns:w16sdtdh="http://schemas.microsoft.com/office/word/2020/wordml/sdtdatahash" xmlns:w16se="http://schemas.microsoft.com/office/word/2015/wordml/symex" mc:Ignorable="w14 w15 w16se w16cid w16 w16cex w16sdtdh">
+<w:styles xmlns:mc="http://schemas.openxmlformats.org/markup-compatibility/2006" xmlns:r="http://schemas.openxmlformats.org/officeDocument/2006/relationships" xmlns:w="http://schemas.openxmlformats.org/wordprocessingml/2006/main" xmlns:w14="http://schemas.microsoft.com/office/word/2010/wordml" xmlns:w15="http://schemas.microsoft.com/office/word/2012/wordml" xmlns:w16cex="http://schemas.microsoft.com/office/word/2018/wordml/cex" xmlns:w16cid="http://schemas.microsoft.com/office/word/2016/wordml/cid" xmlns:w16="http://schemas.microsoft.com/office/word/2018/wordml" xmlns:w16sdtdh="http://schemas.microsoft.com/office/word/2020/wordml/sdtdatahash" xmlns:w16se="http://schemas.microsoft.com/office/word/2015/wordml/symex" mc:Ignorable="w14 w15 w16se w16cid w16 w16cex w16sdtdh">
   <w:docDefaults>
     <w:rPrDefault>
       <w:rPr>
@@ -420,9 +2631,7 @@
     <w:lsdException w:name="Subtitle" w:qFormat="1"/>
     <w:lsdException w:name="Strong" w:qFormat="1"/>
     <w:lsdException w:name="Emphasis" w:qFormat="1"/>
-    <w:lsdException w:name="HTML Variable" w:semiHidden="1" w:unhideWhenUsed="1"/>
     <w:lsdException w:name="Normal Table" w:semiHidden="1" w:unhideWhenUsed="1"/>
-    <w:lsdException w:name="Outline List 3" w:semiHidden="1" w:unhideWhenUsed="1"/>
     <w:lsdException w:name="Table Simple 1" w:semiHidden="1" w:unhideWhenUsed="1"/>
     <w:lsdException w:name="Table Simple 2" w:semiHidden="1" w:unhideWhenUsed="1"/>
     <w:lsdException w:name="Table Simple 3" w:semiHidden="1" w:unhideWhenUsed="1"/>
@@ -465,7 +2674,6 @@
     <w:lsdException w:name="Table Web 1" w:semiHidden="1" w:unhideWhenUsed="1"/>
     <w:lsdException w:name="Table Web 2" w:semiHidden="1" w:unhideWhenUsed="1"/>
     <w:lsdException w:name="Table Web 3" w:semiHidden="1" w:unhideWhenUsed="1"/>
-    <w:lsdException w:name="Balloon Text" w:semiHidden="1" w:unhideWhenUsed="1"/>
     <w:lsdException w:name="Table Theme" w:semiHidden="1" w:unhideWhenUsed="1"/>
     <w:lsdException w:name="Placeholder Text" w:semiHidden="1" w:uiPriority="99"/>
     <w:lsdException w:name="No Spacing" w:uiPriority="1" w:qFormat="1"/>
@@ -691,13 +2899,13 @@
   <w:style w:type="paragraph" w:default="1" w:styleId="a">
     <w:name w:val="Normal"/>
     <w:qFormat/>
+    <w:rsid w:val="00AD1BD5"/>
     <w:pPr>
       <w:widowControl w:val="0"/>
     </w:pPr>
     <w:rPr>
       <w:kern w:val="2"/>
       <w:sz w:val="24"/>
-      <w:szCs w:val="24"/>
     </w:rPr>
   </w:style>
   <w:style w:type="character" w:default="1" w:styleId="a0">
@@ -712,12 +2920,12 @@
     <w:semiHidden/>
     <w:unhideWhenUsed/>
     <w:tblPr>
-      <w:tblInd w:w="0pt" w:type="dxa"/>
+      <w:tblInd w:w="0" w:type="dxa"/>
       <w:tblCellMar>
-        <w:top w:w="0pt" w:type="dxa"/>
-        <w:start w:w="5.40pt" w:type="dxa"/>
-        <w:bottom w:w="0pt" w:type="dxa"/>
-        <w:end w:w="5.40pt" w:type="dxa"/>
+        <w:top w:w="0" w:type="dxa"/>
+        <w:left w:w="108" w:type="dxa"/>
+        <w:bottom w:w="0" w:type="dxa"/>
+        <w:right w:w="108" w:type="dxa"/>
       </w:tblCellMar>
     </w:tblPr>
   </w:style>
@@ -727,102 +2935,70 @@
     <w:semiHidden/>
     <w:unhideWhenUsed/>
   </w:style>
-  <w:style w:type="paragraph" w:styleId="a3">
+  <w:style w:type="table" w:styleId="a3">
+    <w:name w:val="Table Grid"/>
+    <w:basedOn w:val="a1"/>
+    <w:rsid w:val="00AD1BD5"/>
+    <w:pPr>
+      <w:widowControl w:val="0"/>
+    </w:pPr>
+    <w:tblPr>
+      <w:tblBorders>
+        <w:top w:val="single" w:sz="4" w:space="0" w:color="auto"/>
+        <w:left w:val="single" w:sz="4" w:space="0" w:color="auto"/>
+        <w:bottom w:val="single" w:sz="4" w:space="0" w:color="auto"/>
+        <w:right w:val="single" w:sz="4" w:space="0" w:color="auto"/>
+        <w:insideH w:val="single" w:sz="4" w:space="0" w:color="auto"/>
+        <w:insideV w:val="single" w:sz="4" w:space="0" w:color="auto"/>
+      </w:tblBorders>
+    </w:tblPr>
+  </w:style>
+  <w:style w:type="paragraph" w:styleId="a4">
     <w:name w:val="header"/>
     <w:basedOn w:val="a"/>
-    <w:rsid w:val="00725887"/>
+    <w:rsid w:val="00F0686F"/>
     <w:pPr>
       <w:tabs>
-        <w:tab w:val="center" w:pos="207.65pt"/>
-        <w:tab w:val="end" w:pos="415.30pt"/>
+        <w:tab w:val="center" w:pos="4153"/>
+        <w:tab w:val="right" w:pos="8306"/>
       </w:tabs>
       <w:snapToGrid w:val="0"/>
     </w:pPr>
     <w:rPr>
       <w:sz w:val="20"/>
-      <w:szCs w:val="20"/>
     </w:rPr>
   </w:style>
-  <w:style w:type="paragraph" w:styleId="a4">
+  <w:style w:type="paragraph" w:styleId="a5">
     <w:name w:val="footer"/>
     <w:basedOn w:val="a"/>
-    <w:rsid w:val="00725887"/>
+    <w:rsid w:val="00F0686F"/>
     <w:pPr>
       <w:tabs>
-        <w:tab w:val="center" w:pos="207.65pt"/>
-        <w:tab w:val="end" w:pos="415.30pt"/>
+        <w:tab w:val="center" w:pos="4153"/>
+        <w:tab w:val="right" w:pos="8306"/>
       </w:tabs>
       <w:snapToGrid w:val="0"/>
     </w:pPr>
     <w:rPr>
       <w:sz w:val="20"/>
-      <w:szCs w:val="20"/>
     </w:rPr>
   </w:style>
-  <w:style w:type="character" w:styleId="a5">
-    <w:name w:val="page number"/>
-    <w:basedOn w:val="a0"/>
-    <w:rsid w:val="00725887"/>
-  </w:style>
   <w:style w:type="paragraph" w:styleId="a6">
-    <w:name w:val="Body Text Indent"/>
+    <w:name w:val="Balloon Text"/>
     <w:basedOn w:val="a"/>
-    <w:link w:val="a7"/>
-    <w:rsid w:val="00D803F7"/>
-    <w:pPr>
-      <w:snapToGrid w:val="0"/>
-      <w:spacing w:line="14pt" w:lineRule="exact"/>
-      <w:ind w:start="216pt" w:hangingChars="1800" w:hanging="216pt"/>
-    </w:pPr>
+    <w:semiHidden/>
+    <w:rsid w:val="00046BDD"/>
     <w:rPr>
-      <w:rFonts w:ascii="標楷體" w:eastAsia="標楷體"/>
-      <w:szCs w:val="20"/>
-      <w:lang w:val="x-none" w:eastAsia="x-none"/>
-    </w:rPr>
-  </w:style>
-  <w:style w:type="character" w:customStyle="1" w:styleId="a7">
-    <w:name w:val="本文縮排 字元"/>
-    <w:link w:val="a6"/>
-    <w:rsid w:val="00D803F7"/>
-    <w:rPr>
-      <w:rFonts w:ascii="標楷體" w:eastAsia="標楷體"/>
-      <w:kern w:val="2"/>
-      <w:sz w:val="24"/>
-    </w:rPr>
-  </w:style>
-  <w:style w:type="paragraph" w:customStyle="1" w:styleId="11">
-    <w:name w:val="1.1"/>
-    <w:basedOn w:val="a"/>
-    <w:rsid w:val="008D669F"/>
-    <w:pPr>
-      <w:snapToGrid w:val="0"/>
-      <w:spacing w:before="6pt"/>
-      <w:ind w:start="47.90pt" w:end="28.35pt"/>
-      <w:jc w:val="both"/>
-    </w:pPr>
-    <w:rPr>
-      <w:rFonts w:ascii="Arial" w:eastAsia="標楷體" w:hAnsi="Arial"/>
-      <w:sz w:val="28"/>
-      <w:szCs w:val="20"/>
-    </w:rPr>
-  </w:style>
-  <w:style w:type="paragraph" w:styleId="a8">
-    <w:name w:val="Revision"/>
-    <w:hidden/>
-    <w:uiPriority w:val="99"/>
-    <w:semiHidden/>
-    <w:rsid w:val="00CE3EFA"/>
-    <w:rPr>
-      <w:kern w:val="2"/>
-      <w:sz w:val="24"/>
-      <w:szCs w:val="24"/>
+      <w:rFonts w:ascii="Arial" w:hAnsi="Arial"/>
+      <w:sz w:val="18"/>
+      <w:szCs w:val="18"/>
     </w:rPr>
   </w:style>
 </w:styles>
 </file>
 
 <file path=word/theme/theme1.xml><?xml version="1.0" encoding="utf-8"?>
-<a:theme xmlns:a="http://purl.oclc.org/ooxml/drawingml/main" name="Office 佈景主題">
+<a:theme xmlns:a="http://schemas.openxmlformats.org/drawingml/2006/main" name="Office 佈景主題">
   <a:themeElements>
     <a:clrScheme name="Office">
       <a:dk1>
@@ -832,39 +3008,39 @@
         <a:sysClr val="window" lastClr="FFFFFF"/>
       </a:lt1>
       <a:dk2>
-        <a:srgbClr val="44546A"/>
+        <a:srgbClr val="0E2841"/>
       </a:dk2>
       <a:lt2>
-        <a:srgbClr val="E7E6E6"/>
+        <a:srgbClr val="E8E8E8"/>
       </a:lt2>
       <a:accent1>
-        <a:srgbClr val="5B9BD5"/>
+        <a:srgbClr val="156082"/>
       </a:accent1>
       <a:accent2>
-        <a:srgbClr val="ED7D31"/>
+        <a:srgbClr val="E97132"/>
       </a:accent2>
       <a:accent3>
-        <a:srgbClr val="A5A5A5"/>
+        <a:srgbClr val="196B24"/>
       </a:accent3>
       <a:accent4>
-        <a:srgbClr val="FFC000"/>
+        <a:srgbClr val="0F9ED5"/>
       </a:accent4>
       <a:accent5>
-        <a:srgbClr val="4472C4"/>
+        <a:srgbClr val="A02B93"/>
       </a:accent5>
       <a:accent6>
-        <a:srgbClr val="70AD47"/>
+        <a:srgbClr val="4EA72E"/>
       </a:accent6>
       <a:hlink>
-        <a:srgbClr val="0563C1"/>
+        <a:srgbClr val="467886"/>
       </a:hlink>
       <a:folHlink>
-        <a:srgbClr val="954F72"/>
+        <a:srgbClr val="96607D"/>
       </a:folHlink>
     </a:clrScheme>
     <a:fontScheme name="Office">
       <a:majorFont>
-        <a:latin typeface="Calibri Light" panose="020F0302020204030204"/>
+        <a:latin typeface="Aptos Display" panose="02110004020202020204"/>
         <a:ea typeface=""/>
         <a:cs typeface=""/>
         <a:font script="Jpan" typeface="游ゴシック Light"/>
@@ -897,9 +3073,26 @@
         <a:font script="Viet" typeface="Times New Roman"/>
         <a:font script="Uigh" typeface="Microsoft Uighur"/>
         <a:font script="Geor" typeface="Sylfaen"/>
+        <a:font script="Armn" typeface="Arial"/>
+        <a:font script="Bugi" typeface="Leelawadee UI"/>
+        <a:font script="Bopo" typeface="Microsoft JhengHei"/>
+        <a:font script="Java" typeface="Javanese Text"/>
+        <a:font script="Lisu" typeface="Segoe UI"/>
+        <a:font script="Mymr" typeface="Myanmar Text"/>
+        <a:font script="Nkoo" typeface="Ebrima"/>
+        <a:font script="Olck" typeface="Nirmala UI"/>
+        <a:font script="Osma" typeface="Ebrima"/>
+        <a:font script="Phag" typeface="Phagspa"/>
+        <a:font script="Syrn" typeface="Estrangelo Edessa"/>
+        <a:font script="Syrj" typeface="Estrangelo Edessa"/>
+        <a:font script="Syre" typeface="Estrangelo Edessa"/>
+        <a:font script="Sora" typeface="Nirmala UI"/>
+        <a:font script="Tale" typeface="Microsoft Tai Le"/>
+        <a:font script="Talu" typeface="Microsoft New Tai Lue"/>
+        <a:font script="Tfng" typeface="Ebrima"/>
       </a:majorFont>
       <a:minorFont>
-        <a:latin typeface="Calibri" panose="020F0502020204030204"/>
+        <a:latin typeface="Aptos" panose="02110004020202020204"/>
         <a:ea typeface=""/>
         <a:cs typeface=""/>
         <a:font script="Jpan" typeface="游明朝"/>
@@ -932,6 +3125,23 @@
         <a:font script="Viet" typeface="Arial"/>
         <a:font script="Uigh" typeface="Microsoft Uighur"/>
         <a:font script="Geor" typeface="Sylfaen"/>
+        <a:font script="Armn" typeface="Arial"/>
+        <a:font script="Bugi" typeface="Leelawadee UI"/>
+        <a:font script="Bopo" typeface="Microsoft JhengHei"/>
+        <a:font script="Java" typeface="Javanese Text"/>
+        <a:font script="Lisu" typeface="Segoe UI"/>
+        <a:font script="Mymr" typeface="Myanmar Text"/>
+        <a:font script="Nkoo" typeface="Ebrima"/>
+        <a:font script="Olck" typeface="Nirmala UI"/>
+        <a:font script="Osma" typeface="Ebrima"/>
+        <a:font script="Phag" typeface="Phagspa"/>
+        <a:font script="Syrn" typeface="Estrangelo Edessa"/>
+        <a:font script="Syrj" typeface="Estrangelo Edessa"/>
+        <a:font script="Syre" typeface="Estrangelo Edessa"/>
+        <a:font script="Sora" typeface="Nirmala UI"/>
+        <a:font script="Tale" typeface="Microsoft Tai Le"/>
+        <a:font script="Talu" typeface="Microsoft New Tai Lue"/>
+        <a:font script="Tfng" typeface="Ebrima"/>
       </a:minorFont>
     </a:fontScheme>
     <a:fmtScheme name="Office">
@@ -941,25 +3151,25 @@
         </a:solidFill>
         <a:gradFill rotWithShape="1">
           <a:gsLst>
-            <a:gs pos="0%">
+            <a:gs pos="0">
               <a:schemeClr val="phClr">
-                <a:lumMod val="110%"/>
-                <a:satMod val="105%"/>
-                <a:tint val="67%"/>
+                <a:lumMod val="110000"/>
+                <a:satMod val="105000"/>
+                <a:tint val="67000"/>
               </a:schemeClr>
             </a:gs>
-            <a:gs pos="50%">
+            <a:gs pos="50000">
               <a:schemeClr val="phClr">
-                <a:lumMod val="105%"/>
-                <a:satMod val="103%"/>
-                <a:tint val="73%"/>
+                <a:lumMod val="105000"/>
+                <a:satMod val="103000"/>
+                <a:tint val="73000"/>
               </a:schemeClr>
             </a:gs>
-            <a:gs pos="100%">
+            <a:gs pos="100000">
               <a:schemeClr val="phClr">
-                <a:lumMod val="105%"/>
-                <a:satMod val="109%"/>
-                <a:tint val="81%"/>
+                <a:lumMod val="105000"/>
+                <a:satMod val="109000"/>
+                <a:tint val="81000"/>
               </a:schemeClr>
             </a:gs>
           </a:gsLst>
@@ -967,25 +3177,25 @@
         </a:gradFill>
         <a:gradFill rotWithShape="1">
           <a:gsLst>
-            <a:gs pos="0%">
+            <a:gs pos="0">
               <a:schemeClr val="phClr">
-                <a:satMod val="103%"/>
-                <a:lumMod val="102%"/>
-                <a:tint val="94%"/>
+                <a:satMod val="103000"/>
+                <a:lumMod val="102000"/>
+                <a:tint val="94000"/>
               </a:schemeClr>
             </a:gs>
-            <a:gs pos="50%">
+            <a:gs pos="50000">
               <a:schemeClr val="phClr">
-                <a:satMod val="110%"/>
-                <a:lumMod val="100%"/>
-                <a:shade val="100%"/>
+                <a:satMod val="110000"/>
+                <a:lumMod val="100000"/>
+                <a:shade val="100000"/>
               </a:schemeClr>
             </a:gs>
-            <a:gs pos="100%">
+            <a:gs pos="100000">
               <a:schemeClr val="phClr">
-                <a:lumMod val="99%"/>
-                <a:satMod val="120%"/>
-                <a:shade val="78%"/>
+                <a:lumMod val="99000"/>
+                <a:satMod val="120000"/>
+                <a:shade val="78000"/>
               </a:schemeClr>
             </a:gs>
           </a:gsLst>
@@ -993,26 +3203,26 @@
         </a:gradFill>
       </a:fillStyleLst>
       <a:lnStyleLst>
-        <a:ln w="6350" cap="flat" cmpd="sng" algn="ctr">
-          <a:solidFill>
-            <a:schemeClr val="phClr"/>
-          </a:solidFill>
-          <a:prstDash val="solid"/>
-          <a:miter lim="800%"/>
-        </a:ln>
         <a:ln w="12700" cap="flat" cmpd="sng" algn="ctr">
           <a:solidFill>
             <a:schemeClr val="phClr"/>
           </a:solidFill>
           <a:prstDash val="solid"/>
-          <a:miter lim="800%"/>
+          <a:miter lim="800000"/>
         </a:ln>
         <a:ln w="19050" cap="flat" cmpd="sng" algn="ctr">
           <a:solidFill>
             <a:schemeClr val="phClr"/>
           </a:solidFill>
           <a:prstDash val="solid"/>
-          <a:miter lim="800%"/>
+          <a:miter lim="800000"/>
+        </a:ln>
+        <a:ln w="25400" cap="flat" cmpd="sng" algn="ctr">
+          <a:solidFill>
+            <a:schemeClr val="phClr"/>
+          </a:solidFill>
+          <a:prstDash val="solid"/>
+          <a:miter lim="800000"/>
         </a:ln>
       </a:lnStyleLst>
       <a:effectStyleLst>
@@ -1026,7 +3236,7 @@
           <a:effectLst>
             <a:outerShdw blurRad="57150" dist="19050" dir="5400000" algn="ctr" rotWithShape="0">
               <a:srgbClr val="000000">
-                <a:alpha val="63%"/>
+                <a:alpha val="63000"/>
               </a:srgbClr>
             </a:outerShdw>
           </a:effectLst>
@@ -1038,32 +3248,32 @@
         </a:solidFill>
         <a:solidFill>
           <a:schemeClr val="phClr">
-            <a:tint val="95%"/>
-            <a:satMod val="170%"/>
+            <a:tint val="95000"/>
+            <a:satMod val="170000"/>
           </a:schemeClr>
         </a:solidFill>
         <a:gradFill rotWithShape="1">
           <a:gsLst>
-            <a:gs pos="0%">
+            <a:gs pos="0">
               <a:schemeClr val="phClr">
-                <a:tint val="93%"/>
-                <a:satMod val="150%"/>
-                <a:shade val="98%"/>
-                <a:lumMod val="102%"/>
+                <a:tint val="93000"/>
+                <a:satMod val="150000"/>
+                <a:shade val="98000"/>
+                <a:lumMod val="102000"/>
               </a:schemeClr>
             </a:gs>
-            <a:gs pos="50%">
+            <a:gs pos="50000">
               <a:schemeClr val="phClr">
-                <a:tint val="98%"/>
-                <a:satMod val="130%"/>
-                <a:shade val="90%"/>
-                <a:lumMod val="103%"/>
+                <a:tint val="98000"/>
+                <a:satMod val="130000"/>
+                <a:shade val="90000"/>
+                <a:lumMod val="103000"/>
               </a:schemeClr>
             </a:gs>
-            <a:gs pos="100%">
+            <a:gs pos="100000">
               <a:schemeClr val="phClr">
-                <a:shade val="63%"/>
-                <a:satMod val="120%"/>
+                <a:shade val="63000"/>
+                <a:satMod val="120000"/>
               </a:schemeClr>
             </a:gs>
           </a:gsLst>
@@ -1072,39 +3282,37 @@
       </a:bgFillStyleLst>
     </a:fmtScheme>
   </a:themeElements>
-  <a:objectDefaults/>
+  <a:objectDefaults>
+    <a:lnDef>
+      <a:spPr/>
+      <a:bodyPr/>
+      <a:lstStyle/>
+      <a:style>
+        <a:lnRef idx="2">
+          <a:schemeClr val="accent1"/>
+        </a:lnRef>
+        <a:fillRef idx="0">
+          <a:schemeClr val="accent1"/>
+        </a:fillRef>
+        <a:effectRef idx="1">
+          <a:schemeClr val="accent1"/>
+        </a:effectRef>
+        <a:fontRef idx="minor">
+          <a:schemeClr val="tx1"/>
+        </a:fontRef>
+      </a:style>
+    </a:lnDef>
+  </a:objectDefaults>
   <a:extraClrSchemeLst/>
   <a:extLst>
     <a:ext uri="{05A4C25C-085E-4340-85A3-A5531E510DB2}">
-      <thm15:themeFamily xmlns:thm15="http://schemas.microsoft.com/office/thememl/2012/main" name="Office Theme" id="{62F939B6-93AF-4DB8-9C6B-D6C7DFDC589F}" vid="{4A3C46E8-61CC-4603-A589-7422A47A8E4A}"/>
+      <thm15:themeFamily xmlns:thm15="http://schemas.microsoft.com/office/thememl/2012/main" name="Office Theme" id="{2E142A2C-CD16-42D6-873A-C26D2A0506FA}" vid="{1BDDFF52-6CD6-40A5-AB3C-68EB2F1E4D0A}"/>
     </a:ext>
   </a:extLst>
 </a:theme>
 </file>
 
 <file path=customXml/item1.xml><?xml version="1.0" encoding="utf-8"?>
-<p:properties xmlns:p="http://schemas.microsoft.com/office/2006/metadata/properties" xmlns:xsi="http://www.w3.org/2001/XMLSchema-instance" xmlns:pc="http://schemas.microsoft.com/office/infopath/2007/PartnerControls">
-  <documentManagement>
-    <_dlc_DocId xmlns="dd7fc72f-9582-4d4d-b968-62b9962b31e0">XWVTFXZDR6YW-187-1312</_dlc_DocId>
-    <_dlc_DocIdUrl xmlns="dd7fc72f-9582-4d4d-b968-62b9962b31e0">
-      <Url>https://share.cdc.gov.tw/IT/security/_layouts/15/DocIdRedir.aspx?ID=XWVTFXZDR6YW-187-1312</Url>
-      <Description>XWVTFXZDR6YW-187-1312</Description>
-    </_dlc_DocIdUrl>
-    <_x5206__x985e_ xmlns="d1be0ca6-4634-40fb-b6f9-d59c499fecf9" xsi:nil="true"/>
-  </documentManagement>
-</p:properties>
-</file>
-
-<file path=customXml/item2.xml><?xml version="1.0" encoding="utf-8"?>
-<?mso-contentType ?>
-<FormTemplates xmlns="http://schemas.microsoft.com/sharepoint/v3/contenttype/forms">
-  <Display>DocumentLibraryForm</Display>
-  <Edit>DocumentLibraryForm</Edit>
-  <New>DocumentLibraryForm</New>
-</FormTemplates>
-</file>
-
-<file path=customXml/item3.xml><?xml version="1.0" encoding="utf-8"?>
 <?mso-contentType ?>
 <spe:Receivers xmlns:spe="http://schemas.microsoft.com/sharepoint/events">
   <Receiver>
@@ -1148,6 +3356,19 @@
     <Filter/>
   </Receiver>
 </spe:Receivers>
+</file>
+
+<file path=customXml/item2.xml><?xml version="1.0" encoding="utf-8"?>
+<LongProperties xmlns="http://schemas.microsoft.com/office/2006/metadata/longProperties"/>
+</file>
+
+<file path=customXml/item3.xml><?xml version="1.0" encoding="utf-8"?>
+<?mso-contentType ?>
+<FormTemplates xmlns="http://schemas.microsoft.com/sharepoint/v3/contenttype/forms">
+  <Display>DocumentLibraryForm</Display>
+  <Edit>DocumentLibraryForm</Edit>
+  <New>DocumentLibraryForm</New>
+</FormTemplates>
 </file>
 
 <file path=customXml/item4.xml><?xml version="1.0" encoding="utf-8"?>
@@ -1328,35 +3549,49 @@
 </ct:contentTypeSchema>
 </file>
 
+<file path=customXml/item5.xml><?xml version="1.0" encoding="utf-8"?>
+<b:Sources xmlns:b="http://schemas.openxmlformats.org/officeDocument/2006/bibliography" xmlns="http://schemas.openxmlformats.org/officeDocument/2006/bibliography" SelectedStyle="\APASixthEditionOfficeOnline.xsl" StyleName="APA" Version="6"/>
+</file>
+
+<file path=customXml/item6.xml><?xml version="1.0" encoding="utf-8"?>
+<p:properties xmlns:p="http://schemas.microsoft.com/office/2006/metadata/properties" xmlns:xsi="http://www.w3.org/2001/XMLSchema-instance" xmlns:pc="http://schemas.microsoft.com/office/infopath/2007/PartnerControls">
+  <documentManagement>
+    <_dlc_DocId xmlns="dd7fc72f-9582-4d4d-b968-62b9962b31e0">XWVTFXZDR6YW-187-1453</_dlc_DocId>
+    <_dlc_DocIdUrl xmlns="dd7fc72f-9582-4d4d-b968-62b9962b31e0">
+      <Url>https://share.cdc.gov.tw/IT/security/_layouts/15/DocIdRedir.aspx?ID=XWVTFXZDR6YW-187-1453</Url>
+      <Description>XWVTFXZDR6YW-187-1453</Description>
+    </_dlc_DocIdUrl>
+    <_x5206__x985e_ xmlns="d1be0ca6-4634-40fb-b6f9-d59c499fecf9" xsi:nil="true"/>
+  </documentManagement>
+</p:properties>
+</file>
+
 <file path=customXml/itemProps1.xml><?xml version="1.0" encoding="utf-8"?>
-<ds:datastoreItem xmlns:ds="http://purl.oclc.org/ooxml/officeDocument/customXml" ds:itemID="{EAA91988-492D-4583-B52B-ED1D10DC8017}">
+<ds:datastoreItem xmlns:ds="http://schemas.openxmlformats.org/officeDocument/2006/customXml" ds:itemID="{3209A9FF-B634-46EF-83FC-2EF44A22E5E2}">
   <ds:schemaRefs>
-    <ds:schemaRef ds:uri="http://schemas.microsoft.com/office/2006/metadata/properties"/>
-    <ds:schemaRef ds:uri="http://schemas.microsoft.com/office/infopath/2007/PartnerControls"/>
-    <ds:schemaRef ds:uri="dd7fc72f-9582-4d4d-b968-62b9962b31e0"/>
-    <ds:schemaRef ds:uri="d1be0ca6-4634-40fb-b6f9-d59c499fecf9"/>
+    <ds:schemaRef ds:uri="http://schemas.microsoft.com/sharepoint/events"/>
   </ds:schemaRefs>
 </ds:datastoreItem>
 </file>
 
 <file path=customXml/itemProps2.xml><?xml version="1.0" encoding="utf-8"?>
-<ds:datastoreItem xmlns:ds="http://purl.oclc.org/ooxml/officeDocument/customXml" ds:itemID="{52EF6741-7179-4F22-A6EF-93B8AC698238}">
+<ds:datastoreItem xmlns:ds="http://schemas.openxmlformats.org/officeDocument/2006/customXml" ds:itemID="{08E217C5-86FA-46E6-8B87-445790293F64}">
+  <ds:schemaRefs>
+    <ds:schemaRef ds:uri="http://schemas.microsoft.com/office/2006/metadata/longProperties"/>
+  </ds:schemaRefs>
+</ds:datastoreItem>
+</file>
+
+<file path=customXml/itemProps3.xml><?xml version="1.0" encoding="utf-8"?>
+<ds:datastoreItem xmlns:ds="http://schemas.openxmlformats.org/officeDocument/2006/customXml" ds:itemID="{F36D6162-245D-4524-BC2A-2114BB3800E8}">
   <ds:schemaRefs>
     <ds:schemaRef ds:uri="http://schemas.microsoft.com/sharepoint/v3/contenttype/forms"/>
   </ds:schemaRefs>
 </ds:datastoreItem>
 </file>
 
-<file path=customXml/itemProps3.xml><?xml version="1.0" encoding="utf-8"?>
-<ds:datastoreItem xmlns:ds="http://purl.oclc.org/ooxml/officeDocument/customXml" ds:itemID="{85F8085C-8D1D-4B1C-A4EB-94EEBE6F0A13}">
-  <ds:schemaRefs>
-    <ds:schemaRef ds:uri="http://schemas.microsoft.com/sharepoint/events"/>
-  </ds:schemaRefs>
-</ds:datastoreItem>
-</file>
-
 <file path=customXml/itemProps4.xml><?xml version="1.0" encoding="utf-8"?>
-<ds:datastoreItem xmlns:ds="http://purl.oclc.org/ooxml/officeDocument/customXml" ds:itemID="{9C4D14F0-FE9A-40CF-945C-A2F3CCF31AC0}">
+<ds:datastoreItem xmlns:ds="http://schemas.openxmlformats.org/officeDocument/2006/customXml" ds:itemID="{FBCFE851-5EBF-4291-8CE4-4B18C65E35A5}">
   <ds:schemaRefs>
     <ds:schemaRef ds:uri="http://schemas.microsoft.com/office/2006/metadata/contentType"/>
     <ds:schemaRef ds:uri="http://schemas.microsoft.com/office/2006/metadata/properties/metaAttributes"/>
@@ -1372,4 +3607,16 @@
     <ds:schemaRef ds:uri="http://schemas.microsoft.com/internal/obd"/>
   </ds:schemaRefs>
 </ds:datastoreItem>
+</file>
+
+<file path=customXml/itemProps5.xml><?xml version="1.0" encoding="utf-8"?>
+<ds:datastoreItem xmlns:ds="http://schemas.openxmlformats.org/officeDocument/2006/customXml" ds:itemID="{414BDE09-165F-46C3-A3B0-B595097A7A78}">
+  <ds:schemaRefs>
+    <ds:schemaRef ds:uri="http://schemas.openxmlformats.org/officeDocument/2006/bibliography"/>
+  </ds:schemaRefs>
+</ds:datastoreItem>
+</file>
+
+<file path=customXml/itemProps6.xml><?xml version="1.0" encoding="utf-8"?>
+<ds:datastoreItem xmlns:ds="http://schemas.openxmlformats.org/officeDocument/2006/customXml" ds:itemID="{66A3C8A0-E5F3-4A5E-8F24-5DCA859C7AC5}"/>
 </file>
</xml_diff>